<commit_message>
Término do rascunho inicial e revisão completa do Knopp (antes de fazer novas alterações com a IA).
Devia ter separado os commits mas agr foi
</commit_message>
<xml_diff>
--- a/T1_Template_Spot-Check_Summary.docx
+++ b/T1_Template_Spot-Check_Summary.docx
@@ -974,7 +974,7 @@
           <w:szCs w:val="22"/>
           <w:rtl w:val="0"/>
         </w:rPr>
-        <w:t xml:space="preserve">: 303 instâncias no arquivo original (302 após a remoção de 1 instância duplicada) e 13 atributos preditivos, todos utilizados: 5 numéricos (age, trestbps, chol, thalach, oldpeak), 3 binários (sex, fbs, exang), 4 categóricos nominais (cp, restecg, slope, thal) e 1 discreto ordinal (ca). O alvo (target) é binário, com 164 instâncias da classe 1 – sem doença cardíaca (54,3%) e 138 da classe 0 – com doença cardíaca (45,7%).</w:t>
+        <w:t xml:space="preserve">: 303 instâncias no arquivo original (302 após a remoção de 1 instância duplicada) e 13 atributos preditivos, todos utilizados: 5 numéricos (age, trestbps, chol, thalach, oldpeak), 3 binários (sex, fbs, exang), 4 categóricos nominais (cp, restecg, slope, thal) e 1 discreto ordinal (ca). O alvo é binário: 138 pacientes com doença cardíaca (45,7%) e 164 sem doença (54,3%).</w:t>
       </w:r>
     </w:p>
     <w:p>
@@ -1358,7 +1358,7 @@
           <w:szCs w:val="22"/>
           <w:rtl w:val="0"/>
         </w:rPr>
-        <w:t xml:space="preserve">os 13 atributos preditivos foram mantidos. fbs apresentou baixa relevância individual (informação mútua e correlação com o alvo), mas, como a base tem poucos atributos e essas medidas não capturam interações, nenhum atributo foi removido no spot-checking. Também não há redundância forte (maior |r| = 0,61, entre oldpeak e slope).</w:t>
+        <w:t xml:space="preserve">os 13 atributos preditivos foram mantidos. Alguns atributos apresentam baixa relevância individual (informação mútua e correlação com o alvo), mas, como a base tem poucos atributos e essas medidas não capturam interações, nenhum atributo foi removido no spot-checking.</w:t>
       </w:r>
     </w:p>
     <w:p>
@@ -1388,7 +1388,7 @@
           <w:szCs w:val="22"/>
           <w:rtl w:val="0"/>
         </w:rPr>
-        <w:t xml:space="preserve">não há valores NaN explícitos, mas a comparação registro a registro com a base Cleveland original da UCI mostrou que ca = 4 (4 instâncias) e thal = 0 (2 instâncias) correspondem a valores ausentes ("?") e que a descrição de thal no Kaggle está incorreta (na prática, 1 = defeito fixo, 2 = normal, 3 = defeito reversível). Esses códigos foram convertidos em valores ausentes, imputados pela moda calculada apenas no treino. Foi removida 1 instância duplicada, artefato da versão do Kaggle. A mesma comparação revelou que target = 1 corresponde aos pacientes sem doença (num = 0 na UCI), ao contrário da descrição do Kaggle; isso não altera a modelagem, apenas a interpretação. Os outliers (trestbps, chol e oldpeak) foram mantidos por serem clinicamente plausíveis.</w:t>
+        <w:t xml:space="preserve">não há valores NaN explícitos, mas a comparação registro a registro com a base Cleveland original da UCI mostrou que ca = 4 (4 instâncias) e thal = 0 (2 instâncias) correspondem a valores ausentes ("?") e que a descrição de thal no Kaggle está incorreta (na prática, 1 = defeito fixo, 2 = normal, 3 = defeito reversível). Esses códigos foram convertidos em valores ausentes e imputados pela mediana, calculada apenas nos dados de treino de cada fold (para thal, nominal, a mediana coincide com a moda). Foi removida 1 instância duplicada, artefato da versão do Kaggle. A mesma comparação revelou que target = 1 corresponde aos pacientes sem doença (num = 0 na UCI), ao contrário da descrição do Kaggle; por isso, o alvo foi recodificado para 1 = com doença, a classe positiva das métricas. Os outliers (trestbps, chol, thalach e oldpeak) foram mantidos por serem clinicamente plausíveis.</w:t>
       </w:r>
     </w:p>
     <w:p>
@@ -1418,7 +1418,7 @@
           <w:szCs w:val="22"/>
           <w:rtl w:val="0"/>
         </w:rPr>
-        <w:t xml:space="preserve">cp, restecg, slope e thal são categorias nominais armazenadas como inteiros e sem relação monotônica com o alvo; por isso recebem one-hot encoding (13 → 22 colunas), com handle_unknown="ignore" devido a categorias raras (ex.: restecg = 2, com 4 instâncias no treino). Os atributos binários e ca permanecem numéricos.</w:t>
+        <w:t xml:space="preserve">não foi necessário converter atributos categóricos em numéricos, pois todos já estão armazenados como números. Porém, cp, restecg, slope e thal são categorias nominais codificadas como inteiros e sem relação monotônica com o alvo; por isso recebem one-hot encoding (13 → 22 colunas), com handle_unknown="ignore" devido a categorias raras (ex.: restecg = 2). Os atributos binários e ca permanecem como estão.</w:t>
       </w:r>
     </w:p>
     <w:p>
@@ -1448,7 +1448,7 @@
           <w:szCs w:val="22"/>
           <w:rtl w:val="0"/>
         </w:rPr>
-        <w:t xml:space="preserve">as escalas são muito heterogêneas (a amplitude de chol é cerca de 46 vezes a de oldpeak); os atributos numéricos são padronizados (z-score, StandardScaler), o que é essencial para os modelos baseados em distância, margem ou gradiente.</w:t>
+        <w:t xml:space="preserve">as escalas são muito heterogêneas (a amplitude de chol é cerca de 71 vezes a de oldpeak); os atributos numéricos e ca são padronizados (z-score, StandardScaler), o que é essencial para KNN, Regressão Logística e Rede Neural.</w:t>
       </w:r>
     </w:p>
     <w:p>
@@ -1508,7 +1508,7 @@
           <w:szCs w:val="22"/>
           <w:rtl w:val="0"/>
         </w:rPr>
-        <w:t xml:space="preserve">a remoção da duplicata e a marcação dos códigos de ausência (regras determinísticas) são feitas antes da divisão treino/teste; todas as etapas que aprendem parâmetros (imputação, codificação e padronização) são encapsuladas em um Pipeline e ajustadas somente nos dados de treino de cada fold.</w:t>
+        <w:t xml:space="preserve">a remoção da duplicata, a marcação dos códigos de ausência e a recodificação do alvo (regras determinísticas, que não aprendem nada dos dados) são feitas antes da divisão treino/teste; as etapas que aprendem parâmetros (imputação, codificação e padronização) são encapsuladas em um Pipeline, ajustado somente nos dados de treino de cada fold.</w:t>
       </w:r>
     </w:p>
     <w:p>
@@ -1643,7 +1643,7 @@
                 <w:szCs w:val="22"/>
                 <w:rtl w:val="0"/>
               </w:rPr>
-              <w:t xml:space="preserve">Classificação binária: o alvo (target) possui duas classes (0 = com doença cardíaca; 1 = sem doença cardíaca).</w:t>
+              <w:t xml:space="preserve">Classificação binária: o alvo indica se o paciente possui ou não doença cardíaca (tendência a ataque cardíaco). Para a modelagem, 1 = com doença (classe positiva) e 0 = sem doença.</w:t>
             </w:r>
           </w:p>
         </w:tc>
@@ -1700,7 +1700,7 @@
                 <w:szCs w:val="22"/>
                 <w:rtl w:val="0"/>
               </w:rPr>
-              <w:t xml:space="preserve">[Preencher. Por que essa métrica é adequada ao problema?]</w:t>
+              <w:t xml:space="preserve">F1-score da classe positiva (com doença). Combina precisão e recall, penalizando tanto deixar de identificar pacientes doentes (falsos negativos) quanto alarmes falsos. Como as classes estão quase balanceadas, a acurácia não seria enganosa, mas trata os dois erros como equivalentes e não informa sobre a classe de interesse.</w:t>
             </w:r>
           </w:p>
         </w:tc>
@@ -1757,7 +1757,7 @@
                 <w:szCs w:val="22"/>
                 <w:rtl w:val="0"/>
               </w:rPr>
-              <w:t xml:space="preserve">[Preencher]</w:t>
+              <w:t xml:space="preserve">F1 (principal), acurácia, precisão, recall e ROC-AUC.</w:t>
             </w:r>
           </w:p>
         </w:tc>
@@ -1871,7 +1871,7 @@
                 <w:szCs w:val="22"/>
                 <w:rtl w:val="0"/>
               </w:rPr>
-              <w:t xml:space="preserve">[Preencher. Especifique número de repetições de forma clara.  Ex.: validação cruzada estratificada k-fold]</w:t>
+              <w:t xml:space="preserve">Validação cruzada estratificada repetida no conjunto de treino (RepeatedStratifiedKFold): 5 folds × 10 repetições = 50 avaliações por algoritmo, com random_state = 42. Não foi usado nested CV, pois não há otimização de hiperparâmetros no T1.</w:t>
             </w:r>
           </w:p>
         </w:tc>
@@ -1928,7 +1928,7 @@
                 <w:szCs w:val="22"/>
                 <w:rtl w:val="0"/>
               </w:rPr>
-              <w:t xml:space="preserve">Não se aplica: classes quase balanceadas (54,4% × 45,6% no treino; razão ≈ 1,2). Todas as divisões são estratificadas para preservar essa proporção.</w:t>
+              <w:t xml:space="preserve">Não se aplica: classes quase balanceadas (54,4% sem doença × 45,6% com doença no treino; razão ≈ 1,2). Todas as divisões são estratificadas para preservar essa proporção.</w:t>
             </w:r>
           </w:p>
         </w:tc>
@@ -1985,7 +1985,7 @@
                 <w:szCs w:val="22"/>
                 <w:rtl w:val="0"/>
               </w:rPr>
-              <w:t xml:space="preserve">[Como os modelos serão comparados]</w:t>
+              <w:t xml:space="preserve">Média e desvio padrão do F1 nas 50 avaliações (as mesmas divisões para todos os algoritmos), complementados por boxplots da distribuição do F1; as métricas secundárias auxiliam a interpretação quando as diferenças de F1 são pequenas em relação ao desvio padrão.</w:t>
             </w:r>
           </w:p>
         </w:tc>
@@ -2039,7 +2039,7 @@
                 <w:szCs w:val="22"/>
                 <w:rtl w:val="0"/>
               </w:rPr>
-              <w:t xml:space="preserve">Remoção da duplicata antes da divisão (evita a mesma instância em treino e teste); divisão treino/teste antes de qualquer análise que embase o pré-processamento; imputação, one-hot encoding e padronização encapsuladas em um Pipeline do scikit-learn, ajustado apenas nos dados de treino de cada fold; conjunto de teste não utilizado no T1.</w:t>
+              <w:t xml:space="preserve">Remoção da duplicata antes da divisão (evita a mesma instância em treino e teste); EDA apenas descritiva, sem ajustar transformações usadas pelos modelos; imputação, one-hot encoding e padronização encapsuladas em um Pipeline do scikit-learn, reajustado apenas nos dados de treino de cada fold; conjunto de teste não utilizado no T1.</w:t>
             </w:r>
           </w:p>
         </w:tc>
@@ -2257,7 +2257,9 @@
           <w:tblHeader w:val="0"/>
         </w:trPr>
         <w:tc>
-          <w:tcPr/>
+          <w:tcPr>
+            <w:tcW w:w="2436" w:type="dxa"/>
+          </w:tcPr>
           <w:p>
             <w:pPr>
               <w:jc w:val="both"/>
@@ -2274,12 +2276,14 @@
                 <w:szCs w:val="22"/>
                 <w:rtl w:val="0"/>
               </w:rPr>
-              <w:t xml:space="preserve">[Modelo 1]</w:t>
+              <w:t xml:space="preserve">KNN</w:t>
             </w:r>
           </w:p>
         </w:tc>
         <w:tc>
-          <w:tcPr/>
+          <w:tcPr>
+            <w:tcW w:w="2436" w:type="dxa"/>
+          </w:tcPr>
           <w:p>
             <w:pPr>
               <w:jc w:val="both"/>
@@ -2296,12 +2300,14 @@
                 <w:szCs w:val="22"/>
                 <w:rtl w:val="0"/>
               </w:rPr>
-              <w:t xml:space="preserve">[Hiperparâmetros]</w:t>
+              <w:t xml:space="preserve">Padrão: n_neighbors = 5, distância euclidiana, pesos uniformes.</w:t>
             </w:r>
           </w:p>
         </w:tc>
         <w:tc>
-          <w:tcPr/>
+          <w:tcPr>
+            <w:tcW w:w="2436" w:type="dxa"/>
+          </w:tcPr>
           <w:p>
             <w:pPr>
               <w:jc w:val="both"/>
@@ -2318,12 +2324,14 @@
                 <w:szCs w:val="22"/>
                 <w:rtl w:val="0"/>
               </w:rPr>
-              <w:t xml:space="preserve">[Justificativa]</w:t>
+              <w:t xml:space="preserve">Baseado em instâncias, não paramétrico.</w:t>
             </w:r>
           </w:p>
         </w:tc>
         <w:tc>
-          <w:tcPr/>
+          <w:tcPr>
+            <w:tcW w:w="2436" w:type="dxa"/>
+          </w:tcPr>
           <w:p>
             <w:pPr>
               <w:jc w:val="both"/>
@@ -2340,7 +2348,7 @@
                 <w:szCs w:val="22"/>
                 <w:rtl w:val="0"/>
               </w:rPr>
-              <w:t xml:space="preserve">[Observações]</w:t>
+              <w:t xml:space="preserve">Sensível à escala: depende da padronização e do one-hot.</w:t>
             </w:r>
           </w:p>
         </w:tc>
@@ -2351,7 +2359,9 @@
           <w:tblHeader w:val="0"/>
         </w:trPr>
         <w:tc>
-          <w:tcPr/>
+          <w:tcPr>
+            <w:tcW w:w="2436" w:type="dxa"/>
+          </w:tcPr>
           <w:p>
             <w:pPr>
               <w:jc w:val="both"/>
@@ -2368,12 +2378,14 @@
                 <w:szCs w:val="22"/>
                 <w:rtl w:val="0"/>
               </w:rPr>
-              <w:t xml:space="preserve">[Modelo 2]</w:t>
+              <w:t xml:space="preserve">Árvore de Decisão</w:t>
             </w:r>
           </w:p>
         </w:tc>
         <w:tc>
-          <w:tcPr/>
+          <w:tcPr>
+            <w:tcW w:w="2436" w:type="dxa"/>
+          </w:tcPr>
           <w:p>
             <w:pPr>
               <w:jc w:val="both"/>
@@ -2390,12 +2402,14 @@
                 <w:szCs w:val="22"/>
                 <w:rtl w:val="0"/>
               </w:rPr>
-              <w:t xml:space="preserve">[Hiperparâmetros]</w:t>
+              <w:t xml:space="preserve">Padrão: critério Gini, sem poda (max_depth = None), random_state = 42.</w:t>
             </w:r>
           </w:p>
         </w:tc>
         <w:tc>
-          <w:tcPr/>
+          <w:tcPr>
+            <w:tcW w:w="2436" w:type="dxa"/>
+          </w:tcPr>
           <w:p>
             <w:pPr>
               <w:jc w:val="both"/>
@@ -2412,12 +2426,14 @@
                 <w:szCs w:val="22"/>
                 <w:rtl w:val="0"/>
               </w:rPr>
-              <w:t xml:space="preserve">[Justificativa]</w:t>
+              <w:t xml:space="preserve">Simbólico, não linear e interpretável; referência para os ensembles de árvores.</w:t>
             </w:r>
           </w:p>
         </w:tc>
         <w:tc>
-          <w:tcPr/>
+          <w:tcPr>
+            <w:tcW w:w="2436" w:type="dxa"/>
+          </w:tcPr>
           <w:p>
             <w:pPr>
               <w:jc w:val="both"/>
@@ -2434,7 +2450,415 @@
                 <w:szCs w:val="22"/>
                 <w:rtl w:val="0"/>
               </w:rPr>
-              <w:t xml:space="preserve">[Observações]</w:t>
+              <w:t xml:space="preserve">Sem poda, tende a sobreajustar (alta variância).</w:t>
+            </w:r>
+          </w:p>
+        </w:tc>
+      </w:tr>
+      <w:tr>
+        <w:trPr>
+          <w:cantSplit w:val="0"/>
+          <w:tblHeader w:val="0"/>
+        </w:trPr>
+        <w:tc>
+          <w:tcPr>
+            <w:tcW w:w="2436" w:type="dxa"/>
+          </w:tcPr>
+          <w:p>
+            <w:pPr>
+              <w:jc w:val="both"/>
+              <w:rPr>
+                <w:rFonts w:ascii="Arial" w:cs="Arial" w:eastAsia="Arial" w:hAnsi="Arial"/>
+                <w:sz w:val="22"/>
+                <w:szCs w:val="22"/>
+              </w:rPr>
+            </w:pPr>
+            <w:r>
+              <w:rPr>
+                <w:rFonts w:ascii="Arial" w:cs="Arial" w:eastAsia="Arial" w:hAnsi="Arial"/>
+                <w:sz w:val="22"/>
+                <w:szCs w:val="22"/>
+                <w:rtl w:val="0"/>
+              </w:rPr>
+              <w:t xml:space="preserve">Regressão Logística</w:t>
+            </w:r>
+          </w:p>
+        </w:tc>
+        <w:tc>
+          <w:tcPr>
+            <w:tcW w:w="2436" w:type="dxa"/>
+          </w:tcPr>
+          <w:p>
+            <w:pPr>
+              <w:jc w:val="both"/>
+              <w:rPr>
+                <w:rFonts w:ascii="Arial" w:cs="Arial" w:eastAsia="Arial" w:hAnsi="Arial"/>
+                <w:sz w:val="22"/>
+                <w:szCs w:val="22"/>
+              </w:rPr>
+            </w:pPr>
+            <w:r>
+              <w:rPr>
+                <w:rFonts w:ascii="Arial" w:cs="Arial" w:eastAsia="Arial" w:hAnsi="Arial"/>
+                <w:sz w:val="22"/>
+                <w:szCs w:val="22"/>
+                <w:rtl w:val="0"/>
+              </w:rPr>
+              <w:t xml:space="preserve">Padrão: regularização L2, C = 1,0, solver lbfgs.</w:t>
+            </w:r>
+          </w:p>
+        </w:tc>
+        <w:tc>
+          <w:tcPr>
+            <w:tcW w:w="2436" w:type="dxa"/>
+          </w:tcPr>
+          <w:p>
+            <w:pPr>
+              <w:jc w:val="both"/>
+              <w:rPr>
+                <w:rFonts w:ascii="Arial" w:cs="Arial" w:eastAsia="Arial" w:hAnsi="Arial"/>
+                <w:sz w:val="22"/>
+                <w:szCs w:val="22"/>
+              </w:rPr>
+            </w:pPr>
+            <w:r>
+              <w:rPr>
+                <w:rFonts w:ascii="Arial" w:cs="Arial" w:eastAsia="Arial" w:hAnsi="Arial"/>
+                <w:sz w:val="22"/>
+                <w:szCs w:val="22"/>
+                <w:rtl w:val="0"/>
+              </w:rPr>
+              <w:t xml:space="preserve">Linear e probabilístico (paramétrico).</w:t>
+            </w:r>
+          </w:p>
+        </w:tc>
+        <w:tc>
+          <w:tcPr>
+            <w:tcW w:w="2436" w:type="dxa"/>
+          </w:tcPr>
+          <w:p>
+            <w:pPr>
+              <w:jc w:val="both"/>
+              <w:rPr>
+                <w:rFonts w:ascii="Arial" w:cs="Arial" w:eastAsia="Arial" w:hAnsi="Arial"/>
+                <w:sz w:val="22"/>
+                <w:szCs w:val="22"/>
+              </w:rPr>
+            </w:pPr>
+            <w:r>
+              <w:rPr>
+                <w:rFonts w:ascii="Arial" w:cs="Arial" w:eastAsia="Arial" w:hAnsi="Arial"/>
+                <w:sz w:val="22"/>
+                <w:szCs w:val="22"/>
+                <w:rtl w:val="0"/>
+              </w:rPr>
+              <w:t xml:space="preserve">Sensível à escala; coeficientes interpretáveis.</w:t>
+            </w:r>
+          </w:p>
+        </w:tc>
+      </w:tr>
+      <w:tr>
+        <w:trPr>
+          <w:cantSplit w:val="0"/>
+          <w:tblHeader w:val="0"/>
+        </w:trPr>
+        <w:tc>
+          <w:tcPr>
+            <w:tcW w:w="2436" w:type="dxa"/>
+          </w:tcPr>
+          <w:p>
+            <w:pPr>
+              <w:jc w:val="both"/>
+              <w:rPr>
+                <w:rFonts w:ascii="Arial" w:cs="Arial" w:eastAsia="Arial" w:hAnsi="Arial"/>
+                <w:sz w:val="22"/>
+                <w:szCs w:val="22"/>
+              </w:rPr>
+            </w:pPr>
+            <w:r>
+              <w:rPr>
+                <w:rFonts w:ascii="Arial" w:cs="Arial" w:eastAsia="Arial" w:hAnsi="Arial"/>
+                <w:sz w:val="22"/>
+                <w:szCs w:val="22"/>
+                <w:rtl w:val="0"/>
+              </w:rPr>
+              <w:t xml:space="preserve">Rede Neural (MLP)</w:t>
+            </w:r>
+          </w:p>
+        </w:tc>
+        <w:tc>
+          <w:tcPr>
+            <w:tcW w:w="2436" w:type="dxa"/>
+          </w:tcPr>
+          <w:p>
+            <w:pPr>
+              <w:jc w:val="both"/>
+              <w:rPr>
+                <w:rFonts w:ascii="Arial" w:cs="Arial" w:eastAsia="Arial" w:hAnsi="Arial"/>
+                <w:sz w:val="22"/>
+                <w:szCs w:val="22"/>
+              </w:rPr>
+            </w:pPr>
+            <w:r>
+              <w:rPr>
+                <w:rFonts w:ascii="Arial" w:cs="Arial" w:eastAsia="Arial" w:hAnsi="Arial"/>
+                <w:sz w:val="22"/>
+                <w:szCs w:val="22"/>
+                <w:rtl w:val="0"/>
+              </w:rPr>
+              <w:t xml:space="preserve">Padrão (1 camada oculta de 100 neurônios, ReLU, Adam), exceto max_iter = 1000; random_state = 42.</w:t>
+            </w:r>
+          </w:p>
+        </w:tc>
+        <w:tc>
+          <w:tcPr>
+            <w:tcW w:w="2436" w:type="dxa"/>
+          </w:tcPr>
+          <w:p>
+            <w:pPr>
+              <w:jc w:val="both"/>
+              <w:rPr>
+                <w:rFonts w:ascii="Arial" w:cs="Arial" w:eastAsia="Arial" w:hAnsi="Arial"/>
+                <w:sz w:val="22"/>
+                <w:szCs w:val="22"/>
+              </w:rPr>
+            </w:pPr>
+            <w:r>
+              <w:rPr>
+                <w:rFonts w:ascii="Arial" w:cs="Arial" w:eastAsia="Arial" w:hAnsi="Arial"/>
+                <w:sz w:val="22"/>
+                <w:szCs w:val="22"/>
+                <w:rtl w:val="0"/>
+              </w:rPr>
+              <w:t xml:space="preserve">Conexionista, não linear, aprendizado por gradiente.</w:t>
+            </w:r>
+          </w:p>
+        </w:tc>
+        <w:tc>
+          <w:tcPr>
+            <w:tcW w:w="2436" w:type="dxa"/>
+          </w:tcPr>
+          <w:p>
+            <w:pPr>
+              <w:jc w:val="both"/>
+              <w:rPr>
+                <w:rFonts w:ascii="Arial" w:cs="Arial" w:eastAsia="Arial" w:hAnsi="Arial"/>
+                <w:sz w:val="22"/>
+                <w:szCs w:val="22"/>
+              </w:rPr>
+            </w:pPr>
+            <w:r>
+              <w:rPr>
+                <w:rFonts w:ascii="Arial" w:cs="Arial" w:eastAsia="Arial" w:hAnsi="Arial"/>
+                <w:sz w:val="22"/>
+                <w:szCs w:val="22"/>
+                <w:rtl w:val="0"/>
+              </w:rPr>
+              <w:t xml:space="preserve">max_iter elevado (padrão: 200) apenas para garantir a convergência.</w:t>
+            </w:r>
+          </w:p>
+        </w:tc>
+      </w:tr>
+      <w:tr>
+        <w:trPr>
+          <w:cantSplit w:val="0"/>
+          <w:tblHeader w:val="0"/>
+        </w:trPr>
+        <w:tc>
+          <w:tcPr>
+            <w:tcW w:w="2436" w:type="dxa"/>
+          </w:tcPr>
+          <w:p>
+            <w:pPr>
+              <w:jc w:val="both"/>
+              <w:rPr>
+                <w:rFonts w:ascii="Arial" w:cs="Arial" w:eastAsia="Arial" w:hAnsi="Arial"/>
+                <w:sz w:val="22"/>
+                <w:szCs w:val="22"/>
+              </w:rPr>
+            </w:pPr>
+            <w:r>
+              <w:rPr>
+                <w:rFonts w:ascii="Arial" w:cs="Arial" w:eastAsia="Arial" w:hAnsi="Arial"/>
+                <w:sz w:val="22"/>
+                <w:szCs w:val="22"/>
+                <w:rtl w:val="0"/>
+              </w:rPr>
+              <w:t xml:space="preserve">Random Forest</w:t>
+            </w:r>
+          </w:p>
+        </w:tc>
+        <w:tc>
+          <w:tcPr>
+            <w:tcW w:w="2436" w:type="dxa"/>
+          </w:tcPr>
+          <w:p>
+            <w:pPr>
+              <w:jc w:val="both"/>
+              <w:rPr>
+                <w:rFonts w:ascii="Arial" w:cs="Arial" w:eastAsia="Arial" w:hAnsi="Arial"/>
+                <w:sz w:val="22"/>
+                <w:szCs w:val="22"/>
+              </w:rPr>
+            </w:pPr>
+            <w:r>
+              <w:rPr>
+                <w:rFonts w:ascii="Arial" w:cs="Arial" w:eastAsia="Arial" w:hAnsi="Arial"/>
+                <w:sz w:val="22"/>
+                <w:szCs w:val="22"/>
+                <w:rtl w:val="0"/>
+              </w:rPr>
+              <w:t xml:space="preserve">Padrão: 100 árvores, max_features = "sqrt", random_state = 42.</w:t>
+            </w:r>
+          </w:p>
+        </w:tc>
+        <w:tc>
+          <w:tcPr>
+            <w:tcW w:w="2436" w:type="dxa"/>
+          </w:tcPr>
+          <w:p>
+            <w:pPr>
+              <w:jc w:val="both"/>
+              <w:rPr>
+                <w:rFonts w:ascii="Arial" w:cs="Arial" w:eastAsia="Arial" w:hAnsi="Arial"/>
+                <w:sz w:val="22"/>
+                <w:szCs w:val="22"/>
+              </w:rPr>
+            </w:pPr>
+            <w:r>
+              <w:rPr>
+                <w:rFonts w:ascii="Arial" w:cs="Arial" w:eastAsia="Arial" w:hAnsi="Arial"/>
+                <w:sz w:val="22"/>
+                <w:szCs w:val="22"/>
+                <w:rtl w:val="0"/>
+              </w:rPr>
+              <w:t xml:space="preserve">Ensemble por bagging; reduz a variância de uma árvore isolada.</w:t>
+            </w:r>
+          </w:p>
+        </w:tc>
+        <w:tc>
+          <w:tcPr>
+            <w:tcW w:w="2436" w:type="dxa"/>
+          </w:tcPr>
+          <w:p>
+            <w:pPr>
+              <w:jc w:val="both"/>
+              <w:rPr>
+                <w:rFonts w:ascii="Arial" w:cs="Arial" w:eastAsia="Arial" w:hAnsi="Arial"/>
+                <w:sz w:val="22"/>
+                <w:szCs w:val="22"/>
+              </w:rPr>
+            </w:pPr>
+            <w:r>
+              <w:rPr>
+                <w:rFonts w:ascii="Arial" w:cs="Arial" w:eastAsia="Arial" w:hAnsi="Arial"/>
+                <w:sz w:val="22"/>
+                <w:szCs w:val="22"/>
+                <w:rtl w:val="0"/>
+              </w:rPr>
+              <w:t xml:space="preserve">Insensível à escala dos atributos.</w:t>
+            </w:r>
+          </w:p>
+        </w:tc>
+      </w:tr>
+      <w:tr>
+        <w:trPr>
+          <w:cantSplit w:val="0"/>
+          <w:tblHeader w:val="0"/>
+        </w:trPr>
+        <w:tc>
+          <w:tcPr>
+            <w:tcW w:w="2436" w:type="dxa"/>
+          </w:tcPr>
+          <w:p>
+            <w:pPr>
+              <w:jc w:val="both"/>
+              <w:rPr>
+                <w:rFonts w:ascii="Arial" w:cs="Arial" w:eastAsia="Arial" w:hAnsi="Arial"/>
+                <w:sz w:val="22"/>
+                <w:szCs w:val="22"/>
+              </w:rPr>
+            </w:pPr>
+            <w:r>
+              <w:rPr>
+                <w:rFonts w:ascii="Arial" w:cs="Arial" w:eastAsia="Arial" w:hAnsi="Arial"/>
+                <w:sz w:val="22"/>
+                <w:szCs w:val="22"/>
+                <w:rtl w:val="0"/>
+              </w:rPr>
+              <w:t xml:space="preserve">Gradient Boosting</w:t>
+            </w:r>
+          </w:p>
+        </w:tc>
+        <w:tc>
+          <w:tcPr>
+            <w:tcW w:w="2436" w:type="dxa"/>
+          </w:tcPr>
+          <w:p>
+            <w:pPr>
+              <w:jc w:val="both"/>
+              <w:rPr>
+                <w:rFonts w:ascii="Arial" w:cs="Arial" w:eastAsia="Arial" w:hAnsi="Arial"/>
+                <w:sz w:val="22"/>
+                <w:szCs w:val="22"/>
+              </w:rPr>
+            </w:pPr>
+            <w:r>
+              <w:rPr>
+                <w:rFonts w:ascii="Arial" w:cs="Arial" w:eastAsia="Arial" w:hAnsi="Arial"/>
+                <w:sz w:val="22"/>
+                <w:szCs w:val="22"/>
+                <w:rtl w:val="0"/>
+              </w:rPr>
+              <w:t xml:space="preserve">Padrão: 100 estimadores, learning_rate = 0,1, max_depth = 3, random_state = 42.</w:t>
+            </w:r>
+          </w:p>
+        </w:tc>
+        <w:tc>
+          <w:tcPr>
+            <w:tcW w:w="2436" w:type="dxa"/>
+          </w:tcPr>
+          <w:p>
+            <w:pPr>
+              <w:jc w:val="both"/>
+              <w:rPr>
+                <w:rFonts w:ascii="Arial" w:cs="Arial" w:eastAsia="Arial" w:hAnsi="Arial"/>
+                <w:sz w:val="22"/>
+                <w:szCs w:val="22"/>
+              </w:rPr>
+            </w:pPr>
+            <w:r>
+              <w:rPr>
+                <w:rFonts w:ascii="Arial" w:cs="Arial" w:eastAsia="Arial" w:hAnsi="Arial"/>
+                <w:sz w:val="22"/>
+                <w:szCs w:val="22"/>
+                <w:rtl w:val="0"/>
+              </w:rPr>
+              <w:t xml:space="preserve">Ensemble por boosting; reduz o viés de forma sequencial.</w:t>
+            </w:r>
+          </w:p>
+        </w:tc>
+        <w:tc>
+          <w:tcPr>
+            <w:tcW w:w="2436" w:type="dxa"/>
+          </w:tcPr>
+          <w:p>
+            <w:pPr>
+              <w:jc w:val="both"/>
+              <w:rPr>
+                <w:rFonts w:ascii="Arial" w:cs="Arial" w:eastAsia="Arial" w:hAnsi="Arial"/>
+                <w:sz w:val="22"/>
+                <w:szCs w:val="22"/>
+              </w:rPr>
+            </w:pPr>
+            <w:r>
+              <w:rPr>
+                <w:rFonts w:ascii="Arial" w:cs="Arial" w:eastAsia="Arial" w:hAnsi="Arial"/>
+                <w:sz w:val="22"/>
+                <w:szCs w:val="22"/>
+                <w:rtl w:val="0"/>
+              </w:rPr>
+              <w:t xml:space="preserve">Insensível à escala dos atributos.</w:t>
             </w:r>
           </w:p>
         </w:tc>
@@ -2533,27 +2957,1109 @@
         <w:t xml:space="preserve">Apresente os resultados obtidos para os modelos analisados em tabela, com a média e o desvio padrão das métricas analisadas.</w:t>
       </w:r>
     </w:p>
+    <w:tbl>
+      <w:tblPr>
+        <w:tblW w:w="9744" w:type="dxa"/>
+        <w:jc w:val="center"/>
+        <w:tblBorders>
+          <w:top w:color="000000" w:space="0" w:sz="4" w:val="single"/>
+          <w:left w:color="000000" w:space="0" w:sz="4" w:val="single"/>
+          <w:bottom w:color="000000" w:space="0" w:sz="4" w:val="single"/>
+          <w:right w:color="000000" w:space="0" w:sz="4" w:val="single"/>
+          <w:insideH w:color="000000" w:space="0" w:sz="4" w:val="single"/>
+          <w:insideV w:color="000000" w:space="0" w:sz="4" w:val="single"/>
+        </w:tblBorders>
+        <w:tblLayout w:type="fixed"/>
+        <w:tblLook w:val="0400"/>
+      </w:tblPr>
+      <w:tblGrid>
+        <w:gridCol w:w="2244"/>
+        <w:gridCol w:w="1500"/>
+        <w:gridCol w:w="1500"/>
+        <w:gridCol w:w="1500"/>
+        <w:gridCol w:w="1500"/>
+        <w:gridCol w:w="1500"/>
+      </w:tblGrid>
+      <w:tr>
+        <w:trPr>
+          <w:cantSplit w:val="0"/>
+          <w:tblHeader w:val="0"/>
+        </w:trPr>
+        <w:tc>
+          <w:tcPr>
+            <w:tcW w:w="2244" w:type="dxa"/>
+          </w:tcPr>
+          <w:p>
+            <w:pPr>
+              <w:jc w:val="left"/>
+              <w:rPr>
+                <w:rFonts w:ascii="Arial" w:cs="Arial" w:eastAsia="Arial" w:hAnsi="Arial"/>
+                <w:sz w:val="18"/>
+                <w:szCs w:val="18"/>
+              </w:rPr>
+            </w:pPr>
+            <w:r>
+              <w:rPr>
+                <w:rFonts w:ascii="Arial" w:cs="Arial" w:eastAsia="Arial" w:hAnsi="Arial"/>
+                <w:b w:val="1"/>
+                <w:bCs w:val="1"/>
+                <w:sz w:val="18"/>
+                <w:szCs w:val="18"/>
+                <w:rtl w:val="0"/>
+              </w:rPr>
+              <w:t xml:space="preserve">Modelo</w:t>
+            </w:r>
+          </w:p>
+        </w:tc>
+        <w:tc>
+          <w:tcPr>
+            <w:tcW w:w="1500" w:type="dxa"/>
+          </w:tcPr>
+          <w:p>
+            <w:pPr>
+              <w:jc w:val="center"/>
+              <w:rPr>
+                <w:rFonts w:ascii="Arial" w:cs="Arial" w:eastAsia="Arial" w:hAnsi="Arial"/>
+                <w:sz w:val="18"/>
+                <w:szCs w:val="18"/>
+              </w:rPr>
+            </w:pPr>
+            <w:r>
+              <w:rPr>
+                <w:rFonts w:ascii="Arial" w:cs="Arial" w:eastAsia="Arial" w:hAnsi="Arial"/>
+                <w:b w:val="1"/>
+                <w:bCs w:val="1"/>
+                <w:sz w:val="18"/>
+                <w:szCs w:val="18"/>
+                <w:rtl w:val="0"/>
+              </w:rPr>
+              <w:t xml:space="preserve">F1</w:t>
+            </w:r>
+          </w:p>
+        </w:tc>
+        <w:tc>
+          <w:tcPr>
+            <w:tcW w:w="1500" w:type="dxa"/>
+          </w:tcPr>
+          <w:p>
+            <w:pPr>
+              <w:jc w:val="center"/>
+              <w:rPr>
+                <w:rFonts w:ascii="Arial" w:cs="Arial" w:eastAsia="Arial" w:hAnsi="Arial"/>
+                <w:sz w:val="18"/>
+                <w:szCs w:val="18"/>
+              </w:rPr>
+            </w:pPr>
+            <w:r>
+              <w:rPr>
+                <w:rFonts w:ascii="Arial" w:cs="Arial" w:eastAsia="Arial" w:hAnsi="Arial"/>
+                <w:b w:val="1"/>
+                <w:bCs w:val="1"/>
+                <w:sz w:val="18"/>
+                <w:szCs w:val="18"/>
+                <w:rtl w:val="0"/>
+              </w:rPr>
+              <w:t xml:space="preserve">Acurácia</w:t>
+            </w:r>
+          </w:p>
+        </w:tc>
+        <w:tc>
+          <w:tcPr>
+            <w:tcW w:w="1500" w:type="dxa"/>
+          </w:tcPr>
+          <w:p>
+            <w:pPr>
+              <w:jc w:val="center"/>
+              <w:rPr>
+                <w:rFonts w:ascii="Arial" w:cs="Arial" w:eastAsia="Arial" w:hAnsi="Arial"/>
+                <w:sz w:val="18"/>
+                <w:szCs w:val="18"/>
+              </w:rPr>
+            </w:pPr>
+            <w:r>
+              <w:rPr>
+                <w:rFonts w:ascii="Arial" w:cs="Arial" w:eastAsia="Arial" w:hAnsi="Arial"/>
+                <w:b w:val="1"/>
+                <w:bCs w:val="1"/>
+                <w:sz w:val="18"/>
+                <w:szCs w:val="18"/>
+                <w:rtl w:val="0"/>
+              </w:rPr>
+              <w:t xml:space="preserve">Precisão</w:t>
+            </w:r>
+          </w:p>
+        </w:tc>
+        <w:tc>
+          <w:tcPr>
+            <w:tcW w:w="1500" w:type="dxa"/>
+          </w:tcPr>
+          <w:p>
+            <w:pPr>
+              <w:jc w:val="center"/>
+              <w:rPr>
+                <w:rFonts w:ascii="Arial" w:cs="Arial" w:eastAsia="Arial" w:hAnsi="Arial"/>
+                <w:sz w:val="18"/>
+                <w:szCs w:val="18"/>
+              </w:rPr>
+            </w:pPr>
+            <w:r>
+              <w:rPr>
+                <w:rFonts w:ascii="Arial" w:cs="Arial" w:eastAsia="Arial" w:hAnsi="Arial"/>
+                <w:b w:val="1"/>
+                <w:bCs w:val="1"/>
+                <w:sz w:val="18"/>
+                <w:szCs w:val="18"/>
+                <w:rtl w:val="0"/>
+              </w:rPr>
+              <w:t xml:space="preserve">Recall</w:t>
+            </w:r>
+          </w:p>
+        </w:tc>
+        <w:tc>
+          <w:tcPr>
+            <w:tcW w:w="1500" w:type="dxa"/>
+          </w:tcPr>
+          <w:p>
+            <w:pPr>
+              <w:jc w:val="center"/>
+              <w:rPr>
+                <w:rFonts w:ascii="Arial" w:cs="Arial" w:eastAsia="Arial" w:hAnsi="Arial"/>
+                <w:sz w:val="18"/>
+                <w:szCs w:val="18"/>
+              </w:rPr>
+            </w:pPr>
+            <w:r>
+              <w:rPr>
+                <w:rFonts w:ascii="Arial" w:cs="Arial" w:eastAsia="Arial" w:hAnsi="Arial"/>
+                <w:b w:val="1"/>
+                <w:bCs w:val="1"/>
+                <w:sz w:val="18"/>
+                <w:szCs w:val="18"/>
+                <w:rtl w:val="0"/>
+              </w:rPr>
+              <w:t xml:space="preserve">ROC-AUC</w:t>
+            </w:r>
+          </w:p>
+        </w:tc>
+      </w:tr>
+      <w:tr>
+        <w:trPr>
+          <w:cantSplit w:val="0"/>
+          <w:tblHeader w:val="0"/>
+        </w:trPr>
+        <w:tc>
+          <w:tcPr>
+            <w:tcW w:w="2244" w:type="dxa"/>
+          </w:tcPr>
+          <w:p>
+            <w:pPr>
+              <w:jc w:val="left"/>
+              <w:rPr>
+                <w:rFonts w:ascii="Arial" w:cs="Arial" w:eastAsia="Arial" w:hAnsi="Arial"/>
+                <w:sz w:val="18"/>
+                <w:szCs w:val="18"/>
+              </w:rPr>
+            </w:pPr>
+            <w:r>
+              <w:rPr>
+                <w:rFonts w:ascii="Arial" w:cs="Arial" w:eastAsia="Arial" w:hAnsi="Arial"/>
+                <w:sz w:val="18"/>
+                <w:szCs w:val="18"/>
+                <w:rtl w:val="0"/>
+              </w:rPr>
+              <w:t xml:space="preserve">Regressão Logística</w:t>
+            </w:r>
+          </w:p>
+        </w:tc>
+        <w:tc>
+          <w:tcPr>
+            <w:tcW w:w="1500" w:type="dxa"/>
+          </w:tcPr>
+          <w:p>
+            <w:pPr>
+              <w:jc w:val="center"/>
+              <w:rPr>
+                <w:rFonts w:ascii="Arial" w:cs="Arial" w:eastAsia="Arial" w:hAnsi="Arial"/>
+                <w:sz w:val="18"/>
+                <w:szCs w:val="18"/>
+              </w:rPr>
+            </w:pPr>
+            <w:r>
+              <w:rPr>
+                <w:rFonts w:ascii="Arial" w:cs="Arial" w:eastAsia="Arial" w:hAnsi="Arial"/>
+                <w:sz w:val="18"/>
+                <w:szCs w:val="18"/>
+                <w:rtl w:val="0"/>
+              </w:rPr>
+              <w:t xml:space="preserve">0,826 ± 0,059</w:t>
+            </w:r>
+          </w:p>
+        </w:tc>
+        <w:tc>
+          <w:tcPr>
+            <w:tcW w:w="1500" w:type="dxa"/>
+          </w:tcPr>
+          <w:p>
+            <w:pPr>
+              <w:jc w:val="center"/>
+              <w:rPr>
+                <w:rFonts w:ascii="Arial" w:cs="Arial" w:eastAsia="Arial" w:hAnsi="Arial"/>
+                <w:sz w:val="18"/>
+                <w:szCs w:val="18"/>
+              </w:rPr>
+            </w:pPr>
+            <w:r>
+              <w:rPr>
+                <w:rFonts w:ascii="Arial" w:cs="Arial" w:eastAsia="Arial" w:hAnsi="Arial"/>
+                <w:sz w:val="18"/>
+                <w:szCs w:val="18"/>
+                <w:rtl w:val="0"/>
+              </w:rPr>
+              <w:t xml:space="preserve">0,848 ± 0,048</w:t>
+            </w:r>
+          </w:p>
+        </w:tc>
+        <w:tc>
+          <w:tcPr>
+            <w:tcW w:w="1500" w:type="dxa"/>
+          </w:tcPr>
+          <w:p>
+            <w:pPr>
+              <w:jc w:val="center"/>
+              <w:rPr>
+                <w:rFonts w:ascii="Arial" w:cs="Arial" w:eastAsia="Arial" w:hAnsi="Arial"/>
+                <w:sz w:val="18"/>
+                <w:szCs w:val="18"/>
+              </w:rPr>
+            </w:pPr>
+            <w:r>
+              <w:rPr>
+                <w:rFonts w:ascii="Arial" w:cs="Arial" w:eastAsia="Arial" w:hAnsi="Arial"/>
+                <w:sz w:val="18"/>
+                <w:szCs w:val="18"/>
+                <w:rtl w:val="0"/>
+              </w:rPr>
+              <w:t xml:space="preserve">0,864 ± 0,068</w:t>
+            </w:r>
+          </w:p>
+        </w:tc>
+        <w:tc>
+          <w:tcPr>
+            <w:tcW w:w="1500" w:type="dxa"/>
+          </w:tcPr>
+          <w:p>
+            <w:pPr>
+              <w:jc w:val="center"/>
+              <w:rPr>
+                <w:rFonts w:ascii="Arial" w:cs="Arial" w:eastAsia="Arial" w:hAnsi="Arial"/>
+                <w:sz w:val="18"/>
+                <w:szCs w:val="18"/>
+              </w:rPr>
+            </w:pPr>
+            <w:r>
+              <w:rPr>
+                <w:rFonts w:ascii="Arial" w:cs="Arial" w:eastAsia="Arial" w:hAnsi="Arial"/>
+                <w:sz w:val="18"/>
+                <w:szCs w:val="18"/>
+                <w:rtl w:val="0"/>
+              </w:rPr>
+              <w:t xml:space="preserve">0,798 ± 0,090</w:t>
+            </w:r>
+          </w:p>
+        </w:tc>
+        <w:tc>
+          <w:tcPr>
+            <w:tcW w:w="1500" w:type="dxa"/>
+          </w:tcPr>
+          <w:p>
+            <w:pPr>
+              <w:jc w:val="center"/>
+              <w:rPr>
+                <w:rFonts w:ascii="Arial" w:cs="Arial" w:eastAsia="Arial" w:hAnsi="Arial"/>
+                <w:sz w:val="18"/>
+                <w:szCs w:val="18"/>
+              </w:rPr>
+            </w:pPr>
+            <w:r>
+              <w:rPr>
+                <w:rFonts w:ascii="Arial" w:cs="Arial" w:eastAsia="Arial" w:hAnsi="Arial"/>
+                <w:sz w:val="18"/>
+                <w:szCs w:val="18"/>
+                <w:rtl w:val="0"/>
+              </w:rPr>
+              <w:t xml:space="preserve">0,909 ± 0,042</w:t>
+            </w:r>
+          </w:p>
+        </w:tc>
+      </w:tr>
+      <w:tr>
+        <w:trPr>
+          <w:cantSplit w:val="0"/>
+          <w:tblHeader w:val="0"/>
+        </w:trPr>
+        <w:tc>
+          <w:tcPr>
+            <w:tcW w:w="2244" w:type="dxa"/>
+          </w:tcPr>
+          <w:p>
+            <w:pPr>
+              <w:jc w:val="left"/>
+              <w:rPr>
+                <w:rFonts w:ascii="Arial" w:cs="Arial" w:eastAsia="Arial" w:hAnsi="Arial"/>
+                <w:sz w:val="18"/>
+                <w:szCs w:val="18"/>
+              </w:rPr>
+            </w:pPr>
+            <w:r>
+              <w:rPr>
+                <w:rFonts w:ascii="Arial" w:cs="Arial" w:eastAsia="Arial" w:hAnsi="Arial"/>
+                <w:sz w:val="18"/>
+                <w:szCs w:val="18"/>
+                <w:rtl w:val="0"/>
+              </w:rPr>
+              <w:t xml:space="preserve">KNN</w:t>
+            </w:r>
+          </w:p>
+        </w:tc>
+        <w:tc>
+          <w:tcPr>
+            <w:tcW w:w="1500" w:type="dxa"/>
+          </w:tcPr>
+          <w:p>
+            <w:pPr>
+              <w:jc w:val="center"/>
+              <w:rPr>
+                <w:rFonts w:ascii="Arial" w:cs="Arial" w:eastAsia="Arial" w:hAnsi="Arial"/>
+                <w:sz w:val="18"/>
+                <w:szCs w:val="18"/>
+              </w:rPr>
+            </w:pPr>
+            <w:r>
+              <w:rPr>
+                <w:rFonts w:ascii="Arial" w:cs="Arial" w:eastAsia="Arial" w:hAnsi="Arial"/>
+                <w:sz w:val="18"/>
+                <w:szCs w:val="18"/>
+                <w:rtl w:val="0"/>
+              </w:rPr>
+              <w:t xml:space="preserve">0,818 ± 0,055</w:t>
+            </w:r>
+          </w:p>
+        </w:tc>
+        <w:tc>
+          <w:tcPr>
+            <w:tcW w:w="1500" w:type="dxa"/>
+          </w:tcPr>
+          <w:p>
+            <w:pPr>
+              <w:jc w:val="center"/>
+              <w:rPr>
+                <w:rFonts w:ascii="Arial" w:cs="Arial" w:eastAsia="Arial" w:hAnsi="Arial"/>
+                <w:sz w:val="18"/>
+                <w:szCs w:val="18"/>
+              </w:rPr>
+            </w:pPr>
+            <w:r>
+              <w:rPr>
+                <w:rFonts w:ascii="Arial" w:cs="Arial" w:eastAsia="Arial" w:hAnsi="Arial"/>
+                <w:sz w:val="18"/>
+                <w:szCs w:val="18"/>
+                <w:rtl w:val="0"/>
+              </w:rPr>
+              <w:t xml:space="preserve">0,837 ± 0,046</w:t>
+            </w:r>
+          </w:p>
+        </w:tc>
+        <w:tc>
+          <w:tcPr>
+            <w:tcW w:w="1500" w:type="dxa"/>
+          </w:tcPr>
+          <w:p>
+            <w:pPr>
+              <w:jc w:val="center"/>
+              <w:rPr>
+                <w:rFonts w:ascii="Arial" w:cs="Arial" w:eastAsia="Arial" w:hAnsi="Arial"/>
+                <w:sz w:val="18"/>
+                <w:szCs w:val="18"/>
+              </w:rPr>
+            </w:pPr>
+            <w:r>
+              <w:rPr>
+                <w:rFonts w:ascii="Arial" w:cs="Arial" w:eastAsia="Arial" w:hAnsi="Arial"/>
+                <w:sz w:val="18"/>
+                <w:szCs w:val="18"/>
+                <w:rtl w:val="0"/>
+              </w:rPr>
+              <w:t xml:space="preserve">0,833 ± 0,061</w:t>
+            </w:r>
+          </w:p>
+        </w:tc>
+        <w:tc>
+          <w:tcPr>
+            <w:tcW w:w="1500" w:type="dxa"/>
+          </w:tcPr>
+          <w:p>
+            <w:pPr>
+              <w:jc w:val="center"/>
+              <w:rPr>
+                <w:rFonts w:ascii="Arial" w:cs="Arial" w:eastAsia="Arial" w:hAnsi="Arial"/>
+                <w:sz w:val="18"/>
+                <w:szCs w:val="18"/>
+              </w:rPr>
+            </w:pPr>
+            <w:r>
+              <w:rPr>
+                <w:rFonts w:ascii="Arial" w:cs="Arial" w:eastAsia="Arial" w:hAnsi="Arial"/>
+                <w:sz w:val="18"/>
+                <w:szCs w:val="18"/>
+                <w:rtl w:val="0"/>
+              </w:rPr>
+              <w:t xml:space="preserve">0,808 ± 0,076</w:t>
+            </w:r>
+          </w:p>
+        </w:tc>
+        <w:tc>
+          <w:tcPr>
+            <w:tcW w:w="1500" w:type="dxa"/>
+          </w:tcPr>
+          <w:p>
+            <w:pPr>
+              <w:jc w:val="center"/>
+              <w:rPr>
+                <w:rFonts w:ascii="Arial" w:cs="Arial" w:eastAsia="Arial" w:hAnsi="Arial"/>
+                <w:sz w:val="18"/>
+                <w:szCs w:val="18"/>
+              </w:rPr>
+            </w:pPr>
+            <w:r>
+              <w:rPr>
+                <w:rFonts w:ascii="Arial" w:cs="Arial" w:eastAsia="Arial" w:hAnsi="Arial"/>
+                <w:sz w:val="18"/>
+                <w:szCs w:val="18"/>
+                <w:rtl w:val="0"/>
+              </w:rPr>
+              <w:t xml:space="preserve">0,872 ± 0,051</w:t>
+            </w:r>
+          </w:p>
+        </w:tc>
+      </w:tr>
+      <w:tr>
+        <w:trPr>
+          <w:cantSplit w:val="0"/>
+          <w:tblHeader w:val="0"/>
+        </w:trPr>
+        <w:tc>
+          <w:tcPr>
+            <w:tcW w:w="2244" w:type="dxa"/>
+          </w:tcPr>
+          <w:p>
+            <w:pPr>
+              <w:jc w:val="left"/>
+              <w:rPr>
+                <w:rFonts w:ascii="Arial" w:cs="Arial" w:eastAsia="Arial" w:hAnsi="Arial"/>
+                <w:sz w:val="18"/>
+                <w:szCs w:val="18"/>
+              </w:rPr>
+            </w:pPr>
+            <w:r>
+              <w:rPr>
+                <w:rFonts w:ascii="Arial" w:cs="Arial" w:eastAsia="Arial" w:hAnsi="Arial"/>
+                <w:sz w:val="18"/>
+                <w:szCs w:val="18"/>
+                <w:rtl w:val="0"/>
+              </w:rPr>
+              <w:t xml:space="preserve">Random Forest</w:t>
+            </w:r>
+          </w:p>
+        </w:tc>
+        <w:tc>
+          <w:tcPr>
+            <w:tcW w:w="1500" w:type="dxa"/>
+          </w:tcPr>
+          <w:p>
+            <w:pPr>
+              <w:jc w:val="center"/>
+              <w:rPr>
+                <w:rFonts w:ascii="Arial" w:cs="Arial" w:eastAsia="Arial" w:hAnsi="Arial"/>
+                <w:sz w:val="18"/>
+                <w:szCs w:val="18"/>
+              </w:rPr>
+            </w:pPr>
+            <w:r>
+              <w:rPr>
+                <w:rFonts w:ascii="Arial" w:cs="Arial" w:eastAsia="Arial" w:hAnsi="Arial"/>
+                <w:sz w:val="18"/>
+                <w:szCs w:val="18"/>
+                <w:rtl w:val="0"/>
+              </w:rPr>
+              <w:t xml:space="preserve">0,809 ± 0,053</w:t>
+            </w:r>
+          </w:p>
+        </w:tc>
+        <w:tc>
+          <w:tcPr>
+            <w:tcW w:w="1500" w:type="dxa"/>
+          </w:tcPr>
+          <w:p>
+            <w:pPr>
+              <w:jc w:val="center"/>
+              <w:rPr>
+                <w:rFonts w:ascii="Arial" w:cs="Arial" w:eastAsia="Arial" w:hAnsi="Arial"/>
+                <w:sz w:val="18"/>
+                <w:szCs w:val="18"/>
+              </w:rPr>
+            </w:pPr>
+            <w:r>
+              <w:rPr>
+                <w:rFonts w:ascii="Arial" w:cs="Arial" w:eastAsia="Arial" w:hAnsi="Arial"/>
+                <w:sz w:val="18"/>
+                <w:szCs w:val="18"/>
+                <w:rtl w:val="0"/>
+              </w:rPr>
+              <w:t xml:space="preserve">0,829 ± 0,047</w:t>
+            </w:r>
+          </w:p>
+        </w:tc>
+        <w:tc>
+          <w:tcPr>
+            <w:tcW w:w="1500" w:type="dxa"/>
+          </w:tcPr>
+          <w:p>
+            <w:pPr>
+              <w:jc w:val="center"/>
+              <w:rPr>
+                <w:rFonts w:ascii="Arial" w:cs="Arial" w:eastAsia="Arial" w:hAnsi="Arial"/>
+                <w:sz w:val="18"/>
+                <w:szCs w:val="18"/>
+              </w:rPr>
+            </w:pPr>
+            <w:r>
+              <w:rPr>
+                <w:rFonts w:ascii="Arial" w:cs="Arial" w:eastAsia="Arial" w:hAnsi="Arial"/>
+                <w:sz w:val="18"/>
+                <w:szCs w:val="18"/>
+                <w:rtl w:val="0"/>
+              </w:rPr>
+              <w:t xml:space="preserve">0,830 ± 0,074</w:t>
+            </w:r>
+          </w:p>
+        </w:tc>
+        <w:tc>
+          <w:tcPr>
+            <w:tcW w:w="1500" w:type="dxa"/>
+          </w:tcPr>
+          <w:p>
+            <w:pPr>
+              <w:jc w:val="center"/>
+              <w:rPr>
+                <w:rFonts w:ascii="Arial" w:cs="Arial" w:eastAsia="Arial" w:hAnsi="Arial"/>
+                <w:sz w:val="18"/>
+                <w:szCs w:val="18"/>
+              </w:rPr>
+            </w:pPr>
+            <w:r>
+              <w:rPr>
+                <w:rFonts w:ascii="Arial" w:cs="Arial" w:eastAsia="Arial" w:hAnsi="Arial"/>
+                <w:sz w:val="18"/>
+                <w:szCs w:val="18"/>
+                <w:rtl w:val="0"/>
+              </w:rPr>
+              <w:t xml:space="preserve">0,796 ± 0,079</w:t>
+            </w:r>
+          </w:p>
+        </w:tc>
+        <w:tc>
+          <w:tcPr>
+            <w:tcW w:w="1500" w:type="dxa"/>
+          </w:tcPr>
+          <w:p>
+            <w:pPr>
+              <w:jc w:val="center"/>
+              <w:rPr>
+                <w:rFonts w:ascii="Arial" w:cs="Arial" w:eastAsia="Arial" w:hAnsi="Arial"/>
+                <w:sz w:val="18"/>
+                <w:szCs w:val="18"/>
+              </w:rPr>
+            </w:pPr>
+            <w:r>
+              <w:rPr>
+                <w:rFonts w:ascii="Arial" w:cs="Arial" w:eastAsia="Arial" w:hAnsi="Arial"/>
+                <w:sz w:val="18"/>
+                <w:szCs w:val="18"/>
+                <w:rtl w:val="0"/>
+              </w:rPr>
+              <w:t xml:space="preserve">0,904 ± 0,040</w:t>
+            </w:r>
+          </w:p>
+        </w:tc>
+      </w:tr>
+      <w:tr>
+        <w:trPr>
+          <w:cantSplit w:val="0"/>
+          <w:tblHeader w:val="0"/>
+        </w:trPr>
+        <w:tc>
+          <w:tcPr>
+            <w:tcW w:w="2244" w:type="dxa"/>
+          </w:tcPr>
+          <w:p>
+            <w:pPr>
+              <w:jc w:val="left"/>
+              <w:rPr>
+                <w:rFonts w:ascii="Arial" w:cs="Arial" w:eastAsia="Arial" w:hAnsi="Arial"/>
+                <w:sz w:val="18"/>
+                <w:szCs w:val="18"/>
+              </w:rPr>
+            </w:pPr>
+            <w:r>
+              <w:rPr>
+                <w:rFonts w:ascii="Arial" w:cs="Arial" w:eastAsia="Arial" w:hAnsi="Arial"/>
+                <w:sz w:val="18"/>
+                <w:szCs w:val="18"/>
+                <w:rtl w:val="0"/>
+              </w:rPr>
+              <w:t xml:space="preserve">Gradient Boosting</w:t>
+            </w:r>
+          </w:p>
+        </w:tc>
+        <w:tc>
+          <w:tcPr>
+            <w:tcW w:w="1500" w:type="dxa"/>
+          </w:tcPr>
+          <w:p>
+            <w:pPr>
+              <w:jc w:val="center"/>
+              <w:rPr>
+                <w:rFonts w:ascii="Arial" w:cs="Arial" w:eastAsia="Arial" w:hAnsi="Arial"/>
+                <w:sz w:val="18"/>
+                <w:szCs w:val="18"/>
+              </w:rPr>
+            </w:pPr>
+            <w:r>
+              <w:rPr>
+                <w:rFonts w:ascii="Arial" w:cs="Arial" w:eastAsia="Arial" w:hAnsi="Arial"/>
+                <w:sz w:val="18"/>
+                <w:szCs w:val="18"/>
+                <w:rtl w:val="0"/>
+              </w:rPr>
+              <w:t xml:space="preserve">0,781 ± 0,053</w:t>
+            </w:r>
+          </w:p>
+        </w:tc>
+        <w:tc>
+          <w:tcPr>
+            <w:tcW w:w="1500" w:type="dxa"/>
+          </w:tcPr>
+          <w:p>
+            <w:pPr>
+              <w:jc w:val="center"/>
+              <w:rPr>
+                <w:rFonts w:ascii="Arial" w:cs="Arial" w:eastAsia="Arial" w:hAnsi="Arial"/>
+                <w:sz w:val="18"/>
+                <w:szCs w:val="18"/>
+              </w:rPr>
+            </w:pPr>
+            <w:r>
+              <w:rPr>
+                <w:rFonts w:ascii="Arial" w:cs="Arial" w:eastAsia="Arial" w:hAnsi="Arial"/>
+                <w:sz w:val="18"/>
+                <w:szCs w:val="18"/>
+                <w:rtl w:val="0"/>
+              </w:rPr>
+              <w:t xml:space="preserve">0,800 ± 0,047</w:t>
+            </w:r>
+          </w:p>
+        </w:tc>
+        <w:tc>
+          <w:tcPr>
+            <w:tcW w:w="1500" w:type="dxa"/>
+          </w:tcPr>
+          <w:p>
+            <w:pPr>
+              <w:jc w:val="center"/>
+              <w:rPr>
+                <w:rFonts w:ascii="Arial" w:cs="Arial" w:eastAsia="Arial" w:hAnsi="Arial"/>
+                <w:sz w:val="18"/>
+                <w:szCs w:val="18"/>
+              </w:rPr>
+            </w:pPr>
+            <w:r>
+              <w:rPr>
+                <w:rFonts w:ascii="Arial" w:cs="Arial" w:eastAsia="Arial" w:hAnsi="Arial"/>
+                <w:sz w:val="18"/>
+                <w:szCs w:val="18"/>
+                <w:rtl w:val="0"/>
+              </w:rPr>
+              <w:t xml:space="preserve">0,786 ± 0,062</w:t>
+            </w:r>
+          </w:p>
+        </w:tc>
+        <w:tc>
+          <w:tcPr>
+            <w:tcW w:w="1500" w:type="dxa"/>
+          </w:tcPr>
+          <w:p>
+            <w:pPr>
+              <w:jc w:val="center"/>
+              <w:rPr>
+                <w:rFonts w:ascii="Arial" w:cs="Arial" w:eastAsia="Arial" w:hAnsi="Arial"/>
+                <w:sz w:val="18"/>
+                <w:szCs w:val="18"/>
+              </w:rPr>
+            </w:pPr>
+            <w:r>
+              <w:rPr>
+                <w:rFonts w:ascii="Arial" w:cs="Arial" w:eastAsia="Arial" w:hAnsi="Arial"/>
+                <w:sz w:val="18"/>
+                <w:szCs w:val="18"/>
+                <w:rtl w:val="0"/>
+              </w:rPr>
+              <w:t xml:space="preserve">0,782 ± 0,082</w:t>
+            </w:r>
+          </w:p>
+        </w:tc>
+        <w:tc>
+          <w:tcPr>
+            <w:tcW w:w="1500" w:type="dxa"/>
+          </w:tcPr>
+          <w:p>
+            <w:pPr>
+              <w:jc w:val="center"/>
+              <w:rPr>
+                <w:rFonts w:ascii="Arial" w:cs="Arial" w:eastAsia="Arial" w:hAnsi="Arial"/>
+                <w:sz w:val="18"/>
+                <w:szCs w:val="18"/>
+              </w:rPr>
+            </w:pPr>
+            <w:r>
+              <w:rPr>
+                <w:rFonts w:ascii="Arial" w:cs="Arial" w:eastAsia="Arial" w:hAnsi="Arial"/>
+                <w:sz w:val="18"/>
+                <w:szCs w:val="18"/>
+                <w:rtl w:val="0"/>
+              </w:rPr>
+              <w:t xml:space="preserve">0,878 ± 0,045</w:t>
+            </w:r>
+          </w:p>
+        </w:tc>
+      </w:tr>
+      <w:tr>
+        <w:trPr>
+          <w:cantSplit w:val="0"/>
+          <w:tblHeader w:val="0"/>
+        </w:trPr>
+        <w:tc>
+          <w:tcPr>
+            <w:tcW w:w="2244" w:type="dxa"/>
+          </w:tcPr>
+          <w:p>
+            <w:pPr>
+              <w:jc w:val="left"/>
+              <w:rPr>
+                <w:rFonts w:ascii="Arial" w:cs="Arial" w:eastAsia="Arial" w:hAnsi="Arial"/>
+                <w:sz w:val="18"/>
+                <w:szCs w:val="18"/>
+              </w:rPr>
+            </w:pPr>
+            <w:r>
+              <w:rPr>
+                <w:rFonts w:ascii="Arial" w:cs="Arial" w:eastAsia="Arial" w:hAnsi="Arial"/>
+                <w:sz w:val="18"/>
+                <w:szCs w:val="18"/>
+                <w:rtl w:val="0"/>
+              </w:rPr>
+              <w:t xml:space="preserve">Rede Neural (MLP)</w:t>
+            </w:r>
+          </w:p>
+        </w:tc>
+        <w:tc>
+          <w:tcPr>
+            <w:tcW w:w="1500" w:type="dxa"/>
+          </w:tcPr>
+          <w:p>
+            <w:pPr>
+              <w:jc w:val="center"/>
+              <w:rPr>
+                <w:rFonts w:ascii="Arial" w:cs="Arial" w:eastAsia="Arial" w:hAnsi="Arial"/>
+                <w:sz w:val="18"/>
+                <w:szCs w:val="18"/>
+              </w:rPr>
+            </w:pPr>
+            <w:r>
+              <w:rPr>
+                <w:rFonts w:ascii="Arial" w:cs="Arial" w:eastAsia="Arial" w:hAnsi="Arial"/>
+                <w:sz w:val="18"/>
+                <w:szCs w:val="18"/>
+                <w:rtl w:val="0"/>
+              </w:rPr>
+              <w:t xml:space="preserve">0,773 ± 0,062</w:t>
+            </w:r>
+          </w:p>
+        </w:tc>
+        <w:tc>
+          <w:tcPr>
+            <w:tcW w:w="1500" w:type="dxa"/>
+          </w:tcPr>
+          <w:p>
+            <w:pPr>
+              <w:jc w:val="center"/>
+              <w:rPr>
+                <w:rFonts w:ascii="Arial" w:cs="Arial" w:eastAsia="Arial" w:hAnsi="Arial"/>
+                <w:sz w:val="18"/>
+                <w:szCs w:val="18"/>
+              </w:rPr>
+            </w:pPr>
+            <w:r>
+              <w:rPr>
+                <w:rFonts w:ascii="Arial" w:cs="Arial" w:eastAsia="Arial" w:hAnsi="Arial"/>
+                <w:sz w:val="18"/>
+                <w:szCs w:val="18"/>
+                <w:rtl w:val="0"/>
+              </w:rPr>
+              <w:t xml:space="preserve">0,797 ± 0,057</w:t>
+            </w:r>
+          </w:p>
+        </w:tc>
+        <w:tc>
+          <w:tcPr>
+            <w:tcW w:w="1500" w:type="dxa"/>
+          </w:tcPr>
+          <w:p>
+            <w:pPr>
+              <w:jc w:val="center"/>
+              <w:rPr>
+                <w:rFonts w:ascii="Arial" w:cs="Arial" w:eastAsia="Arial" w:hAnsi="Arial"/>
+                <w:sz w:val="18"/>
+                <w:szCs w:val="18"/>
+              </w:rPr>
+            </w:pPr>
+            <w:r>
+              <w:rPr>
+                <w:rFonts w:ascii="Arial" w:cs="Arial" w:eastAsia="Arial" w:hAnsi="Arial"/>
+                <w:sz w:val="18"/>
+                <w:szCs w:val="18"/>
+                <w:rtl w:val="0"/>
+              </w:rPr>
+              <w:t xml:space="preserve">0,801 ± 0,092</w:t>
+            </w:r>
+          </w:p>
+        </w:tc>
+        <w:tc>
+          <w:tcPr>
+            <w:tcW w:w="1500" w:type="dxa"/>
+          </w:tcPr>
+          <w:p>
+            <w:pPr>
+              <w:jc w:val="center"/>
+              <w:rPr>
+                <w:rFonts w:ascii="Arial" w:cs="Arial" w:eastAsia="Arial" w:hAnsi="Arial"/>
+                <w:sz w:val="18"/>
+                <w:szCs w:val="18"/>
+              </w:rPr>
+            </w:pPr>
+            <w:r>
+              <w:rPr>
+                <w:rFonts w:ascii="Arial" w:cs="Arial" w:eastAsia="Arial" w:hAnsi="Arial"/>
+                <w:sz w:val="18"/>
+                <w:szCs w:val="18"/>
+                <w:rtl w:val="0"/>
+              </w:rPr>
+              <w:t xml:space="preserve">0,756 ± 0,085</w:t>
+            </w:r>
+          </w:p>
+        </w:tc>
+        <w:tc>
+          <w:tcPr>
+            <w:tcW w:w="1500" w:type="dxa"/>
+          </w:tcPr>
+          <w:p>
+            <w:pPr>
+              <w:jc w:val="center"/>
+              <w:rPr>
+                <w:rFonts w:ascii="Arial" w:cs="Arial" w:eastAsia="Arial" w:hAnsi="Arial"/>
+                <w:sz w:val="18"/>
+                <w:szCs w:val="18"/>
+              </w:rPr>
+            </w:pPr>
+            <w:r>
+              <w:rPr>
+                <w:rFonts w:ascii="Arial" w:cs="Arial" w:eastAsia="Arial" w:hAnsi="Arial"/>
+                <w:sz w:val="18"/>
+                <w:szCs w:val="18"/>
+                <w:rtl w:val="0"/>
+              </w:rPr>
+              <w:t xml:space="preserve">0,867 ± 0,053</w:t>
+            </w:r>
+          </w:p>
+        </w:tc>
+      </w:tr>
+      <w:tr>
+        <w:trPr>
+          <w:cantSplit w:val="0"/>
+          <w:tblHeader w:val="0"/>
+        </w:trPr>
+        <w:tc>
+          <w:tcPr>
+            <w:tcW w:w="2244" w:type="dxa"/>
+          </w:tcPr>
+          <w:p>
+            <w:pPr>
+              <w:jc w:val="left"/>
+              <w:rPr>
+                <w:rFonts w:ascii="Arial" w:cs="Arial" w:eastAsia="Arial" w:hAnsi="Arial"/>
+                <w:sz w:val="18"/>
+                <w:szCs w:val="18"/>
+              </w:rPr>
+            </w:pPr>
+            <w:r>
+              <w:rPr>
+                <w:rFonts w:ascii="Arial" w:cs="Arial" w:eastAsia="Arial" w:hAnsi="Arial"/>
+                <w:sz w:val="18"/>
+                <w:szCs w:val="18"/>
+                <w:rtl w:val="0"/>
+              </w:rPr>
+              <w:t xml:space="preserve">Árvore de Decisão</w:t>
+            </w:r>
+          </w:p>
+        </w:tc>
+        <w:tc>
+          <w:tcPr>
+            <w:tcW w:w="1500" w:type="dxa"/>
+          </w:tcPr>
+          <w:p>
+            <w:pPr>
+              <w:jc w:val="center"/>
+              <w:rPr>
+                <w:rFonts w:ascii="Arial" w:cs="Arial" w:eastAsia="Arial" w:hAnsi="Arial"/>
+                <w:sz w:val="18"/>
+                <w:szCs w:val="18"/>
+              </w:rPr>
+            </w:pPr>
+            <w:r>
+              <w:rPr>
+                <w:rFonts w:ascii="Arial" w:cs="Arial" w:eastAsia="Arial" w:hAnsi="Arial"/>
+                <w:sz w:val="18"/>
+                <w:szCs w:val="18"/>
+                <w:rtl w:val="0"/>
+              </w:rPr>
+              <w:t xml:space="preserve">0,729 ± 0,056</w:t>
+            </w:r>
+          </w:p>
+        </w:tc>
+        <w:tc>
+          <w:tcPr>
+            <w:tcW w:w="1500" w:type="dxa"/>
+          </w:tcPr>
+          <w:p>
+            <w:pPr>
+              <w:jc w:val="center"/>
+              <w:rPr>
+                <w:rFonts w:ascii="Arial" w:cs="Arial" w:eastAsia="Arial" w:hAnsi="Arial"/>
+                <w:sz w:val="18"/>
+                <w:szCs w:val="18"/>
+              </w:rPr>
+            </w:pPr>
+            <w:r>
+              <w:rPr>
+                <w:rFonts w:ascii="Arial" w:cs="Arial" w:eastAsia="Arial" w:hAnsi="Arial"/>
+                <w:sz w:val="18"/>
+                <w:szCs w:val="18"/>
+                <w:rtl w:val="0"/>
+              </w:rPr>
+              <w:t xml:space="preserve">0,749 ± 0,053</w:t>
+            </w:r>
+          </w:p>
+        </w:tc>
+        <w:tc>
+          <w:tcPr>
+            <w:tcW w:w="1500" w:type="dxa"/>
+          </w:tcPr>
+          <w:p>
+            <w:pPr>
+              <w:jc w:val="center"/>
+              <w:rPr>
+                <w:rFonts w:ascii="Arial" w:cs="Arial" w:eastAsia="Arial" w:hAnsi="Arial"/>
+                <w:sz w:val="18"/>
+                <w:szCs w:val="18"/>
+              </w:rPr>
+            </w:pPr>
+            <w:r>
+              <w:rPr>
+                <w:rFonts w:ascii="Arial" w:cs="Arial" w:eastAsia="Arial" w:hAnsi="Arial"/>
+                <w:sz w:val="18"/>
+                <w:szCs w:val="18"/>
+                <w:rtl w:val="0"/>
+              </w:rPr>
+              <w:t xml:space="preserve">0,725 ± 0,068</w:t>
+            </w:r>
+          </w:p>
+        </w:tc>
+        <w:tc>
+          <w:tcPr>
+            <w:tcW w:w="1500" w:type="dxa"/>
+          </w:tcPr>
+          <w:p>
+            <w:pPr>
+              <w:jc w:val="center"/>
+              <w:rPr>
+                <w:rFonts w:ascii="Arial" w:cs="Arial" w:eastAsia="Arial" w:hAnsi="Arial"/>
+                <w:sz w:val="18"/>
+                <w:szCs w:val="18"/>
+              </w:rPr>
+            </w:pPr>
+            <w:r>
+              <w:rPr>
+                <w:rFonts w:ascii="Arial" w:cs="Arial" w:eastAsia="Arial" w:hAnsi="Arial"/>
+                <w:sz w:val="18"/>
+                <w:szCs w:val="18"/>
+                <w:rtl w:val="0"/>
+              </w:rPr>
+              <w:t xml:space="preserve">0,740 ± 0,082</w:t>
+            </w:r>
+          </w:p>
+        </w:tc>
+        <w:tc>
+          <w:tcPr>
+            <w:tcW w:w="1500" w:type="dxa"/>
+          </w:tcPr>
+          <w:p>
+            <w:pPr>
+              <w:jc w:val="center"/>
+              <w:rPr>
+                <w:rFonts w:ascii="Arial" w:cs="Arial" w:eastAsia="Arial" w:hAnsi="Arial"/>
+                <w:sz w:val="18"/>
+                <w:szCs w:val="18"/>
+              </w:rPr>
+            </w:pPr>
+            <w:r>
+              <w:rPr>
+                <w:rFonts w:ascii="Arial" w:cs="Arial" w:eastAsia="Arial" w:hAnsi="Arial"/>
+                <w:sz w:val="18"/>
+                <w:szCs w:val="18"/>
+                <w:rtl w:val="0"/>
+              </w:rPr>
+              <w:t xml:space="preserve">0,749 ± 0,053</w:t>
+            </w:r>
+          </w:p>
+        </w:tc>
+      </w:tr>
+    </w:tbl>
     <w:p>
       <w:pPr>
         <w:jc w:val="both"/>
         <w:rPr>
           <w:rFonts w:ascii="Arial" w:cs="Arial" w:eastAsia="Arial" w:hAnsi="Arial"/>
-          <w:i w:val="1"/>
-          <w:iCs w:val="1"/>
-          <w:sz w:val="22"/>
-          <w:szCs w:val="22"/>
+          <w:sz w:val="18"/>
+          <w:szCs w:val="18"/>
         </w:rPr>
       </w:pPr>
       <w:r>
         <w:rPr>
           <w:rFonts w:ascii="Arial" w:cs="Arial" w:eastAsia="Arial" w:hAnsi="Arial"/>
-          <w:i w:val="1"/>
-          <w:iCs w:val="1"/>
-          <w:sz w:val="22"/>
-          <w:szCs w:val="22"/>
+          <w:sz w:val="18"/>
+          <w:szCs w:val="18"/>
           <w:rtl w:val="0"/>
         </w:rPr>
-        <w:t xml:space="preserve">[Inserir tabela comparativa aqui]</w:t>
+        <w:t xml:space="preserve">Média ± desvio padrão nas 50 avaliações (5 folds × 10 repetições), ordenado pelo F1. Classe positiva: com doença.</w:t>
       </w:r>
     </w:p>
     <w:p>
@@ -2614,28 +4120,62 @@
     </w:p>
     <w:p>
       <w:pPr>
-        <w:jc w:val="both"/>
-        <w:rPr>
-          <w:rFonts w:ascii="Arial" w:cs="Arial" w:eastAsia="Arial" w:hAnsi="Arial"/>
-          <w:sz w:val="22"/>
-          <w:szCs w:val="22"/>
-        </w:rPr>
+        <w:jc w:val="center"/>
       </w:pPr>
       <w:r>
+        <w:drawing>
+          <wp:inline distT="0" distB="0" distL="0" distR="0">
+            <wp:extent cx="5486400" cy="2698595"/>
+            <wp:docPr id="901" name="Gráfico F1"/>
+            <wp:cNvGraphicFramePr>
+              <a:graphicFrameLocks noChangeAspect="1"/>
+            </wp:cNvGraphicFramePr>
+            <a:graphic>
+              <a:graphicData uri="http://schemas.openxmlformats.org/drawingml/2006/picture">
+                <pic:pic>
+                  <pic:nvPicPr>
+                    <pic:cNvPr id="901" name="grafico_f1.png"/>
+                    <pic:cNvPicPr/>
+                  </pic:nvPicPr>
+                  <pic:blipFill>
+                    <a:blip r:embed="rIdGraficoF1"/>
+                    <a:stretch>
+                      <a:fillRect/>
+                    </a:stretch>
+                  </pic:blipFill>
+                  <pic:spPr>
+                    <a:xfrm>
+                      <a:off x="0" y="0"/>
+                      <a:ext cx="5486400" cy="2698595"/>
+                    </a:xfrm>
+                    <a:prstGeom prst="rect">
+                      <a:avLst/>
+                    </a:prstGeom>
+                  </pic:spPr>
+                </pic:pic>
+              </a:graphicData>
+            </a:graphic>
+          </wp:inline>
+        </w:drawing>
+      </w:r>
+    </w:p>
+    <w:p>
+      <w:pPr>
+        <w:jc w:val="center"/>
         <w:rPr>
           <w:rFonts w:ascii="Arial" w:cs="Arial" w:eastAsia="Arial" w:hAnsi="Arial"/>
-          <w:i w:val="1"/>
-          <w:iCs w:val="1"/>
-          <w:sz w:val="22"/>
-          <w:szCs w:val="22"/>
+          <w:sz w:val="18"/>
+          <w:szCs w:val="18"/>
+        </w:rPr>
+      </w:pPr>
+      <w:r>
+        <w:rPr>
+          <w:rFonts w:ascii="Arial" w:cs="Arial" w:eastAsia="Arial" w:hAnsi="Arial"/>
+          <w:sz w:val="18"/>
+          <w:szCs w:val="18"/>
           <w:rtl w:val="0"/>
         </w:rPr>
-        <w:t xml:space="preserve">[Inserir gráfico comparativo aqui]</w:t>
-      </w:r>
-      <w:r>
-        <w:rPr>
-          <w:rtl w:val="0"/>
-        </w:rPr>
+        <w:t xml:space="preserve">Distribuição do F1 (classe positiva = com doença) nas 50 avaliações de cada algoritmo; o losango indica a média.</w:t>
       </w:r>
     </w:p>
     <w:p>
@@ -3008,6 +4548,1394 @@
     </w:p>
     <w:p>
       <w:pPr>
+        <w:jc w:val="both"/>
+        <w:rPr>
+          <w:rFonts w:ascii="Arial" w:cs="Arial" w:eastAsia="Arial" w:hAnsi="Arial"/>
+          <w:sz w:val="22"/>
+          <w:szCs w:val="22"/>
+        </w:rPr>
+      </w:pPr>
+      <w:r>
+        <w:rPr>
+          <w:rFonts w:ascii="Arial" w:cs="Arial" w:eastAsia="Arial" w:hAnsi="Arial"/>
+          <w:b w:val="1"/>
+          <w:bCs w:val="1"/>
+          <w:sz w:val="22"/>
+          <w:szCs w:val="22"/>
+          <w:rtl w:val="0"/>
+        </w:rPr>
+        <w:t xml:space="preserve">Modelos selecionados: </w:t>
+      </w:r>
+      <w:r>
+        <w:rPr>
+          <w:rFonts w:ascii="Arial" w:cs="Arial" w:eastAsia="Arial" w:hAnsi="Arial"/>
+          <w:sz w:val="22"/>
+          <w:szCs w:val="22"/>
+          <w:rtl w:val="0"/>
+        </w:rPr>
+        <w:t xml:space="preserve">Regressão Logística, KNN e Random Forest (as três maiores médias de F1 no spot-checking).</w:t>
+      </w:r>
+    </w:p>
+    <w:p>
+      <w:pPr>
+        <w:jc w:val="both"/>
+        <w:rPr>
+          <w:rFonts w:ascii="Arial" w:cs="Arial" w:eastAsia="Arial" w:hAnsi="Arial"/>
+          <w:sz w:val="22"/>
+          <w:szCs w:val="22"/>
+          <w:i w:val="1"/>
+        </w:rPr>
+      </w:pPr>
+      <w:r>
+        <w:rPr>
+          <w:rFonts w:ascii="Arial" w:cs="Arial" w:eastAsia="Arial" w:hAnsi="Arial"/>
+          <w:i w:val="1"/>
+          <w:iCs w:val="1"/>
+          <w:sz w:val="22"/>
+          <w:szCs w:val="22"/>
+          <w:rtl w:val="0"/>
+        </w:rPr>
+        <w:t xml:space="preserve">[Justificativa da seleção – a ser redigida pelo grupo, com base na Tabela 5.1, no Gráfico 5.2 e nos dados abaixo.]</w:t>
+      </w:r>
+    </w:p>
+    <w:tbl>
+      <w:tblPr>
+        <w:tblW w:w="9744" w:type="dxa"/>
+        <w:jc w:val="center"/>
+        <w:tblBorders>
+          <w:top w:color="000000" w:space="0" w:sz="4" w:val="single"/>
+          <w:left w:color="000000" w:space="0" w:sz="4" w:val="single"/>
+          <w:bottom w:color="000000" w:space="0" w:sz="4" w:val="single"/>
+          <w:right w:color="000000" w:space="0" w:sz="4" w:val="single"/>
+          <w:insideH w:color="000000" w:space="0" w:sz="4" w:val="single"/>
+          <w:insideV w:color="000000" w:space="0" w:sz="4" w:val="single"/>
+        </w:tblBorders>
+        <w:tblLayout w:type="fixed"/>
+        <w:tblLook w:val="0400"/>
+      </w:tblPr>
+      <w:tblGrid>
+        <w:gridCol w:w="2044"/>
+        <w:gridCol w:w="1700"/>
+        <w:gridCol w:w="1000"/>
+        <w:gridCol w:w="1000"/>
+        <w:gridCol w:w="1000"/>
+        <w:gridCol w:w="1500"/>
+        <w:gridCol w:w="1500"/>
+      </w:tblGrid>
+      <w:tr>
+        <w:trPr>
+          <w:cantSplit w:val="0"/>
+          <w:tblHeader w:val="0"/>
+        </w:trPr>
+        <w:tc>
+          <w:tcPr>
+            <w:tcW w:w="2044" w:type="dxa"/>
+          </w:tcPr>
+          <w:p>
+            <w:pPr>
+              <w:jc w:val="left"/>
+              <w:rPr>
+                <w:rFonts w:ascii="Arial" w:cs="Arial" w:eastAsia="Arial" w:hAnsi="Arial"/>
+                <w:sz w:val="18"/>
+                <w:szCs w:val="18"/>
+              </w:rPr>
+            </w:pPr>
+            <w:r>
+              <w:rPr>
+                <w:rFonts w:ascii="Arial" w:cs="Arial" w:eastAsia="Arial" w:hAnsi="Arial"/>
+                <w:b w:val="1"/>
+                <w:bCs w:val="1"/>
+                <w:sz w:val="18"/>
+                <w:szCs w:val="18"/>
+                <w:rtl w:val="0"/>
+              </w:rPr>
+              <w:t xml:space="preserve">Modelo</w:t>
+            </w:r>
+          </w:p>
+        </w:tc>
+        <w:tc>
+          <w:tcPr>
+            <w:tcW w:w="1700" w:type="dxa"/>
+          </w:tcPr>
+          <w:p>
+            <w:pPr>
+              <w:jc w:val="center"/>
+              <w:rPr>
+                <w:rFonts w:ascii="Arial" w:cs="Arial" w:eastAsia="Arial" w:hAnsi="Arial"/>
+                <w:sz w:val="18"/>
+                <w:szCs w:val="18"/>
+              </w:rPr>
+            </w:pPr>
+            <w:r>
+              <w:rPr>
+                <w:rFonts w:ascii="Arial" w:cs="Arial" w:eastAsia="Arial" w:hAnsi="Arial"/>
+                <w:b w:val="1"/>
+                <w:bCs w:val="1"/>
+                <w:sz w:val="18"/>
+                <w:szCs w:val="18"/>
+                <w:rtl w:val="0"/>
+              </w:rPr>
+              <w:t xml:space="preserve">F1</w:t>
+            </w:r>
+          </w:p>
+        </w:tc>
+        <w:tc>
+          <w:tcPr>
+            <w:tcW w:w="1000" w:type="dxa"/>
+          </w:tcPr>
+          <w:p>
+            <w:pPr>
+              <w:jc w:val="center"/>
+              <w:rPr>
+                <w:rFonts w:ascii="Arial" w:cs="Arial" w:eastAsia="Arial" w:hAnsi="Arial"/>
+                <w:sz w:val="18"/>
+                <w:szCs w:val="18"/>
+              </w:rPr>
+            </w:pPr>
+            <w:r>
+              <w:rPr>
+                <w:rFonts w:ascii="Arial" w:cs="Arial" w:eastAsia="Arial" w:hAnsi="Arial"/>
+                <w:b w:val="1"/>
+                <w:bCs w:val="1"/>
+                <w:sz w:val="18"/>
+                <w:szCs w:val="18"/>
+                <w:rtl w:val="0"/>
+              </w:rPr>
+              <w:t xml:space="preserve">Recall</w:t>
+            </w:r>
+          </w:p>
+        </w:tc>
+        <w:tc>
+          <w:tcPr>
+            <w:tcW w:w="1000" w:type="dxa"/>
+          </w:tcPr>
+          <w:p>
+            <w:pPr>
+              <w:jc w:val="center"/>
+              <w:rPr>
+                <w:rFonts w:ascii="Arial" w:cs="Arial" w:eastAsia="Arial" w:hAnsi="Arial"/>
+                <w:sz w:val="18"/>
+                <w:szCs w:val="18"/>
+              </w:rPr>
+            </w:pPr>
+            <w:r>
+              <w:rPr>
+                <w:rFonts w:ascii="Arial" w:cs="Arial" w:eastAsia="Arial" w:hAnsi="Arial"/>
+                <w:b w:val="1"/>
+                <w:bCs w:val="1"/>
+                <w:sz w:val="18"/>
+                <w:szCs w:val="18"/>
+                <w:rtl w:val="0"/>
+              </w:rPr>
+              <w:t xml:space="preserve">Precisão</w:t>
+            </w:r>
+          </w:p>
+        </w:tc>
+        <w:tc>
+          <w:tcPr>
+            <w:tcW w:w="1000" w:type="dxa"/>
+          </w:tcPr>
+          <w:p>
+            <w:pPr>
+              <w:jc w:val="center"/>
+              <w:rPr>
+                <w:rFonts w:ascii="Arial" w:cs="Arial" w:eastAsia="Arial" w:hAnsi="Arial"/>
+                <w:sz w:val="18"/>
+                <w:szCs w:val="18"/>
+              </w:rPr>
+            </w:pPr>
+            <w:r>
+              <w:rPr>
+                <w:rFonts w:ascii="Arial" w:cs="Arial" w:eastAsia="Arial" w:hAnsi="Arial"/>
+                <w:b w:val="1"/>
+                <w:bCs w:val="1"/>
+                <w:sz w:val="18"/>
+                <w:szCs w:val="18"/>
+                <w:rtl w:val="0"/>
+              </w:rPr>
+              <w:t xml:space="preserve">ROC-AUC</w:t>
+            </w:r>
+          </w:p>
+        </w:tc>
+        <w:tc>
+          <w:tcPr>
+            <w:tcW w:w="1500" w:type="dxa"/>
+          </w:tcPr>
+          <w:p>
+            <w:pPr>
+              <w:jc w:val="center"/>
+              <w:rPr>
+                <w:rFonts w:ascii="Arial" w:cs="Arial" w:eastAsia="Arial" w:hAnsi="Arial"/>
+                <w:sz w:val="18"/>
+                <w:szCs w:val="18"/>
+              </w:rPr>
+            </w:pPr>
+            <w:r>
+              <w:rPr>
+                <w:rFonts w:ascii="Arial" w:cs="Arial" w:eastAsia="Arial" w:hAnsi="Arial"/>
+                <w:b w:val="1"/>
+                <w:bCs w:val="1"/>
+                <w:sz w:val="18"/>
+                <w:szCs w:val="18"/>
+                <w:rtl w:val="0"/>
+              </w:rPr>
+              <w:t xml:space="preserve">Dif. de F1 para o 1º</w:t>
+            </w:r>
+          </w:p>
+        </w:tc>
+        <w:tc>
+          <w:tcPr>
+            <w:tcW w:w="1500" w:type="dxa"/>
+          </w:tcPr>
+          <w:p>
+            <w:pPr>
+              <w:jc w:val="center"/>
+              <w:rPr>
+                <w:rFonts w:ascii="Arial" w:cs="Arial" w:eastAsia="Arial" w:hAnsi="Arial"/>
+                <w:sz w:val="18"/>
+                <w:szCs w:val="18"/>
+              </w:rPr>
+            </w:pPr>
+            <w:r>
+              <w:rPr>
+                <w:rFonts w:ascii="Arial" w:cs="Arial" w:eastAsia="Arial" w:hAnsi="Arial"/>
+                <w:b w:val="1"/>
+                <w:bCs w:val="1"/>
+                <w:sz w:val="18"/>
+                <w:szCs w:val="18"/>
+                <w:rtl w:val="0"/>
+              </w:rPr>
+              <w:t xml:space="preserve">Selecionado</w:t>
+            </w:r>
+          </w:p>
+        </w:tc>
+      </w:tr>
+      <w:tr>
+        <w:trPr>
+          <w:cantSplit w:val="0"/>
+          <w:tblHeader w:val="0"/>
+        </w:trPr>
+        <w:tc>
+          <w:tcPr>
+            <w:tcW w:w="2044" w:type="dxa"/>
+          </w:tcPr>
+          <w:p>
+            <w:pPr>
+              <w:jc w:val="left"/>
+              <w:rPr>
+                <w:rFonts w:ascii="Arial" w:cs="Arial" w:eastAsia="Arial" w:hAnsi="Arial"/>
+                <w:sz w:val="18"/>
+                <w:szCs w:val="18"/>
+              </w:rPr>
+            </w:pPr>
+            <w:r>
+              <w:rPr>
+                <w:rFonts w:ascii="Arial" w:cs="Arial" w:eastAsia="Arial" w:hAnsi="Arial"/>
+                <w:sz w:val="18"/>
+                <w:szCs w:val="18"/>
+                <w:rtl w:val="0"/>
+              </w:rPr>
+              <w:t xml:space="preserve">Regressão Logística</w:t>
+            </w:r>
+          </w:p>
+        </w:tc>
+        <w:tc>
+          <w:tcPr>
+            <w:tcW w:w="1700" w:type="dxa"/>
+          </w:tcPr>
+          <w:p>
+            <w:pPr>
+              <w:jc w:val="center"/>
+              <w:rPr>
+                <w:rFonts w:ascii="Arial" w:cs="Arial" w:eastAsia="Arial" w:hAnsi="Arial"/>
+                <w:sz w:val="18"/>
+                <w:szCs w:val="18"/>
+              </w:rPr>
+            </w:pPr>
+            <w:r>
+              <w:rPr>
+                <w:rFonts w:ascii="Arial" w:cs="Arial" w:eastAsia="Arial" w:hAnsi="Arial"/>
+                <w:sz w:val="18"/>
+                <w:szCs w:val="18"/>
+                <w:rtl w:val="0"/>
+              </w:rPr>
+              <w:t xml:space="preserve">0,826 ± 0,059</w:t>
+            </w:r>
+          </w:p>
+        </w:tc>
+        <w:tc>
+          <w:tcPr>
+            <w:tcW w:w="1000" w:type="dxa"/>
+          </w:tcPr>
+          <w:p>
+            <w:pPr>
+              <w:jc w:val="center"/>
+              <w:rPr>
+                <w:rFonts w:ascii="Arial" w:cs="Arial" w:eastAsia="Arial" w:hAnsi="Arial"/>
+                <w:sz w:val="18"/>
+                <w:szCs w:val="18"/>
+              </w:rPr>
+            </w:pPr>
+            <w:r>
+              <w:rPr>
+                <w:rFonts w:ascii="Arial" w:cs="Arial" w:eastAsia="Arial" w:hAnsi="Arial"/>
+                <w:sz w:val="18"/>
+                <w:szCs w:val="18"/>
+                <w:rtl w:val="0"/>
+              </w:rPr>
+              <w:t xml:space="preserve">0,798</w:t>
+            </w:r>
+          </w:p>
+        </w:tc>
+        <w:tc>
+          <w:tcPr>
+            <w:tcW w:w="1000" w:type="dxa"/>
+          </w:tcPr>
+          <w:p>
+            <w:pPr>
+              <w:jc w:val="center"/>
+              <w:rPr>
+                <w:rFonts w:ascii="Arial" w:cs="Arial" w:eastAsia="Arial" w:hAnsi="Arial"/>
+                <w:sz w:val="18"/>
+                <w:szCs w:val="18"/>
+              </w:rPr>
+            </w:pPr>
+            <w:r>
+              <w:rPr>
+                <w:rFonts w:ascii="Arial" w:cs="Arial" w:eastAsia="Arial" w:hAnsi="Arial"/>
+                <w:sz w:val="18"/>
+                <w:szCs w:val="18"/>
+                <w:rtl w:val="0"/>
+              </w:rPr>
+              <w:t xml:space="preserve">0,864</w:t>
+            </w:r>
+          </w:p>
+        </w:tc>
+        <w:tc>
+          <w:tcPr>
+            <w:tcW w:w="1000" w:type="dxa"/>
+          </w:tcPr>
+          <w:p>
+            <w:pPr>
+              <w:jc w:val="center"/>
+              <w:rPr>
+                <w:rFonts w:ascii="Arial" w:cs="Arial" w:eastAsia="Arial" w:hAnsi="Arial"/>
+                <w:sz w:val="18"/>
+                <w:szCs w:val="18"/>
+              </w:rPr>
+            </w:pPr>
+            <w:r>
+              <w:rPr>
+                <w:rFonts w:ascii="Arial" w:cs="Arial" w:eastAsia="Arial" w:hAnsi="Arial"/>
+                <w:sz w:val="18"/>
+                <w:szCs w:val="18"/>
+                <w:rtl w:val="0"/>
+              </w:rPr>
+              <w:t xml:space="preserve">0,909</w:t>
+            </w:r>
+          </w:p>
+        </w:tc>
+        <w:tc>
+          <w:tcPr>
+            <w:tcW w:w="1500" w:type="dxa"/>
+          </w:tcPr>
+          <w:p>
+            <w:pPr>
+              <w:jc w:val="center"/>
+              <w:rPr>
+                <w:rFonts w:ascii="Arial" w:cs="Arial" w:eastAsia="Arial" w:hAnsi="Arial"/>
+                <w:sz w:val="18"/>
+                <w:szCs w:val="18"/>
+              </w:rPr>
+            </w:pPr>
+            <w:r>
+              <w:rPr>
+                <w:rFonts w:ascii="Arial" w:cs="Arial" w:eastAsia="Arial" w:hAnsi="Arial"/>
+                <w:sz w:val="18"/>
+                <w:szCs w:val="18"/>
+                <w:rtl w:val="0"/>
+              </w:rPr>
+              <w:t xml:space="preserve">0,000</w:t>
+            </w:r>
+          </w:p>
+        </w:tc>
+        <w:tc>
+          <w:tcPr>
+            <w:tcW w:w="1500" w:type="dxa"/>
+          </w:tcPr>
+          <w:p>
+            <w:pPr>
+              <w:jc w:val="center"/>
+              <w:rPr>
+                <w:rFonts w:ascii="Arial" w:cs="Arial" w:eastAsia="Arial" w:hAnsi="Arial"/>
+                <w:sz w:val="18"/>
+                <w:szCs w:val="18"/>
+              </w:rPr>
+            </w:pPr>
+            <w:r>
+              <w:rPr>
+                <w:rFonts w:ascii="Arial" w:cs="Arial" w:eastAsia="Arial" w:hAnsi="Arial"/>
+                <w:sz w:val="18"/>
+                <w:szCs w:val="18"/>
+                <w:rtl w:val="0"/>
+              </w:rPr>
+              <w:t xml:space="preserve">sim</w:t>
+            </w:r>
+          </w:p>
+        </w:tc>
+      </w:tr>
+      <w:tr>
+        <w:trPr>
+          <w:cantSplit w:val="0"/>
+          <w:tblHeader w:val="0"/>
+        </w:trPr>
+        <w:tc>
+          <w:tcPr>
+            <w:tcW w:w="2044" w:type="dxa"/>
+          </w:tcPr>
+          <w:p>
+            <w:pPr>
+              <w:jc w:val="left"/>
+              <w:rPr>
+                <w:rFonts w:ascii="Arial" w:cs="Arial" w:eastAsia="Arial" w:hAnsi="Arial"/>
+                <w:sz w:val="18"/>
+                <w:szCs w:val="18"/>
+              </w:rPr>
+            </w:pPr>
+            <w:r>
+              <w:rPr>
+                <w:rFonts w:ascii="Arial" w:cs="Arial" w:eastAsia="Arial" w:hAnsi="Arial"/>
+                <w:sz w:val="18"/>
+                <w:szCs w:val="18"/>
+                <w:rtl w:val="0"/>
+              </w:rPr>
+              <w:t xml:space="preserve">KNN</w:t>
+            </w:r>
+          </w:p>
+        </w:tc>
+        <w:tc>
+          <w:tcPr>
+            <w:tcW w:w="1700" w:type="dxa"/>
+          </w:tcPr>
+          <w:p>
+            <w:pPr>
+              <w:jc w:val="center"/>
+              <w:rPr>
+                <w:rFonts w:ascii="Arial" w:cs="Arial" w:eastAsia="Arial" w:hAnsi="Arial"/>
+                <w:sz w:val="18"/>
+                <w:szCs w:val="18"/>
+              </w:rPr>
+            </w:pPr>
+            <w:r>
+              <w:rPr>
+                <w:rFonts w:ascii="Arial" w:cs="Arial" w:eastAsia="Arial" w:hAnsi="Arial"/>
+                <w:sz w:val="18"/>
+                <w:szCs w:val="18"/>
+                <w:rtl w:val="0"/>
+              </w:rPr>
+              <w:t xml:space="preserve">0,818 ± 0,055</w:t>
+            </w:r>
+          </w:p>
+        </w:tc>
+        <w:tc>
+          <w:tcPr>
+            <w:tcW w:w="1000" w:type="dxa"/>
+          </w:tcPr>
+          <w:p>
+            <w:pPr>
+              <w:jc w:val="center"/>
+              <w:rPr>
+                <w:rFonts w:ascii="Arial" w:cs="Arial" w:eastAsia="Arial" w:hAnsi="Arial"/>
+                <w:sz w:val="18"/>
+                <w:szCs w:val="18"/>
+              </w:rPr>
+            </w:pPr>
+            <w:r>
+              <w:rPr>
+                <w:rFonts w:ascii="Arial" w:cs="Arial" w:eastAsia="Arial" w:hAnsi="Arial"/>
+                <w:sz w:val="18"/>
+                <w:szCs w:val="18"/>
+                <w:rtl w:val="0"/>
+              </w:rPr>
+              <w:t xml:space="preserve">0,808</w:t>
+            </w:r>
+          </w:p>
+        </w:tc>
+        <w:tc>
+          <w:tcPr>
+            <w:tcW w:w="1000" w:type="dxa"/>
+          </w:tcPr>
+          <w:p>
+            <w:pPr>
+              <w:jc w:val="center"/>
+              <w:rPr>
+                <w:rFonts w:ascii="Arial" w:cs="Arial" w:eastAsia="Arial" w:hAnsi="Arial"/>
+                <w:sz w:val="18"/>
+                <w:szCs w:val="18"/>
+              </w:rPr>
+            </w:pPr>
+            <w:r>
+              <w:rPr>
+                <w:rFonts w:ascii="Arial" w:cs="Arial" w:eastAsia="Arial" w:hAnsi="Arial"/>
+                <w:sz w:val="18"/>
+                <w:szCs w:val="18"/>
+                <w:rtl w:val="0"/>
+              </w:rPr>
+              <w:t xml:space="preserve">0,833</w:t>
+            </w:r>
+          </w:p>
+        </w:tc>
+        <w:tc>
+          <w:tcPr>
+            <w:tcW w:w="1000" w:type="dxa"/>
+          </w:tcPr>
+          <w:p>
+            <w:pPr>
+              <w:jc w:val="center"/>
+              <w:rPr>
+                <w:rFonts w:ascii="Arial" w:cs="Arial" w:eastAsia="Arial" w:hAnsi="Arial"/>
+                <w:sz w:val="18"/>
+                <w:szCs w:val="18"/>
+              </w:rPr>
+            </w:pPr>
+            <w:r>
+              <w:rPr>
+                <w:rFonts w:ascii="Arial" w:cs="Arial" w:eastAsia="Arial" w:hAnsi="Arial"/>
+                <w:sz w:val="18"/>
+                <w:szCs w:val="18"/>
+                <w:rtl w:val="0"/>
+              </w:rPr>
+              <w:t xml:space="preserve">0,872</w:t>
+            </w:r>
+          </w:p>
+        </w:tc>
+        <w:tc>
+          <w:tcPr>
+            <w:tcW w:w="1500" w:type="dxa"/>
+          </w:tcPr>
+          <w:p>
+            <w:pPr>
+              <w:jc w:val="center"/>
+              <w:rPr>
+                <w:rFonts w:ascii="Arial" w:cs="Arial" w:eastAsia="Arial" w:hAnsi="Arial"/>
+                <w:sz w:val="18"/>
+                <w:szCs w:val="18"/>
+              </w:rPr>
+            </w:pPr>
+            <w:r>
+              <w:rPr>
+                <w:rFonts w:ascii="Arial" w:cs="Arial" w:eastAsia="Arial" w:hAnsi="Arial"/>
+                <w:sz w:val="18"/>
+                <w:szCs w:val="18"/>
+                <w:rtl w:val="0"/>
+              </w:rPr>
+              <w:t xml:space="preserve">0,008</w:t>
+            </w:r>
+          </w:p>
+        </w:tc>
+        <w:tc>
+          <w:tcPr>
+            <w:tcW w:w="1500" w:type="dxa"/>
+          </w:tcPr>
+          <w:p>
+            <w:pPr>
+              <w:jc w:val="center"/>
+              <w:rPr>
+                <w:rFonts w:ascii="Arial" w:cs="Arial" w:eastAsia="Arial" w:hAnsi="Arial"/>
+                <w:sz w:val="18"/>
+                <w:szCs w:val="18"/>
+              </w:rPr>
+            </w:pPr>
+            <w:r>
+              <w:rPr>
+                <w:rFonts w:ascii="Arial" w:cs="Arial" w:eastAsia="Arial" w:hAnsi="Arial"/>
+                <w:sz w:val="18"/>
+                <w:szCs w:val="18"/>
+                <w:rtl w:val="0"/>
+              </w:rPr>
+              <w:t xml:space="preserve">sim</w:t>
+            </w:r>
+          </w:p>
+        </w:tc>
+      </w:tr>
+      <w:tr>
+        <w:trPr>
+          <w:cantSplit w:val="0"/>
+          <w:tblHeader w:val="0"/>
+        </w:trPr>
+        <w:tc>
+          <w:tcPr>
+            <w:tcW w:w="2044" w:type="dxa"/>
+          </w:tcPr>
+          <w:p>
+            <w:pPr>
+              <w:jc w:val="left"/>
+              <w:rPr>
+                <w:rFonts w:ascii="Arial" w:cs="Arial" w:eastAsia="Arial" w:hAnsi="Arial"/>
+                <w:sz w:val="18"/>
+                <w:szCs w:val="18"/>
+              </w:rPr>
+            </w:pPr>
+            <w:r>
+              <w:rPr>
+                <w:rFonts w:ascii="Arial" w:cs="Arial" w:eastAsia="Arial" w:hAnsi="Arial"/>
+                <w:sz w:val="18"/>
+                <w:szCs w:val="18"/>
+                <w:rtl w:val="0"/>
+              </w:rPr>
+              <w:t xml:space="preserve">Random Forest</w:t>
+            </w:r>
+          </w:p>
+        </w:tc>
+        <w:tc>
+          <w:tcPr>
+            <w:tcW w:w="1700" w:type="dxa"/>
+          </w:tcPr>
+          <w:p>
+            <w:pPr>
+              <w:jc w:val="center"/>
+              <w:rPr>
+                <w:rFonts w:ascii="Arial" w:cs="Arial" w:eastAsia="Arial" w:hAnsi="Arial"/>
+                <w:sz w:val="18"/>
+                <w:szCs w:val="18"/>
+              </w:rPr>
+            </w:pPr>
+            <w:r>
+              <w:rPr>
+                <w:rFonts w:ascii="Arial" w:cs="Arial" w:eastAsia="Arial" w:hAnsi="Arial"/>
+                <w:sz w:val="18"/>
+                <w:szCs w:val="18"/>
+                <w:rtl w:val="0"/>
+              </w:rPr>
+              <w:t xml:space="preserve">0,809 ± 0,053</w:t>
+            </w:r>
+          </w:p>
+        </w:tc>
+        <w:tc>
+          <w:tcPr>
+            <w:tcW w:w="1000" w:type="dxa"/>
+          </w:tcPr>
+          <w:p>
+            <w:pPr>
+              <w:jc w:val="center"/>
+              <w:rPr>
+                <w:rFonts w:ascii="Arial" w:cs="Arial" w:eastAsia="Arial" w:hAnsi="Arial"/>
+                <w:sz w:val="18"/>
+                <w:szCs w:val="18"/>
+              </w:rPr>
+            </w:pPr>
+            <w:r>
+              <w:rPr>
+                <w:rFonts w:ascii="Arial" w:cs="Arial" w:eastAsia="Arial" w:hAnsi="Arial"/>
+                <w:sz w:val="18"/>
+                <w:szCs w:val="18"/>
+                <w:rtl w:val="0"/>
+              </w:rPr>
+              <w:t xml:space="preserve">0,796</w:t>
+            </w:r>
+          </w:p>
+        </w:tc>
+        <w:tc>
+          <w:tcPr>
+            <w:tcW w:w="1000" w:type="dxa"/>
+          </w:tcPr>
+          <w:p>
+            <w:pPr>
+              <w:jc w:val="center"/>
+              <w:rPr>
+                <w:rFonts w:ascii="Arial" w:cs="Arial" w:eastAsia="Arial" w:hAnsi="Arial"/>
+                <w:sz w:val="18"/>
+                <w:szCs w:val="18"/>
+              </w:rPr>
+            </w:pPr>
+            <w:r>
+              <w:rPr>
+                <w:rFonts w:ascii="Arial" w:cs="Arial" w:eastAsia="Arial" w:hAnsi="Arial"/>
+                <w:sz w:val="18"/>
+                <w:szCs w:val="18"/>
+                <w:rtl w:val="0"/>
+              </w:rPr>
+              <w:t xml:space="preserve">0,830</w:t>
+            </w:r>
+          </w:p>
+        </w:tc>
+        <w:tc>
+          <w:tcPr>
+            <w:tcW w:w="1000" w:type="dxa"/>
+          </w:tcPr>
+          <w:p>
+            <w:pPr>
+              <w:jc w:val="center"/>
+              <w:rPr>
+                <w:rFonts w:ascii="Arial" w:cs="Arial" w:eastAsia="Arial" w:hAnsi="Arial"/>
+                <w:sz w:val="18"/>
+                <w:szCs w:val="18"/>
+              </w:rPr>
+            </w:pPr>
+            <w:r>
+              <w:rPr>
+                <w:rFonts w:ascii="Arial" w:cs="Arial" w:eastAsia="Arial" w:hAnsi="Arial"/>
+                <w:sz w:val="18"/>
+                <w:szCs w:val="18"/>
+                <w:rtl w:val="0"/>
+              </w:rPr>
+              <w:t xml:space="preserve">0,904</w:t>
+            </w:r>
+          </w:p>
+        </w:tc>
+        <w:tc>
+          <w:tcPr>
+            <w:tcW w:w="1500" w:type="dxa"/>
+          </w:tcPr>
+          <w:p>
+            <w:pPr>
+              <w:jc w:val="center"/>
+              <w:rPr>
+                <w:rFonts w:ascii="Arial" w:cs="Arial" w:eastAsia="Arial" w:hAnsi="Arial"/>
+                <w:sz w:val="18"/>
+                <w:szCs w:val="18"/>
+              </w:rPr>
+            </w:pPr>
+            <w:r>
+              <w:rPr>
+                <w:rFonts w:ascii="Arial" w:cs="Arial" w:eastAsia="Arial" w:hAnsi="Arial"/>
+                <w:sz w:val="18"/>
+                <w:szCs w:val="18"/>
+                <w:rtl w:val="0"/>
+              </w:rPr>
+              <w:t xml:space="preserve">0,016</w:t>
+            </w:r>
+          </w:p>
+        </w:tc>
+        <w:tc>
+          <w:tcPr>
+            <w:tcW w:w="1500" w:type="dxa"/>
+          </w:tcPr>
+          <w:p>
+            <w:pPr>
+              <w:jc w:val="center"/>
+              <w:rPr>
+                <w:rFonts w:ascii="Arial" w:cs="Arial" w:eastAsia="Arial" w:hAnsi="Arial"/>
+                <w:sz w:val="18"/>
+                <w:szCs w:val="18"/>
+              </w:rPr>
+            </w:pPr>
+            <w:r>
+              <w:rPr>
+                <w:rFonts w:ascii="Arial" w:cs="Arial" w:eastAsia="Arial" w:hAnsi="Arial"/>
+                <w:sz w:val="18"/>
+                <w:szCs w:val="18"/>
+                <w:rtl w:val="0"/>
+              </w:rPr>
+              <w:t xml:space="preserve">sim</w:t>
+            </w:r>
+          </w:p>
+        </w:tc>
+      </w:tr>
+      <w:tr>
+        <w:trPr>
+          <w:cantSplit w:val="0"/>
+          <w:tblHeader w:val="0"/>
+        </w:trPr>
+        <w:tc>
+          <w:tcPr>
+            <w:tcW w:w="2044" w:type="dxa"/>
+          </w:tcPr>
+          <w:p>
+            <w:pPr>
+              <w:jc w:val="left"/>
+              <w:rPr>
+                <w:rFonts w:ascii="Arial" w:cs="Arial" w:eastAsia="Arial" w:hAnsi="Arial"/>
+                <w:sz w:val="18"/>
+                <w:szCs w:val="18"/>
+              </w:rPr>
+            </w:pPr>
+            <w:r>
+              <w:rPr>
+                <w:rFonts w:ascii="Arial" w:cs="Arial" w:eastAsia="Arial" w:hAnsi="Arial"/>
+                <w:sz w:val="18"/>
+                <w:szCs w:val="18"/>
+                <w:rtl w:val="0"/>
+              </w:rPr>
+              <w:t xml:space="preserve">Gradient Boosting</w:t>
+            </w:r>
+          </w:p>
+        </w:tc>
+        <w:tc>
+          <w:tcPr>
+            <w:tcW w:w="1700" w:type="dxa"/>
+          </w:tcPr>
+          <w:p>
+            <w:pPr>
+              <w:jc w:val="center"/>
+              <w:rPr>
+                <w:rFonts w:ascii="Arial" w:cs="Arial" w:eastAsia="Arial" w:hAnsi="Arial"/>
+                <w:sz w:val="18"/>
+                <w:szCs w:val="18"/>
+              </w:rPr>
+            </w:pPr>
+            <w:r>
+              <w:rPr>
+                <w:rFonts w:ascii="Arial" w:cs="Arial" w:eastAsia="Arial" w:hAnsi="Arial"/>
+                <w:sz w:val="18"/>
+                <w:szCs w:val="18"/>
+                <w:rtl w:val="0"/>
+              </w:rPr>
+              <w:t xml:space="preserve">0,781 ± 0,053</w:t>
+            </w:r>
+          </w:p>
+        </w:tc>
+        <w:tc>
+          <w:tcPr>
+            <w:tcW w:w="1000" w:type="dxa"/>
+          </w:tcPr>
+          <w:p>
+            <w:pPr>
+              <w:jc w:val="center"/>
+              <w:rPr>
+                <w:rFonts w:ascii="Arial" w:cs="Arial" w:eastAsia="Arial" w:hAnsi="Arial"/>
+                <w:sz w:val="18"/>
+                <w:szCs w:val="18"/>
+              </w:rPr>
+            </w:pPr>
+            <w:r>
+              <w:rPr>
+                <w:rFonts w:ascii="Arial" w:cs="Arial" w:eastAsia="Arial" w:hAnsi="Arial"/>
+                <w:sz w:val="18"/>
+                <w:szCs w:val="18"/>
+                <w:rtl w:val="0"/>
+              </w:rPr>
+              <w:t xml:space="preserve">0,782</w:t>
+            </w:r>
+          </w:p>
+        </w:tc>
+        <w:tc>
+          <w:tcPr>
+            <w:tcW w:w="1000" w:type="dxa"/>
+          </w:tcPr>
+          <w:p>
+            <w:pPr>
+              <w:jc w:val="center"/>
+              <w:rPr>
+                <w:rFonts w:ascii="Arial" w:cs="Arial" w:eastAsia="Arial" w:hAnsi="Arial"/>
+                <w:sz w:val="18"/>
+                <w:szCs w:val="18"/>
+              </w:rPr>
+            </w:pPr>
+            <w:r>
+              <w:rPr>
+                <w:rFonts w:ascii="Arial" w:cs="Arial" w:eastAsia="Arial" w:hAnsi="Arial"/>
+                <w:sz w:val="18"/>
+                <w:szCs w:val="18"/>
+                <w:rtl w:val="0"/>
+              </w:rPr>
+              <w:t xml:space="preserve">0,786</w:t>
+            </w:r>
+          </w:p>
+        </w:tc>
+        <w:tc>
+          <w:tcPr>
+            <w:tcW w:w="1000" w:type="dxa"/>
+          </w:tcPr>
+          <w:p>
+            <w:pPr>
+              <w:jc w:val="center"/>
+              <w:rPr>
+                <w:rFonts w:ascii="Arial" w:cs="Arial" w:eastAsia="Arial" w:hAnsi="Arial"/>
+                <w:sz w:val="18"/>
+                <w:szCs w:val="18"/>
+              </w:rPr>
+            </w:pPr>
+            <w:r>
+              <w:rPr>
+                <w:rFonts w:ascii="Arial" w:cs="Arial" w:eastAsia="Arial" w:hAnsi="Arial"/>
+                <w:sz w:val="18"/>
+                <w:szCs w:val="18"/>
+                <w:rtl w:val="0"/>
+              </w:rPr>
+              <w:t xml:space="preserve">0,878</w:t>
+            </w:r>
+          </w:p>
+        </w:tc>
+        <w:tc>
+          <w:tcPr>
+            <w:tcW w:w="1500" w:type="dxa"/>
+          </w:tcPr>
+          <w:p>
+            <w:pPr>
+              <w:jc w:val="center"/>
+              <w:rPr>
+                <w:rFonts w:ascii="Arial" w:cs="Arial" w:eastAsia="Arial" w:hAnsi="Arial"/>
+                <w:sz w:val="18"/>
+                <w:szCs w:val="18"/>
+              </w:rPr>
+            </w:pPr>
+            <w:r>
+              <w:rPr>
+                <w:rFonts w:ascii="Arial" w:cs="Arial" w:eastAsia="Arial" w:hAnsi="Arial"/>
+                <w:sz w:val="18"/>
+                <w:szCs w:val="18"/>
+                <w:rtl w:val="0"/>
+              </w:rPr>
+              <w:t xml:space="preserve">0,045</w:t>
+            </w:r>
+          </w:p>
+        </w:tc>
+        <w:tc>
+          <w:tcPr>
+            <w:tcW w:w="1500" w:type="dxa"/>
+          </w:tcPr>
+          <w:p>
+            <w:pPr>
+              <w:jc w:val="center"/>
+              <w:rPr>
+                <w:rFonts w:ascii="Arial" w:cs="Arial" w:eastAsia="Arial" w:hAnsi="Arial"/>
+                <w:sz w:val="18"/>
+                <w:szCs w:val="18"/>
+              </w:rPr>
+            </w:pPr>
+            <w:r>
+              <w:rPr>
+                <w:rFonts w:ascii="Arial" w:cs="Arial" w:eastAsia="Arial" w:hAnsi="Arial"/>
+                <w:sz w:val="18"/>
+                <w:szCs w:val="18"/>
+                <w:rtl w:val="0"/>
+              </w:rPr>
+              <w:t xml:space="preserve">não</w:t>
+            </w:r>
+          </w:p>
+        </w:tc>
+      </w:tr>
+      <w:tr>
+        <w:trPr>
+          <w:cantSplit w:val="0"/>
+          <w:tblHeader w:val="0"/>
+        </w:trPr>
+        <w:tc>
+          <w:tcPr>
+            <w:tcW w:w="2044" w:type="dxa"/>
+          </w:tcPr>
+          <w:p>
+            <w:pPr>
+              <w:jc w:val="left"/>
+              <w:rPr>
+                <w:rFonts w:ascii="Arial" w:cs="Arial" w:eastAsia="Arial" w:hAnsi="Arial"/>
+                <w:sz w:val="18"/>
+                <w:szCs w:val="18"/>
+              </w:rPr>
+            </w:pPr>
+            <w:r>
+              <w:rPr>
+                <w:rFonts w:ascii="Arial" w:cs="Arial" w:eastAsia="Arial" w:hAnsi="Arial"/>
+                <w:sz w:val="18"/>
+                <w:szCs w:val="18"/>
+                <w:rtl w:val="0"/>
+              </w:rPr>
+              <w:t xml:space="preserve">Rede Neural (MLP)</w:t>
+            </w:r>
+          </w:p>
+        </w:tc>
+        <w:tc>
+          <w:tcPr>
+            <w:tcW w:w="1700" w:type="dxa"/>
+          </w:tcPr>
+          <w:p>
+            <w:pPr>
+              <w:jc w:val="center"/>
+              <w:rPr>
+                <w:rFonts w:ascii="Arial" w:cs="Arial" w:eastAsia="Arial" w:hAnsi="Arial"/>
+                <w:sz w:val="18"/>
+                <w:szCs w:val="18"/>
+              </w:rPr>
+            </w:pPr>
+            <w:r>
+              <w:rPr>
+                <w:rFonts w:ascii="Arial" w:cs="Arial" w:eastAsia="Arial" w:hAnsi="Arial"/>
+                <w:sz w:val="18"/>
+                <w:szCs w:val="18"/>
+                <w:rtl w:val="0"/>
+              </w:rPr>
+              <w:t xml:space="preserve">0,773 ± 0,062</w:t>
+            </w:r>
+          </w:p>
+        </w:tc>
+        <w:tc>
+          <w:tcPr>
+            <w:tcW w:w="1000" w:type="dxa"/>
+          </w:tcPr>
+          <w:p>
+            <w:pPr>
+              <w:jc w:val="center"/>
+              <w:rPr>
+                <w:rFonts w:ascii="Arial" w:cs="Arial" w:eastAsia="Arial" w:hAnsi="Arial"/>
+                <w:sz w:val="18"/>
+                <w:szCs w:val="18"/>
+              </w:rPr>
+            </w:pPr>
+            <w:r>
+              <w:rPr>
+                <w:rFonts w:ascii="Arial" w:cs="Arial" w:eastAsia="Arial" w:hAnsi="Arial"/>
+                <w:sz w:val="18"/>
+                <w:szCs w:val="18"/>
+                <w:rtl w:val="0"/>
+              </w:rPr>
+              <w:t xml:space="preserve">0,756</w:t>
+            </w:r>
+          </w:p>
+        </w:tc>
+        <w:tc>
+          <w:tcPr>
+            <w:tcW w:w="1000" w:type="dxa"/>
+          </w:tcPr>
+          <w:p>
+            <w:pPr>
+              <w:jc w:val="center"/>
+              <w:rPr>
+                <w:rFonts w:ascii="Arial" w:cs="Arial" w:eastAsia="Arial" w:hAnsi="Arial"/>
+                <w:sz w:val="18"/>
+                <w:szCs w:val="18"/>
+              </w:rPr>
+            </w:pPr>
+            <w:r>
+              <w:rPr>
+                <w:rFonts w:ascii="Arial" w:cs="Arial" w:eastAsia="Arial" w:hAnsi="Arial"/>
+                <w:sz w:val="18"/>
+                <w:szCs w:val="18"/>
+                <w:rtl w:val="0"/>
+              </w:rPr>
+              <w:t xml:space="preserve">0,801</w:t>
+            </w:r>
+          </w:p>
+        </w:tc>
+        <w:tc>
+          <w:tcPr>
+            <w:tcW w:w="1000" w:type="dxa"/>
+          </w:tcPr>
+          <w:p>
+            <w:pPr>
+              <w:jc w:val="center"/>
+              <w:rPr>
+                <w:rFonts w:ascii="Arial" w:cs="Arial" w:eastAsia="Arial" w:hAnsi="Arial"/>
+                <w:sz w:val="18"/>
+                <w:szCs w:val="18"/>
+              </w:rPr>
+            </w:pPr>
+            <w:r>
+              <w:rPr>
+                <w:rFonts w:ascii="Arial" w:cs="Arial" w:eastAsia="Arial" w:hAnsi="Arial"/>
+                <w:sz w:val="18"/>
+                <w:szCs w:val="18"/>
+                <w:rtl w:val="0"/>
+              </w:rPr>
+              <w:t xml:space="preserve">0,867</w:t>
+            </w:r>
+          </w:p>
+        </w:tc>
+        <w:tc>
+          <w:tcPr>
+            <w:tcW w:w="1500" w:type="dxa"/>
+          </w:tcPr>
+          <w:p>
+            <w:pPr>
+              <w:jc w:val="center"/>
+              <w:rPr>
+                <w:rFonts w:ascii="Arial" w:cs="Arial" w:eastAsia="Arial" w:hAnsi="Arial"/>
+                <w:sz w:val="18"/>
+                <w:szCs w:val="18"/>
+              </w:rPr>
+            </w:pPr>
+            <w:r>
+              <w:rPr>
+                <w:rFonts w:ascii="Arial" w:cs="Arial" w:eastAsia="Arial" w:hAnsi="Arial"/>
+                <w:sz w:val="18"/>
+                <w:szCs w:val="18"/>
+                <w:rtl w:val="0"/>
+              </w:rPr>
+              <w:t xml:space="preserve">0,053</w:t>
+            </w:r>
+          </w:p>
+        </w:tc>
+        <w:tc>
+          <w:tcPr>
+            <w:tcW w:w="1500" w:type="dxa"/>
+          </w:tcPr>
+          <w:p>
+            <w:pPr>
+              <w:jc w:val="center"/>
+              <w:rPr>
+                <w:rFonts w:ascii="Arial" w:cs="Arial" w:eastAsia="Arial" w:hAnsi="Arial"/>
+                <w:sz w:val="18"/>
+                <w:szCs w:val="18"/>
+              </w:rPr>
+            </w:pPr>
+            <w:r>
+              <w:rPr>
+                <w:rFonts w:ascii="Arial" w:cs="Arial" w:eastAsia="Arial" w:hAnsi="Arial"/>
+                <w:sz w:val="18"/>
+                <w:szCs w:val="18"/>
+                <w:rtl w:val="0"/>
+              </w:rPr>
+              <w:t xml:space="preserve">não</w:t>
+            </w:r>
+          </w:p>
+        </w:tc>
+      </w:tr>
+      <w:tr>
+        <w:trPr>
+          <w:cantSplit w:val="0"/>
+          <w:tblHeader w:val="0"/>
+        </w:trPr>
+        <w:tc>
+          <w:tcPr>
+            <w:tcW w:w="2044" w:type="dxa"/>
+          </w:tcPr>
+          <w:p>
+            <w:pPr>
+              <w:jc w:val="left"/>
+              <w:rPr>
+                <w:rFonts w:ascii="Arial" w:cs="Arial" w:eastAsia="Arial" w:hAnsi="Arial"/>
+                <w:sz w:val="18"/>
+                <w:szCs w:val="18"/>
+              </w:rPr>
+            </w:pPr>
+            <w:r>
+              <w:rPr>
+                <w:rFonts w:ascii="Arial" w:cs="Arial" w:eastAsia="Arial" w:hAnsi="Arial"/>
+                <w:sz w:val="18"/>
+                <w:szCs w:val="18"/>
+                <w:rtl w:val="0"/>
+              </w:rPr>
+              <w:t xml:space="preserve">Árvore de Decisão</w:t>
+            </w:r>
+          </w:p>
+        </w:tc>
+        <w:tc>
+          <w:tcPr>
+            <w:tcW w:w="1700" w:type="dxa"/>
+          </w:tcPr>
+          <w:p>
+            <w:pPr>
+              <w:jc w:val="center"/>
+              <w:rPr>
+                <w:rFonts w:ascii="Arial" w:cs="Arial" w:eastAsia="Arial" w:hAnsi="Arial"/>
+                <w:sz w:val="18"/>
+                <w:szCs w:val="18"/>
+              </w:rPr>
+            </w:pPr>
+            <w:r>
+              <w:rPr>
+                <w:rFonts w:ascii="Arial" w:cs="Arial" w:eastAsia="Arial" w:hAnsi="Arial"/>
+                <w:sz w:val="18"/>
+                <w:szCs w:val="18"/>
+                <w:rtl w:val="0"/>
+              </w:rPr>
+              <w:t xml:space="preserve">0,729 ± 0,056</w:t>
+            </w:r>
+          </w:p>
+        </w:tc>
+        <w:tc>
+          <w:tcPr>
+            <w:tcW w:w="1000" w:type="dxa"/>
+          </w:tcPr>
+          <w:p>
+            <w:pPr>
+              <w:jc w:val="center"/>
+              <w:rPr>
+                <w:rFonts w:ascii="Arial" w:cs="Arial" w:eastAsia="Arial" w:hAnsi="Arial"/>
+                <w:sz w:val="18"/>
+                <w:szCs w:val="18"/>
+              </w:rPr>
+            </w:pPr>
+            <w:r>
+              <w:rPr>
+                <w:rFonts w:ascii="Arial" w:cs="Arial" w:eastAsia="Arial" w:hAnsi="Arial"/>
+                <w:sz w:val="18"/>
+                <w:szCs w:val="18"/>
+                <w:rtl w:val="0"/>
+              </w:rPr>
+              <w:t xml:space="preserve">0,740</w:t>
+            </w:r>
+          </w:p>
+        </w:tc>
+        <w:tc>
+          <w:tcPr>
+            <w:tcW w:w="1000" w:type="dxa"/>
+          </w:tcPr>
+          <w:p>
+            <w:pPr>
+              <w:jc w:val="center"/>
+              <w:rPr>
+                <w:rFonts w:ascii="Arial" w:cs="Arial" w:eastAsia="Arial" w:hAnsi="Arial"/>
+                <w:sz w:val="18"/>
+                <w:szCs w:val="18"/>
+              </w:rPr>
+            </w:pPr>
+            <w:r>
+              <w:rPr>
+                <w:rFonts w:ascii="Arial" w:cs="Arial" w:eastAsia="Arial" w:hAnsi="Arial"/>
+                <w:sz w:val="18"/>
+                <w:szCs w:val="18"/>
+                <w:rtl w:val="0"/>
+              </w:rPr>
+              <w:t xml:space="preserve">0,725</w:t>
+            </w:r>
+          </w:p>
+        </w:tc>
+        <w:tc>
+          <w:tcPr>
+            <w:tcW w:w="1000" w:type="dxa"/>
+          </w:tcPr>
+          <w:p>
+            <w:pPr>
+              <w:jc w:val="center"/>
+              <w:rPr>
+                <w:rFonts w:ascii="Arial" w:cs="Arial" w:eastAsia="Arial" w:hAnsi="Arial"/>
+                <w:sz w:val="18"/>
+                <w:szCs w:val="18"/>
+              </w:rPr>
+            </w:pPr>
+            <w:r>
+              <w:rPr>
+                <w:rFonts w:ascii="Arial" w:cs="Arial" w:eastAsia="Arial" w:hAnsi="Arial"/>
+                <w:sz w:val="18"/>
+                <w:szCs w:val="18"/>
+                <w:rtl w:val="0"/>
+              </w:rPr>
+              <w:t xml:space="preserve">0,749</w:t>
+            </w:r>
+          </w:p>
+        </w:tc>
+        <w:tc>
+          <w:tcPr>
+            <w:tcW w:w="1500" w:type="dxa"/>
+          </w:tcPr>
+          <w:p>
+            <w:pPr>
+              <w:jc w:val="center"/>
+              <w:rPr>
+                <w:rFonts w:ascii="Arial" w:cs="Arial" w:eastAsia="Arial" w:hAnsi="Arial"/>
+                <w:sz w:val="18"/>
+                <w:szCs w:val="18"/>
+              </w:rPr>
+            </w:pPr>
+            <w:r>
+              <w:rPr>
+                <w:rFonts w:ascii="Arial" w:cs="Arial" w:eastAsia="Arial" w:hAnsi="Arial"/>
+                <w:sz w:val="18"/>
+                <w:szCs w:val="18"/>
+                <w:rtl w:val="0"/>
+              </w:rPr>
+              <w:t xml:space="preserve">0,097</w:t>
+            </w:r>
+          </w:p>
+        </w:tc>
+        <w:tc>
+          <w:tcPr>
+            <w:tcW w:w="1500" w:type="dxa"/>
+          </w:tcPr>
+          <w:p>
+            <w:pPr>
+              <w:jc w:val="center"/>
+              <w:rPr>
+                <w:rFonts w:ascii="Arial" w:cs="Arial" w:eastAsia="Arial" w:hAnsi="Arial"/>
+                <w:sz w:val="18"/>
+                <w:szCs w:val="18"/>
+              </w:rPr>
+            </w:pPr>
+            <w:r>
+              <w:rPr>
+                <w:rFonts w:ascii="Arial" w:cs="Arial" w:eastAsia="Arial" w:hAnsi="Arial"/>
+                <w:sz w:val="18"/>
+                <w:szCs w:val="18"/>
+                <w:rtl w:val="0"/>
+              </w:rPr>
+              <w:t xml:space="preserve">não</w:t>
+            </w:r>
+          </w:p>
+        </w:tc>
+      </w:tr>
+    </w:tbl>
+    <w:p>
+      <w:pPr>
+        <w:jc w:val="both"/>
+        <w:rPr>
+          <w:rFonts w:ascii="Arial" w:cs="Arial" w:eastAsia="Arial" w:hAnsi="Arial"/>
+          <w:sz w:val="18"/>
+          <w:szCs w:val="18"/>
+        </w:rPr>
+      </w:pPr>
+      <w:r>
+        <w:rPr>
+          <w:rFonts w:ascii="Arial" w:cs="Arial" w:eastAsia="Arial" w:hAnsi="Arial"/>
+          <w:sz w:val="18"/>
+          <w:szCs w:val="18"/>
+          <w:rtl w:val="0"/>
+        </w:rPr>
+        <w:t xml:space="preserve">Médias nas 50 avaliações (5 folds × 10 repetições); F1 com desvio padrão. Classe positiva: com doença.</w:t>
+      </w:r>
+    </w:p>
+    <w:p>
+      <w:pPr>
+        <w:jc w:val="center"/>
+      </w:pPr>
+      <w:r>
+        <w:drawing>
+          <wp:inline distT="0" distB="0" distL="0" distR="0">
+            <wp:extent cx="5486400" cy="2698595"/>
+            <wp:docPr id="902" name="Gráfico seleção"/>
+            <wp:cNvGraphicFramePr>
+              <a:graphicFrameLocks noChangeAspect="1"/>
+            </wp:cNvGraphicFramePr>
+            <a:graphic>
+              <a:graphicData uri="http://schemas.openxmlformats.org/drawingml/2006/picture">
+                <pic:pic>
+                  <pic:nvPicPr>
+                    <pic:cNvPr id="902" name="grafico_selecao.png"/>
+                    <pic:cNvPicPr/>
+                  </pic:nvPicPr>
+                  <pic:blipFill>
+                    <a:blip r:embed="rIdGraficoSelecao"/>
+                    <a:stretch>
+                      <a:fillRect/>
+                    </a:stretch>
+                  </pic:blipFill>
+                  <pic:spPr>
+                    <a:xfrm>
+                      <a:off x="0" y="0"/>
+                      <a:ext cx="5486400" cy="2698595"/>
+                    </a:xfrm>
+                    <a:prstGeom prst="rect">
+                      <a:avLst/>
+                    </a:prstGeom>
+                  </pic:spPr>
+                </pic:pic>
+              </a:graphicData>
+            </a:graphic>
+          </wp:inline>
+        </w:drawing>
+      </w:r>
+    </w:p>
+    <w:p>
+      <w:pPr>
+        <w:jc w:val="center"/>
+        <w:rPr>
+          <w:rFonts w:ascii="Arial" w:cs="Arial" w:eastAsia="Arial" w:hAnsi="Arial"/>
+          <w:sz w:val="18"/>
+          <w:szCs w:val="18"/>
+        </w:rPr>
+      </w:pPr>
+      <w:r>
+        <w:rPr>
+          <w:rFonts w:ascii="Arial" w:cs="Arial" w:eastAsia="Arial" w:hAnsi="Arial"/>
+          <w:sz w:val="18"/>
+          <w:szCs w:val="18"/>
+          <w:rtl w:val="0"/>
+        </w:rPr>
+        <w:t xml:space="preserve">F1 nas 50 avaliações de cada algoritmo, com os modelos selecionados para o T2 destacados; o losango indica a média.</w:t>
+      </w:r>
+    </w:p>
+    <w:p>
+      <w:pPr>
         <w:pStyle w:val="Heading1"/>
         <w:jc w:val="both"/>
         <w:rPr>
@@ -3056,6 +5984,25 @@
           <w:rtl w:val="0"/>
         </w:rPr>
         <w:t xml:space="preserve">Quando o uso de IA Generativa tiver contribuído de forma relevante para o desenvolvimento do trabalho, isso deve ser informado neste relatório, conforme as orientações da disciplina.</w:t>
+      </w:r>
+    </w:p>
+    <w:p>
+      <w:pPr>
+        <w:jc w:val="both"/>
+        <w:rPr>
+          <w:rFonts w:ascii="Arial" w:cs="Arial" w:eastAsia="Arial" w:hAnsi="Arial"/>
+          <w:sz w:val="22"/>
+          <w:szCs w:val="22"/>
+        </w:rPr>
+      </w:pPr>
+      <w:r>
+        <w:rPr>
+          <w:rFonts w:ascii="Arial" w:cs="Arial" w:eastAsia="Arial" w:hAnsi="Arial"/>
+          <w:sz w:val="22"/>
+          <w:szCs w:val="22"/>
+          <w:rtl w:val="0"/>
+        </w:rPr>
+        <w:t xml:space="preserve">Utilizamos o Claude (Anthropic, 2026), por meio do Claude Code, como apoio: na análise exploratória e na geração de gráficos; na verificação da codificação do dataset do Kaggle em relação à base original da UCI; em sugestões de pré-processamento, métricas e protocolo de validação; na geração do código do notebook; e na estruturação e redação de rascunhos das seções descritivas deste relatório, revisados pelo grupo. As decisões metodológicas (algoritmos, métrica principal, estratégia de validação e seleção dos modelos para o T2) foram tomadas pelo grupo, e a interpretação dos resultados é de nossa autoria.</w:t>
       </w:r>
     </w:p>
     <w:p>
@@ -3089,6 +6036,120 @@
           <w:rtl w:val="0"/>
         </w:rPr>
         <w:t xml:space="preserve">Cite as referências utilizadas no desenvolvimento do trabalho.</w:t>
+      </w:r>
+    </w:p>
+    <w:p>
+      <w:pPr>
+        <w:jc w:val="left"/>
+        <w:rPr>
+          <w:rFonts w:ascii="Arial" w:cs="Arial" w:eastAsia="Arial" w:hAnsi="Arial"/>
+          <w:sz w:val="22"/>
+          <w:szCs w:val="22"/>
+        </w:rPr>
+      </w:pPr>
+      <w:r>
+        <w:rPr>
+          <w:rFonts w:ascii="Arial" w:cs="Arial" w:eastAsia="Arial" w:hAnsi="Arial"/>
+          <w:sz w:val="22"/>
+          <w:szCs w:val="22"/>
+          <w:rtl w:val="0"/>
+        </w:rPr>
+        <w:t xml:space="preserve">Anthropic. (2026). Claude (Opus 5.5) [Large language model]. Claude Code. https://www.anthropic.com/claude-code</w:t>
+      </w:r>
+    </w:p>
+    <w:p>
+      <w:pPr>
+        <w:jc w:val="left"/>
+        <w:rPr>
+          <w:rFonts w:ascii="Arial" w:cs="Arial" w:eastAsia="Arial" w:hAnsi="Arial"/>
+          <w:sz w:val="22"/>
+          <w:szCs w:val="22"/>
+        </w:rPr>
+      </w:pPr>
+      <w:r>
+        <w:rPr>
+          <w:rFonts w:ascii="Arial" w:cs="Arial" w:eastAsia="Arial" w:hAnsi="Arial"/>
+          <w:sz w:val="22"/>
+          <w:szCs w:val="22"/>
+          <w:rtl w:val="0"/>
+        </w:rPr>
+        <w:t xml:space="preserve">BHAT, N. Health care: Data set on Heart attack possibility. Kaggle. Disponível em: https://www.kaggle.com/datasets/nareshbhat/health-care-data-set-on-heart-attack-possibility. Acesso em: 20 out. 2026.</w:t>
+      </w:r>
+    </w:p>
+    <w:p>
+      <w:pPr>
+        <w:jc w:val="left"/>
+        <w:rPr>
+          <w:rFonts w:ascii="Arial" w:cs="Arial" w:eastAsia="Arial" w:hAnsi="Arial"/>
+          <w:sz w:val="22"/>
+          <w:szCs w:val="22"/>
+        </w:rPr>
+      </w:pPr>
+      <w:r>
+        <w:rPr>
+          <w:rFonts w:ascii="Arial" w:cs="Arial" w:eastAsia="Arial" w:hAnsi="Arial"/>
+          <w:sz w:val="22"/>
+          <w:szCs w:val="22"/>
+          <w:rtl w:val="0"/>
+        </w:rPr>
+        <w:t xml:space="preserve">JANOSI, A.; STEINBRUNN, W.; PFISTERER, M.; DETRANO, R. Heart Disease [conjunto de dados]. UCI Machine Learning Repository, 1988. DOI: https://doi.org/10.24432/C52P4X. Disponível em: https://archive.ics.uci.edu/dataset/45/heart+disease. Acesso em: 20 out. 2026.</w:t>
+      </w:r>
+    </w:p>
+    <w:p>
+      <w:pPr>
+        <w:jc w:val="left"/>
+        <w:rPr>
+          <w:rFonts w:ascii="Arial" w:cs="Arial" w:eastAsia="Arial" w:hAnsi="Arial"/>
+          <w:sz w:val="22"/>
+          <w:szCs w:val="22"/>
+        </w:rPr>
+      </w:pPr>
+      <w:r>
+        <w:rPr>
+          <w:rFonts w:ascii="Arial" w:cs="Arial" w:eastAsia="Arial" w:hAnsi="Arial"/>
+          <w:sz w:val="22"/>
+          <w:szCs w:val="22"/>
+          <w:rtl w:val="0"/>
+        </w:rPr>
+        <w:t xml:space="preserve">UCI MACHINE LEARNING REPOSITORY. Heart Disease: arquivos processed.cleveland.data (dados originais da base Cleveland, com valores ausentes marcados por "?") e heart-disease.names (documentação dos atributos). Disponível em: https://archive.ics.uci.edu/ml/machine-learning-databases/heart-disease/. Acesso em: 20 out. 2026. Utilizados para verificar a codificação de ca, thal e target na versão do Kaggle.</w:t>
+      </w:r>
+    </w:p>
+    <w:p>
+      <w:pPr>
+        <w:jc w:val="left"/>
+        <w:rPr>
+          <w:rFonts w:ascii="Arial" w:cs="Arial" w:eastAsia="Arial" w:hAnsi="Arial"/>
+          <w:sz w:val="22"/>
+          <w:szCs w:val="22"/>
+        </w:rPr>
+      </w:pPr>
+      <w:r>
+        <w:rPr>
+          <w:rFonts w:ascii="Arial" w:cs="Arial" w:eastAsia="Arial" w:hAnsi="Arial"/>
+          <w:sz w:val="22"/>
+          <w:szCs w:val="22"/>
+          <w:rtl w:val="0"/>
+        </w:rPr>
+        <w:t xml:space="preserve">DETRANO, R. et al. International application of a new probability algorithm for the diagnosis of coronary artery disease. American Journal of Cardiology, v. 64, n. 5, p. 304–310, 1989.</w:t>
+      </w:r>
+    </w:p>
+    <w:p>
+      <w:pPr>
+        <w:jc w:val="left"/>
+        <w:rPr>
+          <w:rFonts w:ascii="Arial" w:cs="Arial" w:eastAsia="Arial" w:hAnsi="Arial"/>
+          <w:sz w:val="22"/>
+          <w:szCs w:val="22"/>
+        </w:rPr>
+      </w:pPr>
+      <w:r>
+        <w:rPr>
+          <w:rFonts w:ascii="Arial" w:cs="Arial" w:eastAsia="Arial" w:hAnsi="Arial"/>
+          <w:sz w:val="22"/>
+          <w:szCs w:val="22"/>
+          <w:rtl w:val="0"/>
+        </w:rPr>
+        <w:t xml:space="preserve">PEDREGOSA, F. et al. Scikit-learn: Machine Learning in Python. Journal of Machine Learning Research, v. 12, p. 2825–2830, 2011.</w:t>
       </w:r>
     </w:p>
     <w:p>

</xml_diff>

<commit_message>
Relatório do T1: versão final sincronizada (.md e .docx)
- Sincroniza o .docx com o relatório em Markdown, mantendo a estrutura do template
- Remove a página de orientações do template
- Adiciona o gráfico comparativo do F1 (figuras/) na Seção 5.2
- Inclui link do Colab, interpretação (Seções 6 e 7), declaração e resumo dos prompts de uso de IA
- Reordena as referências, deixando a citação do Claude por último

Co-Authored-By: Claude Opus 5.5 (1M context) <noreply@anthropic.com>
</commit_message>
<xml_diff>
--- a/T1_Template_Spot-Check_Summary.docx
+++ b/T1_Template_Spot-Check_Summary.docx
@@ -2,449 +2,6 @@
 <file path=word/document.xml><?xml version="1.0" encoding="utf-8"?>
 <w:document xmlns:mc="http://schemas.openxmlformats.org/markup-compatibility/2006" xmlns:o="urn:schemas-microsoft-com:office:office" xmlns:r="http://schemas.openxmlformats.org/officeDocument/2006/relationships" xmlns:m="http://schemas.openxmlformats.org/officeDocument/2006/math" xmlns:v="urn:schemas-microsoft-com:vml" xmlns:wp="http://schemas.openxmlformats.org/drawingml/2006/wordprocessingDrawing" xmlns:w10="urn:schemas-microsoft-com:office:word" xmlns:w="http://schemas.openxmlformats.org/wordprocessingml/2006/main" xmlns:wne="http://schemas.microsoft.com/office/word/2006/wordml" xmlns:sl="http://schemas.openxmlformats.org/schemaLibrary/2006/main" xmlns:a="http://schemas.openxmlformats.org/drawingml/2006/main" xmlns:pic="http://schemas.openxmlformats.org/drawingml/2006/picture" xmlns:c="http://schemas.openxmlformats.org/drawingml/2006/chart" xmlns:lc="http://schemas.openxmlformats.org/drawingml/2006/lockedCanvas" xmlns:dgm="http://schemas.openxmlformats.org/drawingml/2006/diagram" xmlns:wps="http://schemas.microsoft.com/office/word/2010/wordprocessingShape" xmlns:wpg="http://schemas.microsoft.com/office/word/2010/wordprocessingGroup" xmlns:w14="http://schemas.microsoft.com/office/word/2010/wordml" xmlns:w15="http://schemas.microsoft.com/office/word/2012/wordml" xmlns:w16="http://schemas.microsoft.com/office/word/2018/wordml" xmlns:w16cex="http://schemas.microsoft.com/office/word/2018/wordml/cex" xmlns:w16cid="http://schemas.microsoft.com/office/word/2016/wordml/cid" xmlns="http://schemas.microsoft.com/office/tasks/2019/documenttasks" xmlns:cr="http://schemas.microsoft.com/office/comments/2020/reactions">
   <w:body>
-    <w:p>
-      <w:pPr>
-        <w:jc w:val="center"/>
-        <w:rPr>
-          <w:rFonts w:ascii="Arial" w:cs="Arial" w:eastAsia="Arial" w:hAnsi="Arial"/>
-          <w:sz w:val="22"/>
-          <w:szCs w:val="22"/>
-        </w:rPr>
-      </w:pPr>
-      <w:r>
-        <w:rPr>
-          <w:rFonts w:ascii="Arial" w:cs="Arial" w:eastAsia="Arial" w:hAnsi="Arial"/>
-          <w:b w:val="1"/>
-          <w:bCs w:val="1"/>
-          <w:sz w:val="22"/>
-          <w:szCs w:val="22"/>
-          <w:rtl w:val="0"/>
-        </w:rPr>
-        <w:t xml:space="preserve">T1 — Spot-Check Summary</w:t>
-      </w:r>
-      <w:r>
-        <w:rPr>
-          <w:rtl w:val="0"/>
-        </w:rPr>
-      </w:r>
-    </w:p>
-    <w:p>
-      <w:pPr>
-        <w:jc w:val="center"/>
-        <w:rPr>
-          <w:rFonts w:ascii="Arial" w:cs="Arial" w:eastAsia="Arial" w:hAnsi="Arial"/>
-          <w:sz w:val="22"/>
-          <w:szCs w:val="22"/>
-        </w:rPr>
-      </w:pPr>
-      <w:r>
-        <w:rPr>
-          <w:rFonts w:ascii="Arial" w:cs="Arial" w:eastAsia="Arial" w:hAnsi="Arial"/>
-          <w:i w:val="1"/>
-          <w:iCs w:val="1"/>
-          <w:sz w:val="22"/>
-          <w:szCs w:val="22"/>
-          <w:rtl w:val="0"/>
-        </w:rPr>
-        <w:t xml:space="preserve">Resumo estruturado dos experimentos de Spot-Checking</w:t>
-      </w:r>
-      <w:r>
-        <w:rPr>
-          <w:rtl w:val="0"/>
-        </w:rPr>
-      </w:r>
-    </w:p>
-    <w:p>
-      <w:pPr>
-        <w:jc w:val="both"/>
-        <w:rPr>
-          <w:rFonts w:ascii="Arial" w:cs="Arial" w:eastAsia="Arial" w:hAnsi="Arial"/>
-          <w:b w:val="1"/>
-          <w:bCs w:val="1"/>
-          <w:sz w:val="22"/>
-          <w:szCs w:val="22"/>
-        </w:rPr>
-      </w:pPr>
-      <w:r>
-        <w:rPr>
-          <w:rFonts w:ascii="Arial" w:cs="Arial" w:eastAsia="Arial" w:hAnsi="Arial"/>
-          <w:b w:val="1"/>
-          <w:bCs w:val="1"/>
-          <w:sz w:val="22"/>
-          <w:szCs w:val="22"/>
-          <w:rtl w:val="0"/>
-        </w:rPr>
-        <w:t xml:space="preserve">Orientação geral. </w:t>
-      </w:r>
-    </w:p>
-    <w:p>
-      <w:pPr>
-        <w:jc w:val="both"/>
-        <w:rPr>
-          <w:rFonts w:ascii="Arial" w:cs="Arial" w:eastAsia="Arial" w:hAnsi="Arial"/>
-          <w:sz w:val="22"/>
-          <w:szCs w:val="22"/>
-        </w:rPr>
-      </w:pPr>
-      <w:r>
-        <w:rPr>
-          <w:rFonts w:ascii="Arial" w:cs="Arial" w:eastAsia="Arial" w:hAnsi="Arial"/>
-          <w:sz w:val="22"/>
-          <w:szCs w:val="22"/>
-          <w:rtl w:val="0"/>
-        </w:rPr>
-        <w:t xml:space="preserve">Este documento deve apresentar, de forma concisa, as principais decisões, resultados e conclusões do T1. O notebook é o artefato principal para detalhar procedimentos, código, análises e resultados intermediários. Evite reproduzir no relatório todo o conteúdo do notebook.</w:t>
-      </w:r>
-    </w:p>
-    <w:p>
-      <w:pPr>
-        <w:jc w:val="both"/>
-        <w:rPr>
-          <w:rFonts w:ascii="Arial" w:cs="Arial" w:eastAsia="Arial" w:hAnsi="Arial"/>
-          <w:sz w:val="22"/>
-          <w:szCs w:val="22"/>
-        </w:rPr>
-      </w:pPr>
-      <w:r>
-        <w:rPr>
-          <w:rFonts w:ascii="Arial" w:cs="Arial" w:eastAsia="Arial" w:hAnsi="Arial"/>
-          <w:sz w:val="22"/>
-          <w:szCs w:val="22"/>
-          <w:rtl w:val="0"/>
-        </w:rPr>
-        <w:t xml:space="preserve">Cada grupo deve entregar um documento conforme este template. Ao fazer a sua entrega, delete do documento esta primeira página de orientações.</w:t>
-      </w:r>
-    </w:p>
-    <w:p>
-      <w:pPr>
-        <w:jc w:val="both"/>
-        <w:rPr>
-          <w:rFonts w:ascii="Arial" w:cs="Arial" w:eastAsia="Arial" w:hAnsi="Arial"/>
-          <w:sz w:val="22"/>
-          <w:szCs w:val="22"/>
-        </w:rPr>
-      </w:pPr>
-      <w:r>
-        <w:rPr>
-          <w:rtl w:val="0"/>
-        </w:rPr>
-      </w:r>
-    </w:p>
-    <w:p>
-      <w:pPr>
-        <w:jc w:val="both"/>
-        <w:rPr>
-          <w:rFonts w:ascii="Arial" w:cs="Arial" w:eastAsia="Arial" w:hAnsi="Arial"/>
-          <w:sz w:val="22"/>
-          <w:szCs w:val="22"/>
-        </w:rPr>
-      </w:pPr>
-      <w:r>
-        <w:rPr>
-          <w:rtl w:val="0"/>
-        </w:rPr>
-      </w:r>
-    </w:p>
-    <w:p>
-      <w:pPr>
-        <w:jc w:val="both"/>
-        <w:rPr>
-          <w:rFonts w:ascii="Arial" w:cs="Arial" w:eastAsia="Arial" w:hAnsi="Arial"/>
-          <w:sz w:val="22"/>
-          <w:szCs w:val="22"/>
-        </w:rPr>
-      </w:pPr>
-      <w:r>
-        <w:rPr>
-          <w:rtl w:val="0"/>
-        </w:rPr>
-      </w:r>
-    </w:p>
-    <w:p>
-      <w:pPr>
-        <w:jc w:val="both"/>
-        <w:rPr>
-          <w:rFonts w:ascii="Arial" w:cs="Arial" w:eastAsia="Arial" w:hAnsi="Arial"/>
-          <w:sz w:val="22"/>
-          <w:szCs w:val="22"/>
-        </w:rPr>
-      </w:pPr>
-      <w:r>
-        <w:rPr>
-          <w:rtl w:val="0"/>
-        </w:rPr>
-      </w:r>
-    </w:p>
-    <w:p>
-      <w:pPr>
-        <w:jc w:val="both"/>
-        <w:rPr>
-          <w:rFonts w:ascii="Arial" w:cs="Arial" w:eastAsia="Arial" w:hAnsi="Arial"/>
-          <w:sz w:val="22"/>
-          <w:szCs w:val="22"/>
-        </w:rPr>
-      </w:pPr>
-      <w:r>
-        <w:rPr>
-          <w:rtl w:val="0"/>
-        </w:rPr>
-      </w:r>
-    </w:p>
-    <w:p>
-      <w:pPr>
-        <w:jc w:val="both"/>
-        <w:rPr>
-          <w:rFonts w:ascii="Arial" w:cs="Arial" w:eastAsia="Arial" w:hAnsi="Arial"/>
-          <w:sz w:val="22"/>
-          <w:szCs w:val="22"/>
-        </w:rPr>
-      </w:pPr>
-      <w:r>
-        <w:rPr>
-          <w:rtl w:val="0"/>
-        </w:rPr>
-      </w:r>
-    </w:p>
-    <w:p>
-      <w:pPr>
-        <w:jc w:val="both"/>
-        <w:rPr>
-          <w:rFonts w:ascii="Arial" w:cs="Arial" w:eastAsia="Arial" w:hAnsi="Arial"/>
-          <w:sz w:val="22"/>
-          <w:szCs w:val="22"/>
-        </w:rPr>
-      </w:pPr>
-      <w:r>
-        <w:rPr>
-          <w:rtl w:val="0"/>
-        </w:rPr>
-      </w:r>
-    </w:p>
-    <w:p>
-      <w:pPr>
-        <w:jc w:val="both"/>
-        <w:rPr>
-          <w:rFonts w:ascii="Arial" w:cs="Arial" w:eastAsia="Arial" w:hAnsi="Arial"/>
-          <w:sz w:val="22"/>
-          <w:szCs w:val="22"/>
-        </w:rPr>
-      </w:pPr>
-      <w:r>
-        <w:rPr>
-          <w:rtl w:val="0"/>
-        </w:rPr>
-      </w:r>
-    </w:p>
-    <w:p>
-      <w:pPr>
-        <w:jc w:val="both"/>
-        <w:rPr>
-          <w:rFonts w:ascii="Arial" w:cs="Arial" w:eastAsia="Arial" w:hAnsi="Arial"/>
-          <w:sz w:val="22"/>
-          <w:szCs w:val="22"/>
-        </w:rPr>
-      </w:pPr>
-      <w:r>
-        <w:rPr>
-          <w:rtl w:val="0"/>
-        </w:rPr>
-      </w:r>
-    </w:p>
-    <w:p>
-      <w:pPr>
-        <w:jc w:val="both"/>
-        <w:rPr>
-          <w:rFonts w:ascii="Arial" w:cs="Arial" w:eastAsia="Arial" w:hAnsi="Arial"/>
-          <w:sz w:val="22"/>
-          <w:szCs w:val="22"/>
-        </w:rPr>
-      </w:pPr>
-      <w:r>
-        <w:rPr>
-          <w:rtl w:val="0"/>
-        </w:rPr>
-      </w:r>
-    </w:p>
-    <w:p>
-      <w:pPr>
-        <w:jc w:val="both"/>
-        <w:rPr>
-          <w:rFonts w:ascii="Arial" w:cs="Arial" w:eastAsia="Arial" w:hAnsi="Arial"/>
-          <w:sz w:val="22"/>
-          <w:szCs w:val="22"/>
-        </w:rPr>
-      </w:pPr>
-      <w:r>
-        <w:rPr>
-          <w:rtl w:val="0"/>
-        </w:rPr>
-      </w:r>
-    </w:p>
-    <w:p>
-      <w:pPr>
-        <w:jc w:val="both"/>
-        <w:rPr>
-          <w:rFonts w:ascii="Arial" w:cs="Arial" w:eastAsia="Arial" w:hAnsi="Arial"/>
-          <w:sz w:val="22"/>
-          <w:szCs w:val="22"/>
-        </w:rPr>
-      </w:pPr>
-      <w:r>
-        <w:rPr>
-          <w:rtl w:val="0"/>
-        </w:rPr>
-      </w:r>
-    </w:p>
-    <w:p>
-      <w:pPr>
-        <w:jc w:val="both"/>
-        <w:rPr>
-          <w:rFonts w:ascii="Arial" w:cs="Arial" w:eastAsia="Arial" w:hAnsi="Arial"/>
-          <w:sz w:val="22"/>
-          <w:szCs w:val="22"/>
-        </w:rPr>
-      </w:pPr>
-      <w:r>
-        <w:rPr>
-          <w:rtl w:val="0"/>
-        </w:rPr>
-      </w:r>
-    </w:p>
-    <w:p>
-      <w:pPr>
-        <w:jc w:val="both"/>
-        <w:rPr>
-          <w:rFonts w:ascii="Arial" w:cs="Arial" w:eastAsia="Arial" w:hAnsi="Arial"/>
-          <w:sz w:val="22"/>
-          <w:szCs w:val="22"/>
-        </w:rPr>
-      </w:pPr>
-      <w:r>
-        <w:rPr>
-          <w:rtl w:val="0"/>
-        </w:rPr>
-      </w:r>
-    </w:p>
-    <w:p>
-      <w:pPr>
-        <w:jc w:val="both"/>
-        <w:rPr>
-          <w:rFonts w:ascii="Arial" w:cs="Arial" w:eastAsia="Arial" w:hAnsi="Arial"/>
-          <w:sz w:val="22"/>
-          <w:szCs w:val="22"/>
-        </w:rPr>
-      </w:pPr>
-      <w:r>
-        <w:rPr>
-          <w:rtl w:val="0"/>
-        </w:rPr>
-      </w:r>
-    </w:p>
-    <w:p>
-      <w:pPr>
-        <w:jc w:val="both"/>
-        <w:rPr>
-          <w:rFonts w:ascii="Arial" w:cs="Arial" w:eastAsia="Arial" w:hAnsi="Arial"/>
-          <w:sz w:val="22"/>
-          <w:szCs w:val="22"/>
-        </w:rPr>
-      </w:pPr>
-      <w:r>
-        <w:rPr>
-          <w:rtl w:val="0"/>
-        </w:rPr>
-      </w:r>
-    </w:p>
-    <w:p>
-      <w:pPr>
-        <w:jc w:val="both"/>
-        <w:rPr>
-          <w:rFonts w:ascii="Arial" w:cs="Arial" w:eastAsia="Arial" w:hAnsi="Arial"/>
-          <w:sz w:val="22"/>
-          <w:szCs w:val="22"/>
-        </w:rPr>
-      </w:pPr>
-      <w:r>
-        <w:rPr>
-          <w:rtl w:val="0"/>
-        </w:rPr>
-      </w:r>
-    </w:p>
-    <w:p>
-      <w:pPr>
-        <w:jc w:val="both"/>
-        <w:rPr>
-          <w:rFonts w:ascii="Arial" w:cs="Arial" w:eastAsia="Arial" w:hAnsi="Arial"/>
-          <w:sz w:val="22"/>
-          <w:szCs w:val="22"/>
-        </w:rPr>
-      </w:pPr>
-      <w:r>
-        <w:rPr>
-          <w:rtl w:val="0"/>
-        </w:rPr>
-      </w:r>
-    </w:p>
-    <w:p>
-      <w:pPr>
-        <w:jc w:val="both"/>
-        <w:rPr>
-          <w:rFonts w:ascii="Arial" w:cs="Arial" w:eastAsia="Arial" w:hAnsi="Arial"/>
-          <w:sz w:val="22"/>
-          <w:szCs w:val="22"/>
-        </w:rPr>
-      </w:pPr>
-      <w:r>
-        <w:rPr>
-          <w:rtl w:val="0"/>
-        </w:rPr>
-      </w:r>
-    </w:p>
-    <w:p>
-      <w:pPr>
-        <w:jc w:val="both"/>
-        <w:rPr>
-          <w:rFonts w:ascii="Arial" w:cs="Arial" w:eastAsia="Arial" w:hAnsi="Arial"/>
-          <w:sz w:val="22"/>
-          <w:szCs w:val="22"/>
-        </w:rPr>
-      </w:pPr>
-      <w:r>
-        <w:rPr>
-          <w:rtl w:val="0"/>
-        </w:rPr>
-      </w:r>
-    </w:p>
-    <w:p>
-      <w:pPr>
-        <w:jc w:val="both"/>
-        <w:rPr>
-          <w:rFonts w:ascii="Arial" w:cs="Arial" w:eastAsia="Arial" w:hAnsi="Arial"/>
-          <w:sz w:val="22"/>
-          <w:szCs w:val="22"/>
-        </w:rPr>
-      </w:pPr>
-      <w:r>
-        <w:rPr>
-          <w:rtl w:val="0"/>
-        </w:rPr>
-      </w:r>
-    </w:p>
-    <w:p>
-      <w:pPr>
-        <w:jc w:val="both"/>
-        <w:rPr>
-          <w:rFonts w:ascii="Arial" w:cs="Arial" w:eastAsia="Arial" w:hAnsi="Arial"/>
-          <w:sz w:val="22"/>
-          <w:szCs w:val="22"/>
-        </w:rPr>
-      </w:pPr>
-      <w:r>
-        <w:rPr>
-          <w:rtl w:val="0"/>
-        </w:rPr>
-      </w:r>
-    </w:p>
     <w:p>
       <w:pPr>
         <w:jc w:val="center"/>
@@ -791,15 +348,19 @@
           <w:szCs w:val="22"/>
         </w:rPr>
       </w:pPr>
-      <w:r>
-        <w:rPr>
-          <w:rFonts w:ascii="Arial" w:cs="Arial" w:eastAsia="Arial" w:hAnsi="Arial"/>
-          <w:sz w:val="22"/>
-          <w:szCs w:val="22"/>
-          <w:rtl w:val="0"/>
-        </w:rPr>
-        <w:t xml:space="preserve">&lt;digite aqui o link&gt;</w:t>
-      </w:r>
+      <w:hyperlink r:id="rIdColab">
+        <w:r>
+          <w:rPr>
+            <w:rFonts w:ascii="Arial" w:cs="Arial" w:eastAsia="Arial" w:hAnsi="Arial"/>
+            <w:color w:val="1155CC"/>
+            <w:u w:val="single"/>
+            <w:sz w:val="22"/>
+            <w:szCs w:val="22"/>
+            <w:rtl w:val="0"/>
+          </w:rPr>
+          <w:t xml:space="preserve">https://colab.research.google.com/drive/1g9OaeB2x6kvaPcSNTCVsbPBBboNwhq9P?usp=sharing</w:t>
+        </w:r>
+      </w:hyperlink>
       <w:r>
         <w:rPr>
           <w:rFonts w:ascii="Arial" w:cs="Arial" w:eastAsia="Arial" w:hAnsi="Arial"/>
@@ -1324,15 +885,23 @@
       <w:r>
         <w:rPr>
           <w:rFonts w:ascii="Arial" w:cs="Arial" w:eastAsia="Arial" w:hAnsi="Arial"/>
+          <w:b w:val="1"/>
+          <w:bCs w:val="1"/>
           <w:sz w:val="22"/>
           <w:szCs w:val="22"/>
           <w:rtl w:val="0"/>
         </w:rPr>
-        <w:t xml:space="preserve">Resumo das decisões:</w:t>
+        <w:t xml:space="preserve">As decisões tomadas foram:</w:t>
       </w:r>
     </w:p>
     <w:p>
       <w:pPr>
+        <w:numPr>
+          <w:ilvl w:val="0"/>
+          <w:numId w:val="1"/>
+        </w:numPr>
+        <w:spacing w:after="120" w:before="0" w:line="276" w:lineRule="auto"/>
+        <w:ind w:left="360" w:right="0" w:hanging="360"/>
         <w:jc w:val="both"/>
         <w:rPr>
           <w:rFonts w:ascii="Arial" w:cs="Arial" w:eastAsia="Arial" w:hAnsi="Arial"/>
@@ -1349,7 +918,7 @@
           <w:szCs w:val="22"/>
           <w:rtl w:val="0"/>
         </w:rPr>
-        <w:t xml:space="preserve">Atributos: </w:t>
+        <w:t xml:space="preserve">Atributos:</w:t>
       </w:r>
       <w:r>
         <w:rPr>
@@ -1358,11 +927,17 @@
           <w:szCs w:val="22"/>
           <w:rtl w:val="0"/>
         </w:rPr>
-        <w:t xml:space="preserve">os 13 atributos preditivos foram mantidos. Alguns atributos apresentam baixa relevância individual (informação mútua e correlação com o alvo), mas, como a base tem poucos atributos e essas medidas não capturam interações, nenhum atributo foi removido no spot-checking.</w:t>
+        <w:t xml:space="preserve"> os 13 atributos preditivos foram mantidos. Alguns atributos apresentam baixa relevância individual (correlação com o alvo), mas, como a base tem poucos atributos e essas medidas não capturam interações, nenhum atributo foi removido no spot-checking.</w:t>
       </w:r>
     </w:p>
     <w:p>
       <w:pPr>
+        <w:numPr>
+          <w:ilvl w:val="0"/>
+          <w:numId w:val="1"/>
+        </w:numPr>
+        <w:spacing w:after="120" w:before="0" w:line="276" w:lineRule="auto"/>
+        <w:ind w:left="360" w:right="0" w:hanging="360"/>
         <w:jc w:val="both"/>
         <w:rPr>
           <w:rFonts w:ascii="Arial" w:cs="Arial" w:eastAsia="Arial" w:hAnsi="Arial"/>
@@ -1379,7 +954,7 @@
           <w:szCs w:val="22"/>
           <w:rtl w:val="0"/>
         </w:rPr>
-        <w:t xml:space="preserve">Valores ausentes e inconsistências: </w:t>
+        <w:t xml:space="preserve">Valores ausentes e inconsistências:</w:t>
       </w:r>
       <w:r>
         <w:rPr>
@@ -1388,11 +963,17 @@
           <w:szCs w:val="22"/>
           <w:rtl w:val="0"/>
         </w:rPr>
-        <w:t xml:space="preserve">não há valores NaN explícitos, mas a comparação registro a registro com a base Cleveland original da UCI mostrou que ca = 4 (4 instâncias) e thal = 0 (2 instâncias) correspondem a valores ausentes ("?") e que a descrição de thal no Kaggle está incorreta (na prática, 1 = defeito fixo, 2 = normal, 3 = defeito reversível). Esses códigos foram convertidos em valores ausentes e imputados pela mediana, calculada apenas nos dados de treino de cada fold (para thal, nominal, a mediana coincide com a moda). Foi removida 1 instância duplicada, artefato da versão do Kaggle. A mesma comparação revelou que target = 1 corresponde aos pacientes sem doença (num = 0 na UCI), ao contrário da descrição do Kaggle; por isso, o alvo foi recodificado para 1 = com doença, a classe positiva das métricas. Os outliers (trestbps, chol, thalach e oldpeak) foram mantidos por serem clinicamente plausíveis.</w:t>
+        <w:t xml:space="preserve"> não há valores ausentes explícitos, mas a comparação registro a registro com a base Cleveland original da UCI mostrou que ca = 4 (4 instâncias) e thal = 0 (2 instâncias) correspondem a valores ausentes ("?") e que a descrição de thal no Kaggle está incorreta (na prática, 1 = defeito fixo, 2 = normal, 3 = defeito reversível). Esses códigos foram convertidos em valores ausentes e imputados pela mediana, calculada apenas nos dados de treino de cada fold (para thal, nominal, a mediana coincide com a moda). Foi removida 1 instância duplicada, artefato/falha da versão do Kaggle. Adicionalmente, a mesma comparação revelou que target = 1 corresponde aos pacientes sem doença (num = 0 na UCI), ao contrário da descrição do Kaggle; por isso, o alvo foi recodificado para 1 = com doença, a classe positiva das métricas. Os outliers (trestbps, chol, thalach e oldpeak) foram mantidos por serem clinicamente plausíveis.</w:t>
       </w:r>
     </w:p>
     <w:p>
       <w:pPr>
+        <w:numPr>
+          <w:ilvl w:val="0"/>
+          <w:numId w:val="1"/>
+        </w:numPr>
+        <w:spacing w:after="120" w:before="0" w:line="276" w:lineRule="auto"/>
+        <w:ind w:left="360" w:right="0" w:hanging="360"/>
         <w:jc w:val="both"/>
         <w:rPr>
           <w:rFonts w:ascii="Arial" w:cs="Arial" w:eastAsia="Arial" w:hAnsi="Arial"/>
@@ -1409,7 +990,7 @@
           <w:szCs w:val="22"/>
           <w:rtl w:val="0"/>
         </w:rPr>
-        <w:t xml:space="preserve">Codificação: </w:t>
+        <w:t xml:space="preserve">Codificação:</w:t>
       </w:r>
       <w:r>
         <w:rPr>
@@ -1418,11 +999,17 @@
           <w:szCs w:val="22"/>
           <w:rtl w:val="0"/>
         </w:rPr>
-        <w:t xml:space="preserve">não foi necessário converter atributos categóricos em numéricos, pois todos já estão armazenados como números. Porém, cp, restecg, slope e thal são categorias nominais codificadas como inteiros e sem relação monotônica com o alvo; por isso recebem one-hot encoding (13 → 22 colunas), com handle_unknown="ignore" devido a categorias raras (ex.: restecg = 2). Os atributos binários e ca permanecem como estão.</w:t>
+        <w:t xml:space="preserve"> não foi necessário converter atributos categóricos em numéricos, pois todos já estão armazenados como números. Porém, cp, restecg, slope e thal são categorias nominais codificadas como inteiros e sem relação monotônica com o alvo; por isso recebem one-hot encoding (13 → 22 colunas), com handle_unknown="ignore" devido a categorias raras (ex.: restecg = 2). Os atributos binários e ca permanecem como estão.</w:t>
       </w:r>
     </w:p>
     <w:p>
       <w:pPr>
+        <w:numPr>
+          <w:ilvl w:val="0"/>
+          <w:numId w:val="1"/>
+        </w:numPr>
+        <w:spacing w:after="120" w:before="0" w:line="276" w:lineRule="auto"/>
+        <w:ind w:left="360" w:right="0" w:hanging="360"/>
         <w:jc w:val="both"/>
         <w:rPr>
           <w:rFonts w:ascii="Arial" w:cs="Arial" w:eastAsia="Arial" w:hAnsi="Arial"/>
@@ -1439,7 +1026,7 @@
           <w:szCs w:val="22"/>
           <w:rtl w:val="0"/>
         </w:rPr>
-        <w:t xml:space="preserve">Normalização: </w:t>
+        <w:t xml:space="preserve">Normalização:</w:t>
       </w:r>
       <w:r>
         <w:rPr>
@@ -1448,11 +1035,17 @@
           <w:szCs w:val="22"/>
           <w:rtl w:val="0"/>
         </w:rPr>
-        <w:t xml:space="preserve">as escalas são muito heterogêneas (a amplitude de chol é cerca de 71 vezes a de oldpeak); os atributos numéricos e ca são padronizados (z-score, StandardScaler), o que é essencial para KNN, Regressão Logística e Rede Neural.</w:t>
+        <w:t xml:space="preserve"> as escalas são muito heterogêneas (a amplitude de chol é cerca de 71 vezes a de oldpeak), portanto os atributos numéricos e ca são padronizados (z-score, StandardScaler), o que é essencial para KNN, e ajuda a Regressão Logística e Rede Neural, que dependem do gradiente, a convergirem.</w:t>
       </w:r>
     </w:p>
     <w:p>
       <w:pPr>
+        <w:numPr>
+          <w:ilvl w:val="0"/>
+          <w:numId w:val="1"/>
+        </w:numPr>
+        <w:spacing w:after="120" w:before="0" w:line="276" w:lineRule="auto"/>
+        <w:ind w:left="360" w:right="0" w:hanging="360"/>
         <w:jc w:val="both"/>
         <w:rPr>
           <w:rFonts w:ascii="Arial" w:cs="Arial" w:eastAsia="Arial" w:hAnsi="Arial"/>
@@ -1469,7 +1062,7 @@
           <w:szCs w:val="22"/>
           <w:rtl w:val="0"/>
         </w:rPr>
-        <w:t xml:space="preserve">Desbalanceamento: </w:t>
+        <w:t xml:space="preserve">Desbalanceamento:</w:t>
       </w:r>
       <w:r>
         <w:rPr>
@@ -1478,11 +1071,17 @@
           <w:szCs w:val="22"/>
           <w:rtl w:val="0"/>
         </w:rPr>
-        <w:t xml:space="preserve">as classes estão quase balanceadas (54% × 46%, razão ≈ 1,2); não se aplica reamostragem, apenas estratificação nas divisões.</w:t>
+        <w:t xml:space="preserve"> as classes estão quase balanceadas (54% vs 46%, razão ≈ 1,2) e, como consequência, decidimos não aplicar reamostragem, apenas estratificação nas divisões.</w:t>
       </w:r>
     </w:p>
     <w:p>
       <w:pPr>
+        <w:numPr>
+          <w:ilvl w:val="0"/>
+          <w:numId w:val="1"/>
+        </w:numPr>
+        <w:spacing w:after="120" w:before="0" w:line="276" w:lineRule="auto"/>
+        <w:ind w:left="360" w:right="0" w:hanging="360"/>
         <w:jc w:val="both"/>
         <w:rPr>
           <w:rFonts w:ascii="Arial" w:cs="Arial" w:eastAsia="Arial" w:hAnsi="Arial"/>
@@ -1499,7 +1098,7 @@
           <w:szCs w:val="22"/>
           <w:rtl w:val="0"/>
         </w:rPr>
-        <w:t xml:space="preserve">Outras decisões: </w:t>
+        <w:t xml:space="preserve">Outras decisões:</w:t>
       </w:r>
       <w:r>
         <w:rPr>
@@ -1508,7 +1107,7 @@
           <w:szCs w:val="22"/>
           <w:rtl w:val="0"/>
         </w:rPr>
-        <w:t xml:space="preserve">a remoção da duplicata, a marcação dos códigos de ausência e a recodificação do alvo (regras determinísticas, que não aprendem nada dos dados) são feitas antes da divisão treino/teste; as etapas que aprendem parâmetros (imputação, codificação e padronização) são encapsuladas em um Pipeline, ajustado somente nos dados de treino de cada fold.</w:t>
+        <w:t xml:space="preserve"> a remoção da duplicata e a recodificação do alvo (regras determinísticas, que não aprendem nada dos dados) são feitas antes da divisão treino/teste; a marcação dos códigos de ausência, também determinística, é aplicada logo após a divisão, igualmente a treino e teste; as etapas que aprendem parâmetros (imputação, codificação e padronização) são encapsuladas em um Pipeline, ajustado somente nos dados de treino de cada fold.</w:t>
       </w:r>
     </w:p>
     <w:p>
@@ -1643,7 +1242,7 @@
                 <w:szCs w:val="22"/>
                 <w:rtl w:val="0"/>
               </w:rPr>
-              <w:t xml:space="preserve">Classificação binária: o alvo indica se o paciente possui ou não doença cardíaca (tendência a ataque cardíaco). Para a modelagem, 1 = com doença (classe positiva) e 0 = sem doença.</w:t>
+              <w:t xml:space="preserve">Classificação (binária)</w:t>
             </w:r>
           </w:p>
         </w:tc>
@@ -1700,7 +1299,7 @@
                 <w:szCs w:val="22"/>
                 <w:rtl w:val="0"/>
               </w:rPr>
-              <w:t xml:space="preserve">F1-score da classe positiva (com doença). Combina precisão e recall, penalizando tanto deixar de identificar pacientes doentes (falsos negativos) quanto alarmes falsos. Como as classes estão quase balanceadas, a acurácia não seria enganosa, mas trata os dois erros como equivalentes e não informa sobre a classe de interesse.</w:t>
+              <w:t xml:space="preserve">F1-score da classe positiva (com doença). A métrica é adequada para o problema pois, à medida que combina precisão e recall, penaliza tanto deixar de identificar pacientes doentes (falsos negativos) quanto alarmes falsos.</w:t>
             </w:r>
           </w:p>
         </w:tc>
@@ -1928,7 +1527,7 @@
                 <w:szCs w:val="22"/>
                 <w:rtl w:val="0"/>
               </w:rPr>
-              <w:t xml:space="preserve">Não se aplica: classes quase balanceadas (54,4% sem doença × 45,6% com doença no treino; razão ≈ 1,2). Todas as divisões são estratificadas para preservar essa proporção.</w:t>
+              <w:t xml:space="preserve">Não fizemos, visto que as classes são quase balanceadas (54,4% sem doença vs 45,6% com doença no treino; razão ≈ 1,2). Todas as divisões são estratificadas para preservar essa proporção.</w:t>
             </w:r>
           </w:p>
         </w:tc>
@@ -1985,7 +1584,7 @@
                 <w:szCs w:val="22"/>
                 <w:rtl w:val="0"/>
               </w:rPr>
-              <w:t xml:space="preserve">Média e desvio padrão do F1 nas 50 avaliações (as mesmas divisões para todos os algoritmos), complementados por boxplots da distribuição do F1; as métricas secundárias auxiliam a interpretação quando as diferenças de F1 são pequenas em relação ao desvio padrão.</w:t>
+              <w:t xml:space="preserve">Média e desvio padrão do F1 nas 50 avaliações (as mesmas divisões para todos os algoritmos), complementados por boxplots da distribuição do F1. Só usamos as métricas secundárias para auxiliar a interpretação quando as diferenças de F1 são pequenas em relação ao desvio padrão.</w:t>
             </w:r>
           </w:p>
         </w:tc>
@@ -2039,7 +1638,7 @@
                 <w:szCs w:val="22"/>
                 <w:rtl w:val="0"/>
               </w:rPr>
-              <w:t xml:space="preserve">Remoção da duplicata antes da divisão (evita a mesma instância em treino e teste); EDA apenas descritiva, sem ajustar transformações usadas pelos modelos; imputação, one-hot encoding e padronização encapsuladas em um Pipeline do scikit-learn, reajustado apenas nos dados de treino de cada fold; conjunto de teste não utilizado no T1.</w:t>
+              <w:t xml:space="preserve">Removemos a duplicata antes da divisão (evitando a mesma instância em treino e teste), realizamos a imputação, one-hot encoding e padronização encapsuladas em um Pipeline do scikit-learn, reajustando apenas nos dados de treino de cada fold, e o conjunto de teste não foi utilizado no T1.</w:t>
             </w:r>
           </w:p>
         </w:tc>
@@ -2324,7 +1923,7 @@
                 <w:szCs w:val="22"/>
                 <w:rtl w:val="0"/>
               </w:rPr>
-              <w:t xml:space="preserve">Baseado em instâncias, não paramétrico.</w:t>
+              <w:t xml:space="preserve">Visto em aula e por ser baseado em instâncias e "preguiçoso".</w:t>
             </w:r>
           </w:p>
         </w:tc>
@@ -2426,7 +2025,7 @@
                 <w:szCs w:val="22"/>
                 <w:rtl w:val="0"/>
               </w:rPr>
-              <w:t xml:space="preserve">Simbólico, não linear e interpretável; referência para os ensembles de árvores.</w:t>
+              <w:t xml:space="preserve">Visto em aula e por ser simbólico, não linear e interpretável; referência para os ensembles de árvores.</w:t>
             </w:r>
           </w:p>
         </w:tc>
@@ -2528,7 +2127,7 @@
                 <w:szCs w:val="22"/>
                 <w:rtl w:val="0"/>
               </w:rPr>
-              <w:t xml:space="preserve">Linear e probabilístico (paramétrico).</w:t>
+              <w:t xml:space="preserve">Visto em aula e por ser linear e probabilístico.</w:t>
             </w:r>
           </w:p>
         </w:tc>
@@ -2630,7 +2229,7 @@
                 <w:szCs w:val="22"/>
                 <w:rtl w:val="0"/>
               </w:rPr>
-              <w:t xml:space="preserve">Conexionista, não linear, aprendizado por gradiente.</w:t>
+              <w:t xml:space="preserve">Visto em aula e por ser não linear e possuir aprendizado por gradiente.</w:t>
             </w:r>
           </w:p>
         </w:tc>
@@ -2654,7 +2253,7 @@
                 <w:szCs w:val="22"/>
                 <w:rtl w:val="0"/>
               </w:rPr>
-              <w:t xml:space="preserve">max_iter elevado (padrão: 200) apenas para garantir a convergência.</w:t>
+              <w:t xml:space="preserve">max_iter elevado (padrão: 200) para garantir a convergência.</w:t>
             </w:r>
           </w:p>
         </w:tc>
@@ -2732,7 +2331,7 @@
                 <w:szCs w:val="22"/>
                 <w:rtl w:val="0"/>
               </w:rPr>
-              <w:t xml:space="preserve">Ensemble por bagging; reduz a variância de uma árvore isolada.</w:t>
+              <w:t xml:space="preserve">Visto em aula e por possuir ensemble por bagging (combina árvores treinadas em amostras diferentes).</w:t>
             </w:r>
           </w:p>
         </w:tc>
@@ -2834,7 +2433,7 @@
                 <w:szCs w:val="22"/>
                 <w:rtl w:val="0"/>
               </w:rPr>
-              <w:t xml:space="preserve">Ensemble por boosting; reduz o viés de forma sequencial.</w:t>
+              <w:t xml:space="preserve">Visto em aula e na aula de Ciência de Dados, e por possuir ensemble por boosting (sequencial).</w:t>
             </w:r>
           </w:p>
         </w:tc>
@@ -4126,7 +3725,7 @@
         <w:drawing>
           <wp:inline distT="0" distB="0" distL="0" distR="0">
             <wp:extent cx="5486400" cy="2698595"/>
-            <wp:docPr id="901" name="Gráfico F1"/>
+            <wp:docPr id="901" name="grafico_comparativo_f1.png"/>
             <wp:cNvGraphicFramePr>
               <a:graphicFrameLocks noChangeAspect="1"/>
             </wp:cNvGraphicFramePr>
@@ -4134,7 +3733,7 @@
               <a:graphicData uri="http://schemas.openxmlformats.org/drawingml/2006/picture">
                 <pic:pic>
                   <pic:nvPicPr>
-                    <pic:cNvPr id="901" name="grafico_f1.png"/>
+                    <pic:cNvPr id="901" name="grafico_comparativo_f1.png"/>
                     <pic:cNvPicPr/>
                   </pic:nvPicPr>
                   <pic:blipFill>
@@ -4289,8 +3888,6 @@
         <w:jc w:val="both"/>
         <w:rPr>
           <w:rFonts w:ascii="Arial" w:cs="Arial" w:eastAsia="Arial" w:hAnsi="Arial"/>
-          <w:i w:val="1"/>
-          <w:iCs w:val="1"/>
           <w:sz w:val="22"/>
           <w:szCs w:val="22"/>
         </w:rPr>
@@ -4298,13 +3895,11 @@
       <w:r>
         <w:rPr>
           <w:rFonts w:ascii="Arial" w:cs="Arial" w:eastAsia="Arial" w:hAnsi="Arial"/>
-          <w:i w:val="1"/>
-          <w:iCs w:val="1"/>
           <w:sz w:val="22"/>
           <w:szCs w:val="22"/>
           <w:rtl w:val="0"/>
         </w:rPr>
-        <w:t xml:space="preserve">[Resposta curta]</w:t>
+        <w:t xml:space="preserve">Foram eles: a Regressão Logística (0,826), o KNN (0,818) e o Random Forest (0,809).</w:t>
       </w:r>
     </w:p>
     <w:p>
@@ -4379,8 +3974,6 @@
         <w:jc w:val="both"/>
         <w:rPr>
           <w:rFonts w:ascii="Arial" w:cs="Arial" w:eastAsia="Arial" w:hAnsi="Arial"/>
-          <w:i w:val="1"/>
-          <w:iCs w:val="1"/>
           <w:sz w:val="22"/>
           <w:szCs w:val="22"/>
         </w:rPr>
@@ -4388,13 +3981,11 @@
       <w:r>
         <w:rPr>
           <w:rFonts w:ascii="Arial" w:cs="Arial" w:eastAsia="Arial" w:hAnsi="Arial"/>
-          <w:i w:val="1"/>
-          <w:iCs w:val="1"/>
           <w:sz w:val="22"/>
           <w:szCs w:val="22"/>
           <w:rtl w:val="0"/>
         </w:rPr>
-        <w:t xml:space="preserve">[Resposta curta]</w:t>
+        <w:t xml:space="preserve">Entre os modelos, percebe-se que os não lineares desempenharam, de forma geral, pior do que o único linear, tanto no F1-score quanto na Acurácia, apesar da diferença entre os três primeiros lugares ser menor que os seus desvios padrão, indicando que eles estão praticamente empatados. Podemos destacar também que os modelos mais flexíveis, como a Rede Neural e o Gradient Boosting, não superaram os mais simples, como Regressão Logística e KNN.</w:t>
       </w:r>
     </w:p>
     <w:p>
@@ -4469,8 +4060,6 @@
         <w:jc w:val="both"/>
         <w:rPr>
           <w:rFonts w:ascii="Arial" w:cs="Arial" w:eastAsia="Arial" w:hAnsi="Arial"/>
-          <w:i w:val="1"/>
-          <w:iCs w:val="1"/>
           <w:sz w:val="22"/>
           <w:szCs w:val="22"/>
         </w:rPr>
@@ -4478,13 +4067,11 @@
       <w:r>
         <w:rPr>
           <w:rFonts w:ascii="Arial" w:cs="Arial" w:eastAsia="Arial" w:hAnsi="Arial"/>
-          <w:i w:val="1"/>
-          <w:iCs w:val="1"/>
           <w:sz w:val="22"/>
           <w:szCs w:val="22"/>
           <w:rtl w:val="0"/>
         </w:rPr>
-        <w:t xml:space="preserve">[Resposta curta]</w:t>
+        <w:t xml:space="preserve">Considerando que, em especial, a Regressão Logística desempenhou tão bem, os resultados sugerem que, provavelmente, esse problema possui uma tendência linear de mapeamento de dados-alvo/fronteira de decisão aproximadamente linear. Além disso, já que temos relativamente poucas instâncias para utilizar, modelos que são mais afetados pela variância (Árvore de Decisão e Rede Neural) acabam sofrendo nos resultados.</w:t>
       </w:r>
     </w:p>
     <w:p>
@@ -4558,13 +4145,22 @@
       <w:r>
         <w:rPr>
           <w:rFonts w:ascii="Arial" w:cs="Arial" w:eastAsia="Arial" w:hAnsi="Arial"/>
+          <w:sz w:val="22"/>
+          <w:szCs w:val="22"/>
+          <w:rtl w:val="0"/>
+        </w:rPr>
+        <w:t xml:space="preserve">Selecionamos os modelos </w:t>
+      </w:r>
+      <w:r>
+        <w:rPr>
+          <w:rFonts w:ascii="Arial" w:cs="Arial" w:eastAsia="Arial" w:hAnsi="Arial"/>
           <w:b w:val="1"/>
           <w:bCs w:val="1"/>
           <w:sz w:val="22"/>
           <w:szCs w:val="22"/>
           <w:rtl w:val="0"/>
         </w:rPr>
-        <w:t xml:space="preserve">Modelos selecionados: </w:t>
+        <w:t xml:space="preserve">Regressão Logística, KNN e Random Forest</w:t>
       </w:r>
       <w:r>
         <w:rPr>
@@ -4573,1365 +4169,7 @@
           <w:szCs w:val="22"/>
           <w:rtl w:val="0"/>
         </w:rPr>
-        <w:t xml:space="preserve">Regressão Logística, KNN e Random Forest (as três maiores médias de F1 no spot-checking).</w:t>
-      </w:r>
-    </w:p>
-    <w:p>
-      <w:pPr>
-        <w:jc w:val="both"/>
-        <w:rPr>
-          <w:rFonts w:ascii="Arial" w:cs="Arial" w:eastAsia="Arial" w:hAnsi="Arial"/>
-          <w:sz w:val="22"/>
-          <w:szCs w:val="22"/>
-          <w:i w:val="1"/>
-        </w:rPr>
-      </w:pPr>
-      <w:r>
-        <w:rPr>
-          <w:rFonts w:ascii="Arial" w:cs="Arial" w:eastAsia="Arial" w:hAnsi="Arial"/>
-          <w:i w:val="1"/>
-          <w:iCs w:val="1"/>
-          <w:sz w:val="22"/>
-          <w:szCs w:val="22"/>
-          <w:rtl w:val="0"/>
-        </w:rPr>
-        <w:t xml:space="preserve">[Justificativa da seleção – a ser redigida pelo grupo, com base na Tabela 5.1, no Gráfico 5.2 e nos dados abaixo.]</w:t>
-      </w:r>
-    </w:p>
-    <w:tbl>
-      <w:tblPr>
-        <w:tblW w:w="9744" w:type="dxa"/>
-        <w:jc w:val="center"/>
-        <w:tblBorders>
-          <w:top w:color="000000" w:space="0" w:sz="4" w:val="single"/>
-          <w:left w:color="000000" w:space="0" w:sz="4" w:val="single"/>
-          <w:bottom w:color="000000" w:space="0" w:sz="4" w:val="single"/>
-          <w:right w:color="000000" w:space="0" w:sz="4" w:val="single"/>
-          <w:insideH w:color="000000" w:space="0" w:sz="4" w:val="single"/>
-          <w:insideV w:color="000000" w:space="0" w:sz="4" w:val="single"/>
-        </w:tblBorders>
-        <w:tblLayout w:type="fixed"/>
-        <w:tblLook w:val="0400"/>
-      </w:tblPr>
-      <w:tblGrid>
-        <w:gridCol w:w="2044"/>
-        <w:gridCol w:w="1700"/>
-        <w:gridCol w:w="1000"/>
-        <w:gridCol w:w="1000"/>
-        <w:gridCol w:w="1000"/>
-        <w:gridCol w:w="1500"/>
-        <w:gridCol w:w="1500"/>
-      </w:tblGrid>
-      <w:tr>
-        <w:trPr>
-          <w:cantSplit w:val="0"/>
-          <w:tblHeader w:val="0"/>
-        </w:trPr>
-        <w:tc>
-          <w:tcPr>
-            <w:tcW w:w="2044" w:type="dxa"/>
-          </w:tcPr>
-          <w:p>
-            <w:pPr>
-              <w:jc w:val="left"/>
-              <w:rPr>
-                <w:rFonts w:ascii="Arial" w:cs="Arial" w:eastAsia="Arial" w:hAnsi="Arial"/>
-                <w:sz w:val="18"/>
-                <w:szCs w:val="18"/>
-              </w:rPr>
-            </w:pPr>
-            <w:r>
-              <w:rPr>
-                <w:rFonts w:ascii="Arial" w:cs="Arial" w:eastAsia="Arial" w:hAnsi="Arial"/>
-                <w:b w:val="1"/>
-                <w:bCs w:val="1"/>
-                <w:sz w:val="18"/>
-                <w:szCs w:val="18"/>
-                <w:rtl w:val="0"/>
-              </w:rPr>
-              <w:t xml:space="preserve">Modelo</w:t>
-            </w:r>
-          </w:p>
-        </w:tc>
-        <w:tc>
-          <w:tcPr>
-            <w:tcW w:w="1700" w:type="dxa"/>
-          </w:tcPr>
-          <w:p>
-            <w:pPr>
-              <w:jc w:val="center"/>
-              <w:rPr>
-                <w:rFonts w:ascii="Arial" w:cs="Arial" w:eastAsia="Arial" w:hAnsi="Arial"/>
-                <w:sz w:val="18"/>
-                <w:szCs w:val="18"/>
-              </w:rPr>
-            </w:pPr>
-            <w:r>
-              <w:rPr>
-                <w:rFonts w:ascii="Arial" w:cs="Arial" w:eastAsia="Arial" w:hAnsi="Arial"/>
-                <w:b w:val="1"/>
-                <w:bCs w:val="1"/>
-                <w:sz w:val="18"/>
-                <w:szCs w:val="18"/>
-                <w:rtl w:val="0"/>
-              </w:rPr>
-              <w:t xml:space="preserve">F1</w:t>
-            </w:r>
-          </w:p>
-        </w:tc>
-        <w:tc>
-          <w:tcPr>
-            <w:tcW w:w="1000" w:type="dxa"/>
-          </w:tcPr>
-          <w:p>
-            <w:pPr>
-              <w:jc w:val="center"/>
-              <w:rPr>
-                <w:rFonts w:ascii="Arial" w:cs="Arial" w:eastAsia="Arial" w:hAnsi="Arial"/>
-                <w:sz w:val="18"/>
-                <w:szCs w:val="18"/>
-              </w:rPr>
-            </w:pPr>
-            <w:r>
-              <w:rPr>
-                <w:rFonts w:ascii="Arial" w:cs="Arial" w:eastAsia="Arial" w:hAnsi="Arial"/>
-                <w:b w:val="1"/>
-                <w:bCs w:val="1"/>
-                <w:sz w:val="18"/>
-                <w:szCs w:val="18"/>
-                <w:rtl w:val="0"/>
-              </w:rPr>
-              <w:t xml:space="preserve">Recall</w:t>
-            </w:r>
-          </w:p>
-        </w:tc>
-        <w:tc>
-          <w:tcPr>
-            <w:tcW w:w="1000" w:type="dxa"/>
-          </w:tcPr>
-          <w:p>
-            <w:pPr>
-              <w:jc w:val="center"/>
-              <w:rPr>
-                <w:rFonts w:ascii="Arial" w:cs="Arial" w:eastAsia="Arial" w:hAnsi="Arial"/>
-                <w:sz w:val="18"/>
-                <w:szCs w:val="18"/>
-              </w:rPr>
-            </w:pPr>
-            <w:r>
-              <w:rPr>
-                <w:rFonts w:ascii="Arial" w:cs="Arial" w:eastAsia="Arial" w:hAnsi="Arial"/>
-                <w:b w:val="1"/>
-                <w:bCs w:val="1"/>
-                <w:sz w:val="18"/>
-                <w:szCs w:val="18"/>
-                <w:rtl w:val="0"/>
-              </w:rPr>
-              <w:t xml:space="preserve">Precisão</w:t>
-            </w:r>
-          </w:p>
-        </w:tc>
-        <w:tc>
-          <w:tcPr>
-            <w:tcW w:w="1000" w:type="dxa"/>
-          </w:tcPr>
-          <w:p>
-            <w:pPr>
-              <w:jc w:val="center"/>
-              <w:rPr>
-                <w:rFonts w:ascii="Arial" w:cs="Arial" w:eastAsia="Arial" w:hAnsi="Arial"/>
-                <w:sz w:val="18"/>
-                <w:szCs w:val="18"/>
-              </w:rPr>
-            </w:pPr>
-            <w:r>
-              <w:rPr>
-                <w:rFonts w:ascii="Arial" w:cs="Arial" w:eastAsia="Arial" w:hAnsi="Arial"/>
-                <w:b w:val="1"/>
-                <w:bCs w:val="1"/>
-                <w:sz w:val="18"/>
-                <w:szCs w:val="18"/>
-                <w:rtl w:val="0"/>
-              </w:rPr>
-              <w:t xml:space="preserve">ROC-AUC</w:t>
-            </w:r>
-          </w:p>
-        </w:tc>
-        <w:tc>
-          <w:tcPr>
-            <w:tcW w:w="1500" w:type="dxa"/>
-          </w:tcPr>
-          <w:p>
-            <w:pPr>
-              <w:jc w:val="center"/>
-              <w:rPr>
-                <w:rFonts w:ascii="Arial" w:cs="Arial" w:eastAsia="Arial" w:hAnsi="Arial"/>
-                <w:sz w:val="18"/>
-                <w:szCs w:val="18"/>
-              </w:rPr>
-            </w:pPr>
-            <w:r>
-              <w:rPr>
-                <w:rFonts w:ascii="Arial" w:cs="Arial" w:eastAsia="Arial" w:hAnsi="Arial"/>
-                <w:b w:val="1"/>
-                <w:bCs w:val="1"/>
-                <w:sz w:val="18"/>
-                <w:szCs w:val="18"/>
-                <w:rtl w:val="0"/>
-              </w:rPr>
-              <w:t xml:space="preserve">Dif. de F1 para o 1º</w:t>
-            </w:r>
-          </w:p>
-        </w:tc>
-        <w:tc>
-          <w:tcPr>
-            <w:tcW w:w="1500" w:type="dxa"/>
-          </w:tcPr>
-          <w:p>
-            <w:pPr>
-              <w:jc w:val="center"/>
-              <w:rPr>
-                <w:rFonts w:ascii="Arial" w:cs="Arial" w:eastAsia="Arial" w:hAnsi="Arial"/>
-                <w:sz w:val="18"/>
-                <w:szCs w:val="18"/>
-              </w:rPr>
-            </w:pPr>
-            <w:r>
-              <w:rPr>
-                <w:rFonts w:ascii="Arial" w:cs="Arial" w:eastAsia="Arial" w:hAnsi="Arial"/>
-                <w:b w:val="1"/>
-                <w:bCs w:val="1"/>
-                <w:sz w:val="18"/>
-                <w:szCs w:val="18"/>
-                <w:rtl w:val="0"/>
-              </w:rPr>
-              <w:t xml:space="preserve">Selecionado</w:t>
-            </w:r>
-          </w:p>
-        </w:tc>
-      </w:tr>
-      <w:tr>
-        <w:trPr>
-          <w:cantSplit w:val="0"/>
-          <w:tblHeader w:val="0"/>
-        </w:trPr>
-        <w:tc>
-          <w:tcPr>
-            <w:tcW w:w="2044" w:type="dxa"/>
-          </w:tcPr>
-          <w:p>
-            <w:pPr>
-              <w:jc w:val="left"/>
-              <w:rPr>
-                <w:rFonts w:ascii="Arial" w:cs="Arial" w:eastAsia="Arial" w:hAnsi="Arial"/>
-                <w:sz w:val="18"/>
-                <w:szCs w:val="18"/>
-              </w:rPr>
-            </w:pPr>
-            <w:r>
-              <w:rPr>
-                <w:rFonts w:ascii="Arial" w:cs="Arial" w:eastAsia="Arial" w:hAnsi="Arial"/>
-                <w:sz w:val="18"/>
-                <w:szCs w:val="18"/>
-                <w:rtl w:val="0"/>
-              </w:rPr>
-              <w:t xml:space="preserve">Regressão Logística</w:t>
-            </w:r>
-          </w:p>
-        </w:tc>
-        <w:tc>
-          <w:tcPr>
-            <w:tcW w:w="1700" w:type="dxa"/>
-          </w:tcPr>
-          <w:p>
-            <w:pPr>
-              <w:jc w:val="center"/>
-              <w:rPr>
-                <w:rFonts w:ascii="Arial" w:cs="Arial" w:eastAsia="Arial" w:hAnsi="Arial"/>
-                <w:sz w:val="18"/>
-                <w:szCs w:val="18"/>
-              </w:rPr>
-            </w:pPr>
-            <w:r>
-              <w:rPr>
-                <w:rFonts w:ascii="Arial" w:cs="Arial" w:eastAsia="Arial" w:hAnsi="Arial"/>
-                <w:sz w:val="18"/>
-                <w:szCs w:val="18"/>
-                <w:rtl w:val="0"/>
-              </w:rPr>
-              <w:t xml:space="preserve">0,826 ± 0,059</w:t>
-            </w:r>
-          </w:p>
-        </w:tc>
-        <w:tc>
-          <w:tcPr>
-            <w:tcW w:w="1000" w:type="dxa"/>
-          </w:tcPr>
-          <w:p>
-            <w:pPr>
-              <w:jc w:val="center"/>
-              <w:rPr>
-                <w:rFonts w:ascii="Arial" w:cs="Arial" w:eastAsia="Arial" w:hAnsi="Arial"/>
-                <w:sz w:val="18"/>
-                <w:szCs w:val="18"/>
-              </w:rPr>
-            </w:pPr>
-            <w:r>
-              <w:rPr>
-                <w:rFonts w:ascii="Arial" w:cs="Arial" w:eastAsia="Arial" w:hAnsi="Arial"/>
-                <w:sz w:val="18"/>
-                <w:szCs w:val="18"/>
-                <w:rtl w:val="0"/>
-              </w:rPr>
-              <w:t xml:space="preserve">0,798</w:t>
-            </w:r>
-          </w:p>
-        </w:tc>
-        <w:tc>
-          <w:tcPr>
-            <w:tcW w:w="1000" w:type="dxa"/>
-          </w:tcPr>
-          <w:p>
-            <w:pPr>
-              <w:jc w:val="center"/>
-              <w:rPr>
-                <w:rFonts w:ascii="Arial" w:cs="Arial" w:eastAsia="Arial" w:hAnsi="Arial"/>
-                <w:sz w:val="18"/>
-                <w:szCs w:val="18"/>
-              </w:rPr>
-            </w:pPr>
-            <w:r>
-              <w:rPr>
-                <w:rFonts w:ascii="Arial" w:cs="Arial" w:eastAsia="Arial" w:hAnsi="Arial"/>
-                <w:sz w:val="18"/>
-                <w:szCs w:val="18"/>
-                <w:rtl w:val="0"/>
-              </w:rPr>
-              <w:t xml:space="preserve">0,864</w:t>
-            </w:r>
-          </w:p>
-        </w:tc>
-        <w:tc>
-          <w:tcPr>
-            <w:tcW w:w="1000" w:type="dxa"/>
-          </w:tcPr>
-          <w:p>
-            <w:pPr>
-              <w:jc w:val="center"/>
-              <w:rPr>
-                <w:rFonts w:ascii="Arial" w:cs="Arial" w:eastAsia="Arial" w:hAnsi="Arial"/>
-                <w:sz w:val="18"/>
-                <w:szCs w:val="18"/>
-              </w:rPr>
-            </w:pPr>
-            <w:r>
-              <w:rPr>
-                <w:rFonts w:ascii="Arial" w:cs="Arial" w:eastAsia="Arial" w:hAnsi="Arial"/>
-                <w:sz w:val="18"/>
-                <w:szCs w:val="18"/>
-                <w:rtl w:val="0"/>
-              </w:rPr>
-              <w:t xml:space="preserve">0,909</w:t>
-            </w:r>
-          </w:p>
-        </w:tc>
-        <w:tc>
-          <w:tcPr>
-            <w:tcW w:w="1500" w:type="dxa"/>
-          </w:tcPr>
-          <w:p>
-            <w:pPr>
-              <w:jc w:val="center"/>
-              <w:rPr>
-                <w:rFonts w:ascii="Arial" w:cs="Arial" w:eastAsia="Arial" w:hAnsi="Arial"/>
-                <w:sz w:val="18"/>
-                <w:szCs w:val="18"/>
-              </w:rPr>
-            </w:pPr>
-            <w:r>
-              <w:rPr>
-                <w:rFonts w:ascii="Arial" w:cs="Arial" w:eastAsia="Arial" w:hAnsi="Arial"/>
-                <w:sz w:val="18"/>
-                <w:szCs w:val="18"/>
-                <w:rtl w:val="0"/>
-              </w:rPr>
-              <w:t xml:space="preserve">0,000</w:t>
-            </w:r>
-          </w:p>
-        </w:tc>
-        <w:tc>
-          <w:tcPr>
-            <w:tcW w:w="1500" w:type="dxa"/>
-          </w:tcPr>
-          <w:p>
-            <w:pPr>
-              <w:jc w:val="center"/>
-              <w:rPr>
-                <w:rFonts w:ascii="Arial" w:cs="Arial" w:eastAsia="Arial" w:hAnsi="Arial"/>
-                <w:sz w:val="18"/>
-                <w:szCs w:val="18"/>
-              </w:rPr>
-            </w:pPr>
-            <w:r>
-              <w:rPr>
-                <w:rFonts w:ascii="Arial" w:cs="Arial" w:eastAsia="Arial" w:hAnsi="Arial"/>
-                <w:sz w:val="18"/>
-                <w:szCs w:val="18"/>
-                <w:rtl w:val="0"/>
-              </w:rPr>
-              <w:t xml:space="preserve">sim</w:t>
-            </w:r>
-          </w:p>
-        </w:tc>
-      </w:tr>
-      <w:tr>
-        <w:trPr>
-          <w:cantSplit w:val="0"/>
-          <w:tblHeader w:val="0"/>
-        </w:trPr>
-        <w:tc>
-          <w:tcPr>
-            <w:tcW w:w="2044" w:type="dxa"/>
-          </w:tcPr>
-          <w:p>
-            <w:pPr>
-              <w:jc w:val="left"/>
-              <w:rPr>
-                <w:rFonts w:ascii="Arial" w:cs="Arial" w:eastAsia="Arial" w:hAnsi="Arial"/>
-                <w:sz w:val="18"/>
-                <w:szCs w:val="18"/>
-              </w:rPr>
-            </w:pPr>
-            <w:r>
-              <w:rPr>
-                <w:rFonts w:ascii="Arial" w:cs="Arial" w:eastAsia="Arial" w:hAnsi="Arial"/>
-                <w:sz w:val="18"/>
-                <w:szCs w:val="18"/>
-                <w:rtl w:val="0"/>
-              </w:rPr>
-              <w:t xml:space="preserve">KNN</w:t>
-            </w:r>
-          </w:p>
-        </w:tc>
-        <w:tc>
-          <w:tcPr>
-            <w:tcW w:w="1700" w:type="dxa"/>
-          </w:tcPr>
-          <w:p>
-            <w:pPr>
-              <w:jc w:val="center"/>
-              <w:rPr>
-                <w:rFonts w:ascii="Arial" w:cs="Arial" w:eastAsia="Arial" w:hAnsi="Arial"/>
-                <w:sz w:val="18"/>
-                <w:szCs w:val="18"/>
-              </w:rPr>
-            </w:pPr>
-            <w:r>
-              <w:rPr>
-                <w:rFonts w:ascii="Arial" w:cs="Arial" w:eastAsia="Arial" w:hAnsi="Arial"/>
-                <w:sz w:val="18"/>
-                <w:szCs w:val="18"/>
-                <w:rtl w:val="0"/>
-              </w:rPr>
-              <w:t xml:space="preserve">0,818 ± 0,055</w:t>
-            </w:r>
-          </w:p>
-        </w:tc>
-        <w:tc>
-          <w:tcPr>
-            <w:tcW w:w="1000" w:type="dxa"/>
-          </w:tcPr>
-          <w:p>
-            <w:pPr>
-              <w:jc w:val="center"/>
-              <w:rPr>
-                <w:rFonts w:ascii="Arial" w:cs="Arial" w:eastAsia="Arial" w:hAnsi="Arial"/>
-                <w:sz w:val="18"/>
-                <w:szCs w:val="18"/>
-              </w:rPr>
-            </w:pPr>
-            <w:r>
-              <w:rPr>
-                <w:rFonts w:ascii="Arial" w:cs="Arial" w:eastAsia="Arial" w:hAnsi="Arial"/>
-                <w:sz w:val="18"/>
-                <w:szCs w:val="18"/>
-                <w:rtl w:val="0"/>
-              </w:rPr>
-              <w:t xml:space="preserve">0,808</w:t>
-            </w:r>
-          </w:p>
-        </w:tc>
-        <w:tc>
-          <w:tcPr>
-            <w:tcW w:w="1000" w:type="dxa"/>
-          </w:tcPr>
-          <w:p>
-            <w:pPr>
-              <w:jc w:val="center"/>
-              <w:rPr>
-                <w:rFonts w:ascii="Arial" w:cs="Arial" w:eastAsia="Arial" w:hAnsi="Arial"/>
-                <w:sz w:val="18"/>
-                <w:szCs w:val="18"/>
-              </w:rPr>
-            </w:pPr>
-            <w:r>
-              <w:rPr>
-                <w:rFonts w:ascii="Arial" w:cs="Arial" w:eastAsia="Arial" w:hAnsi="Arial"/>
-                <w:sz w:val="18"/>
-                <w:szCs w:val="18"/>
-                <w:rtl w:val="0"/>
-              </w:rPr>
-              <w:t xml:space="preserve">0,833</w:t>
-            </w:r>
-          </w:p>
-        </w:tc>
-        <w:tc>
-          <w:tcPr>
-            <w:tcW w:w="1000" w:type="dxa"/>
-          </w:tcPr>
-          <w:p>
-            <w:pPr>
-              <w:jc w:val="center"/>
-              <w:rPr>
-                <w:rFonts w:ascii="Arial" w:cs="Arial" w:eastAsia="Arial" w:hAnsi="Arial"/>
-                <w:sz w:val="18"/>
-                <w:szCs w:val="18"/>
-              </w:rPr>
-            </w:pPr>
-            <w:r>
-              <w:rPr>
-                <w:rFonts w:ascii="Arial" w:cs="Arial" w:eastAsia="Arial" w:hAnsi="Arial"/>
-                <w:sz w:val="18"/>
-                <w:szCs w:val="18"/>
-                <w:rtl w:val="0"/>
-              </w:rPr>
-              <w:t xml:space="preserve">0,872</w:t>
-            </w:r>
-          </w:p>
-        </w:tc>
-        <w:tc>
-          <w:tcPr>
-            <w:tcW w:w="1500" w:type="dxa"/>
-          </w:tcPr>
-          <w:p>
-            <w:pPr>
-              <w:jc w:val="center"/>
-              <w:rPr>
-                <w:rFonts w:ascii="Arial" w:cs="Arial" w:eastAsia="Arial" w:hAnsi="Arial"/>
-                <w:sz w:val="18"/>
-                <w:szCs w:val="18"/>
-              </w:rPr>
-            </w:pPr>
-            <w:r>
-              <w:rPr>
-                <w:rFonts w:ascii="Arial" w:cs="Arial" w:eastAsia="Arial" w:hAnsi="Arial"/>
-                <w:sz w:val="18"/>
-                <w:szCs w:val="18"/>
-                <w:rtl w:val="0"/>
-              </w:rPr>
-              <w:t xml:space="preserve">0,008</w:t>
-            </w:r>
-          </w:p>
-        </w:tc>
-        <w:tc>
-          <w:tcPr>
-            <w:tcW w:w="1500" w:type="dxa"/>
-          </w:tcPr>
-          <w:p>
-            <w:pPr>
-              <w:jc w:val="center"/>
-              <w:rPr>
-                <w:rFonts w:ascii="Arial" w:cs="Arial" w:eastAsia="Arial" w:hAnsi="Arial"/>
-                <w:sz w:val="18"/>
-                <w:szCs w:val="18"/>
-              </w:rPr>
-            </w:pPr>
-            <w:r>
-              <w:rPr>
-                <w:rFonts w:ascii="Arial" w:cs="Arial" w:eastAsia="Arial" w:hAnsi="Arial"/>
-                <w:sz w:val="18"/>
-                <w:szCs w:val="18"/>
-                <w:rtl w:val="0"/>
-              </w:rPr>
-              <w:t xml:space="preserve">sim</w:t>
-            </w:r>
-          </w:p>
-        </w:tc>
-      </w:tr>
-      <w:tr>
-        <w:trPr>
-          <w:cantSplit w:val="0"/>
-          <w:tblHeader w:val="0"/>
-        </w:trPr>
-        <w:tc>
-          <w:tcPr>
-            <w:tcW w:w="2044" w:type="dxa"/>
-          </w:tcPr>
-          <w:p>
-            <w:pPr>
-              <w:jc w:val="left"/>
-              <w:rPr>
-                <w:rFonts w:ascii="Arial" w:cs="Arial" w:eastAsia="Arial" w:hAnsi="Arial"/>
-                <w:sz w:val="18"/>
-                <w:szCs w:val="18"/>
-              </w:rPr>
-            </w:pPr>
-            <w:r>
-              <w:rPr>
-                <w:rFonts w:ascii="Arial" w:cs="Arial" w:eastAsia="Arial" w:hAnsi="Arial"/>
-                <w:sz w:val="18"/>
-                <w:szCs w:val="18"/>
-                <w:rtl w:val="0"/>
-              </w:rPr>
-              <w:t xml:space="preserve">Random Forest</w:t>
-            </w:r>
-          </w:p>
-        </w:tc>
-        <w:tc>
-          <w:tcPr>
-            <w:tcW w:w="1700" w:type="dxa"/>
-          </w:tcPr>
-          <w:p>
-            <w:pPr>
-              <w:jc w:val="center"/>
-              <w:rPr>
-                <w:rFonts w:ascii="Arial" w:cs="Arial" w:eastAsia="Arial" w:hAnsi="Arial"/>
-                <w:sz w:val="18"/>
-                <w:szCs w:val="18"/>
-              </w:rPr>
-            </w:pPr>
-            <w:r>
-              <w:rPr>
-                <w:rFonts w:ascii="Arial" w:cs="Arial" w:eastAsia="Arial" w:hAnsi="Arial"/>
-                <w:sz w:val="18"/>
-                <w:szCs w:val="18"/>
-                <w:rtl w:val="0"/>
-              </w:rPr>
-              <w:t xml:space="preserve">0,809 ± 0,053</w:t>
-            </w:r>
-          </w:p>
-        </w:tc>
-        <w:tc>
-          <w:tcPr>
-            <w:tcW w:w="1000" w:type="dxa"/>
-          </w:tcPr>
-          <w:p>
-            <w:pPr>
-              <w:jc w:val="center"/>
-              <w:rPr>
-                <w:rFonts w:ascii="Arial" w:cs="Arial" w:eastAsia="Arial" w:hAnsi="Arial"/>
-                <w:sz w:val="18"/>
-                <w:szCs w:val="18"/>
-              </w:rPr>
-            </w:pPr>
-            <w:r>
-              <w:rPr>
-                <w:rFonts w:ascii="Arial" w:cs="Arial" w:eastAsia="Arial" w:hAnsi="Arial"/>
-                <w:sz w:val="18"/>
-                <w:szCs w:val="18"/>
-                <w:rtl w:val="0"/>
-              </w:rPr>
-              <w:t xml:space="preserve">0,796</w:t>
-            </w:r>
-          </w:p>
-        </w:tc>
-        <w:tc>
-          <w:tcPr>
-            <w:tcW w:w="1000" w:type="dxa"/>
-          </w:tcPr>
-          <w:p>
-            <w:pPr>
-              <w:jc w:val="center"/>
-              <w:rPr>
-                <w:rFonts w:ascii="Arial" w:cs="Arial" w:eastAsia="Arial" w:hAnsi="Arial"/>
-                <w:sz w:val="18"/>
-                <w:szCs w:val="18"/>
-              </w:rPr>
-            </w:pPr>
-            <w:r>
-              <w:rPr>
-                <w:rFonts w:ascii="Arial" w:cs="Arial" w:eastAsia="Arial" w:hAnsi="Arial"/>
-                <w:sz w:val="18"/>
-                <w:szCs w:val="18"/>
-                <w:rtl w:val="0"/>
-              </w:rPr>
-              <w:t xml:space="preserve">0,830</w:t>
-            </w:r>
-          </w:p>
-        </w:tc>
-        <w:tc>
-          <w:tcPr>
-            <w:tcW w:w="1000" w:type="dxa"/>
-          </w:tcPr>
-          <w:p>
-            <w:pPr>
-              <w:jc w:val="center"/>
-              <w:rPr>
-                <w:rFonts w:ascii="Arial" w:cs="Arial" w:eastAsia="Arial" w:hAnsi="Arial"/>
-                <w:sz w:val="18"/>
-                <w:szCs w:val="18"/>
-              </w:rPr>
-            </w:pPr>
-            <w:r>
-              <w:rPr>
-                <w:rFonts w:ascii="Arial" w:cs="Arial" w:eastAsia="Arial" w:hAnsi="Arial"/>
-                <w:sz w:val="18"/>
-                <w:szCs w:val="18"/>
-                <w:rtl w:val="0"/>
-              </w:rPr>
-              <w:t xml:space="preserve">0,904</w:t>
-            </w:r>
-          </w:p>
-        </w:tc>
-        <w:tc>
-          <w:tcPr>
-            <w:tcW w:w="1500" w:type="dxa"/>
-          </w:tcPr>
-          <w:p>
-            <w:pPr>
-              <w:jc w:val="center"/>
-              <w:rPr>
-                <w:rFonts w:ascii="Arial" w:cs="Arial" w:eastAsia="Arial" w:hAnsi="Arial"/>
-                <w:sz w:val="18"/>
-                <w:szCs w:val="18"/>
-              </w:rPr>
-            </w:pPr>
-            <w:r>
-              <w:rPr>
-                <w:rFonts w:ascii="Arial" w:cs="Arial" w:eastAsia="Arial" w:hAnsi="Arial"/>
-                <w:sz w:val="18"/>
-                <w:szCs w:val="18"/>
-                <w:rtl w:val="0"/>
-              </w:rPr>
-              <w:t xml:space="preserve">0,016</w:t>
-            </w:r>
-          </w:p>
-        </w:tc>
-        <w:tc>
-          <w:tcPr>
-            <w:tcW w:w="1500" w:type="dxa"/>
-          </w:tcPr>
-          <w:p>
-            <w:pPr>
-              <w:jc w:val="center"/>
-              <w:rPr>
-                <w:rFonts w:ascii="Arial" w:cs="Arial" w:eastAsia="Arial" w:hAnsi="Arial"/>
-                <w:sz w:val="18"/>
-                <w:szCs w:val="18"/>
-              </w:rPr>
-            </w:pPr>
-            <w:r>
-              <w:rPr>
-                <w:rFonts w:ascii="Arial" w:cs="Arial" w:eastAsia="Arial" w:hAnsi="Arial"/>
-                <w:sz w:val="18"/>
-                <w:szCs w:val="18"/>
-                <w:rtl w:val="0"/>
-              </w:rPr>
-              <w:t xml:space="preserve">sim</w:t>
-            </w:r>
-          </w:p>
-        </w:tc>
-      </w:tr>
-      <w:tr>
-        <w:trPr>
-          <w:cantSplit w:val="0"/>
-          <w:tblHeader w:val="0"/>
-        </w:trPr>
-        <w:tc>
-          <w:tcPr>
-            <w:tcW w:w="2044" w:type="dxa"/>
-          </w:tcPr>
-          <w:p>
-            <w:pPr>
-              <w:jc w:val="left"/>
-              <w:rPr>
-                <w:rFonts w:ascii="Arial" w:cs="Arial" w:eastAsia="Arial" w:hAnsi="Arial"/>
-                <w:sz w:val="18"/>
-                <w:szCs w:val="18"/>
-              </w:rPr>
-            </w:pPr>
-            <w:r>
-              <w:rPr>
-                <w:rFonts w:ascii="Arial" w:cs="Arial" w:eastAsia="Arial" w:hAnsi="Arial"/>
-                <w:sz w:val="18"/>
-                <w:szCs w:val="18"/>
-                <w:rtl w:val="0"/>
-              </w:rPr>
-              <w:t xml:space="preserve">Gradient Boosting</w:t>
-            </w:r>
-          </w:p>
-        </w:tc>
-        <w:tc>
-          <w:tcPr>
-            <w:tcW w:w="1700" w:type="dxa"/>
-          </w:tcPr>
-          <w:p>
-            <w:pPr>
-              <w:jc w:val="center"/>
-              <w:rPr>
-                <w:rFonts w:ascii="Arial" w:cs="Arial" w:eastAsia="Arial" w:hAnsi="Arial"/>
-                <w:sz w:val="18"/>
-                <w:szCs w:val="18"/>
-              </w:rPr>
-            </w:pPr>
-            <w:r>
-              <w:rPr>
-                <w:rFonts w:ascii="Arial" w:cs="Arial" w:eastAsia="Arial" w:hAnsi="Arial"/>
-                <w:sz w:val="18"/>
-                <w:szCs w:val="18"/>
-                <w:rtl w:val="0"/>
-              </w:rPr>
-              <w:t xml:space="preserve">0,781 ± 0,053</w:t>
-            </w:r>
-          </w:p>
-        </w:tc>
-        <w:tc>
-          <w:tcPr>
-            <w:tcW w:w="1000" w:type="dxa"/>
-          </w:tcPr>
-          <w:p>
-            <w:pPr>
-              <w:jc w:val="center"/>
-              <w:rPr>
-                <w:rFonts w:ascii="Arial" w:cs="Arial" w:eastAsia="Arial" w:hAnsi="Arial"/>
-                <w:sz w:val="18"/>
-                <w:szCs w:val="18"/>
-              </w:rPr>
-            </w:pPr>
-            <w:r>
-              <w:rPr>
-                <w:rFonts w:ascii="Arial" w:cs="Arial" w:eastAsia="Arial" w:hAnsi="Arial"/>
-                <w:sz w:val="18"/>
-                <w:szCs w:val="18"/>
-                <w:rtl w:val="0"/>
-              </w:rPr>
-              <w:t xml:space="preserve">0,782</w:t>
-            </w:r>
-          </w:p>
-        </w:tc>
-        <w:tc>
-          <w:tcPr>
-            <w:tcW w:w="1000" w:type="dxa"/>
-          </w:tcPr>
-          <w:p>
-            <w:pPr>
-              <w:jc w:val="center"/>
-              <w:rPr>
-                <w:rFonts w:ascii="Arial" w:cs="Arial" w:eastAsia="Arial" w:hAnsi="Arial"/>
-                <w:sz w:val="18"/>
-                <w:szCs w:val="18"/>
-              </w:rPr>
-            </w:pPr>
-            <w:r>
-              <w:rPr>
-                <w:rFonts w:ascii="Arial" w:cs="Arial" w:eastAsia="Arial" w:hAnsi="Arial"/>
-                <w:sz w:val="18"/>
-                <w:szCs w:val="18"/>
-                <w:rtl w:val="0"/>
-              </w:rPr>
-              <w:t xml:space="preserve">0,786</w:t>
-            </w:r>
-          </w:p>
-        </w:tc>
-        <w:tc>
-          <w:tcPr>
-            <w:tcW w:w="1000" w:type="dxa"/>
-          </w:tcPr>
-          <w:p>
-            <w:pPr>
-              <w:jc w:val="center"/>
-              <w:rPr>
-                <w:rFonts w:ascii="Arial" w:cs="Arial" w:eastAsia="Arial" w:hAnsi="Arial"/>
-                <w:sz w:val="18"/>
-                <w:szCs w:val="18"/>
-              </w:rPr>
-            </w:pPr>
-            <w:r>
-              <w:rPr>
-                <w:rFonts w:ascii="Arial" w:cs="Arial" w:eastAsia="Arial" w:hAnsi="Arial"/>
-                <w:sz w:val="18"/>
-                <w:szCs w:val="18"/>
-                <w:rtl w:val="0"/>
-              </w:rPr>
-              <w:t xml:space="preserve">0,878</w:t>
-            </w:r>
-          </w:p>
-        </w:tc>
-        <w:tc>
-          <w:tcPr>
-            <w:tcW w:w="1500" w:type="dxa"/>
-          </w:tcPr>
-          <w:p>
-            <w:pPr>
-              <w:jc w:val="center"/>
-              <w:rPr>
-                <w:rFonts w:ascii="Arial" w:cs="Arial" w:eastAsia="Arial" w:hAnsi="Arial"/>
-                <w:sz w:val="18"/>
-                <w:szCs w:val="18"/>
-              </w:rPr>
-            </w:pPr>
-            <w:r>
-              <w:rPr>
-                <w:rFonts w:ascii="Arial" w:cs="Arial" w:eastAsia="Arial" w:hAnsi="Arial"/>
-                <w:sz w:val="18"/>
-                <w:szCs w:val="18"/>
-                <w:rtl w:val="0"/>
-              </w:rPr>
-              <w:t xml:space="preserve">0,045</w:t>
-            </w:r>
-          </w:p>
-        </w:tc>
-        <w:tc>
-          <w:tcPr>
-            <w:tcW w:w="1500" w:type="dxa"/>
-          </w:tcPr>
-          <w:p>
-            <w:pPr>
-              <w:jc w:val="center"/>
-              <w:rPr>
-                <w:rFonts w:ascii="Arial" w:cs="Arial" w:eastAsia="Arial" w:hAnsi="Arial"/>
-                <w:sz w:val="18"/>
-                <w:szCs w:val="18"/>
-              </w:rPr>
-            </w:pPr>
-            <w:r>
-              <w:rPr>
-                <w:rFonts w:ascii="Arial" w:cs="Arial" w:eastAsia="Arial" w:hAnsi="Arial"/>
-                <w:sz w:val="18"/>
-                <w:szCs w:val="18"/>
-                <w:rtl w:val="0"/>
-              </w:rPr>
-              <w:t xml:space="preserve">não</w:t>
-            </w:r>
-          </w:p>
-        </w:tc>
-      </w:tr>
-      <w:tr>
-        <w:trPr>
-          <w:cantSplit w:val="0"/>
-          <w:tblHeader w:val="0"/>
-        </w:trPr>
-        <w:tc>
-          <w:tcPr>
-            <w:tcW w:w="2044" w:type="dxa"/>
-          </w:tcPr>
-          <w:p>
-            <w:pPr>
-              <w:jc w:val="left"/>
-              <w:rPr>
-                <w:rFonts w:ascii="Arial" w:cs="Arial" w:eastAsia="Arial" w:hAnsi="Arial"/>
-                <w:sz w:val="18"/>
-                <w:szCs w:val="18"/>
-              </w:rPr>
-            </w:pPr>
-            <w:r>
-              <w:rPr>
-                <w:rFonts w:ascii="Arial" w:cs="Arial" w:eastAsia="Arial" w:hAnsi="Arial"/>
-                <w:sz w:val="18"/>
-                <w:szCs w:val="18"/>
-                <w:rtl w:val="0"/>
-              </w:rPr>
-              <w:t xml:space="preserve">Rede Neural (MLP)</w:t>
-            </w:r>
-          </w:p>
-        </w:tc>
-        <w:tc>
-          <w:tcPr>
-            <w:tcW w:w="1700" w:type="dxa"/>
-          </w:tcPr>
-          <w:p>
-            <w:pPr>
-              <w:jc w:val="center"/>
-              <w:rPr>
-                <w:rFonts w:ascii="Arial" w:cs="Arial" w:eastAsia="Arial" w:hAnsi="Arial"/>
-                <w:sz w:val="18"/>
-                <w:szCs w:val="18"/>
-              </w:rPr>
-            </w:pPr>
-            <w:r>
-              <w:rPr>
-                <w:rFonts w:ascii="Arial" w:cs="Arial" w:eastAsia="Arial" w:hAnsi="Arial"/>
-                <w:sz w:val="18"/>
-                <w:szCs w:val="18"/>
-                <w:rtl w:val="0"/>
-              </w:rPr>
-              <w:t xml:space="preserve">0,773 ± 0,062</w:t>
-            </w:r>
-          </w:p>
-        </w:tc>
-        <w:tc>
-          <w:tcPr>
-            <w:tcW w:w="1000" w:type="dxa"/>
-          </w:tcPr>
-          <w:p>
-            <w:pPr>
-              <w:jc w:val="center"/>
-              <w:rPr>
-                <w:rFonts w:ascii="Arial" w:cs="Arial" w:eastAsia="Arial" w:hAnsi="Arial"/>
-                <w:sz w:val="18"/>
-                <w:szCs w:val="18"/>
-              </w:rPr>
-            </w:pPr>
-            <w:r>
-              <w:rPr>
-                <w:rFonts w:ascii="Arial" w:cs="Arial" w:eastAsia="Arial" w:hAnsi="Arial"/>
-                <w:sz w:val="18"/>
-                <w:szCs w:val="18"/>
-                <w:rtl w:val="0"/>
-              </w:rPr>
-              <w:t xml:space="preserve">0,756</w:t>
-            </w:r>
-          </w:p>
-        </w:tc>
-        <w:tc>
-          <w:tcPr>
-            <w:tcW w:w="1000" w:type="dxa"/>
-          </w:tcPr>
-          <w:p>
-            <w:pPr>
-              <w:jc w:val="center"/>
-              <w:rPr>
-                <w:rFonts w:ascii="Arial" w:cs="Arial" w:eastAsia="Arial" w:hAnsi="Arial"/>
-                <w:sz w:val="18"/>
-                <w:szCs w:val="18"/>
-              </w:rPr>
-            </w:pPr>
-            <w:r>
-              <w:rPr>
-                <w:rFonts w:ascii="Arial" w:cs="Arial" w:eastAsia="Arial" w:hAnsi="Arial"/>
-                <w:sz w:val="18"/>
-                <w:szCs w:val="18"/>
-                <w:rtl w:val="0"/>
-              </w:rPr>
-              <w:t xml:space="preserve">0,801</w:t>
-            </w:r>
-          </w:p>
-        </w:tc>
-        <w:tc>
-          <w:tcPr>
-            <w:tcW w:w="1000" w:type="dxa"/>
-          </w:tcPr>
-          <w:p>
-            <w:pPr>
-              <w:jc w:val="center"/>
-              <w:rPr>
-                <w:rFonts w:ascii="Arial" w:cs="Arial" w:eastAsia="Arial" w:hAnsi="Arial"/>
-                <w:sz w:val="18"/>
-                <w:szCs w:val="18"/>
-              </w:rPr>
-            </w:pPr>
-            <w:r>
-              <w:rPr>
-                <w:rFonts w:ascii="Arial" w:cs="Arial" w:eastAsia="Arial" w:hAnsi="Arial"/>
-                <w:sz w:val="18"/>
-                <w:szCs w:val="18"/>
-                <w:rtl w:val="0"/>
-              </w:rPr>
-              <w:t xml:space="preserve">0,867</w:t>
-            </w:r>
-          </w:p>
-        </w:tc>
-        <w:tc>
-          <w:tcPr>
-            <w:tcW w:w="1500" w:type="dxa"/>
-          </w:tcPr>
-          <w:p>
-            <w:pPr>
-              <w:jc w:val="center"/>
-              <w:rPr>
-                <w:rFonts w:ascii="Arial" w:cs="Arial" w:eastAsia="Arial" w:hAnsi="Arial"/>
-                <w:sz w:val="18"/>
-                <w:szCs w:val="18"/>
-              </w:rPr>
-            </w:pPr>
-            <w:r>
-              <w:rPr>
-                <w:rFonts w:ascii="Arial" w:cs="Arial" w:eastAsia="Arial" w:hAnsi="Arial"/>
-                <w:sz w:val="18"/>
-                <w:szCs w:val="18"/>
-                <w:rtl w:val="0"/>
-              </w:rPr>
-              <w:t xml:space="preserve">0,053</w:t>
-            </w:r>
-          </w:p>
-        </w:tc>
-        <w:tc>
-          <w:tcPr>
-            <w:tcW w:w="1500" w:type="dxa"/>
-          </w:tcPr>
-          <w:p>
-            <w:pPr>
-              <w:jc w:val="center"/>
-              <w:rPr>
-                <w:rFonts w:ascii="Arial" w:cs="Arial" w:eastAsia="Arial" w:hAnsi="Arial"/>
-                <w:sz w:val="18"/>
-                <w:szCs w:val="18"/>
-              </w:rPr>
-            </w:pPr>
-            <w:r>
-              <w:rPr>
-                <w:rFonts w:ascii="Arial" w:cs="Arial" w:eastAsia="Arial" w:hAnsi="Arial"/>
-                <w:sz w:val="18"/>
-                <w:szCs w:val="18"/>
-                <w:rtl w:val="0"/>
-              </w:rPr>
-              <w:t xml:space="preserve">não</w:t>
-            </w:r>
-          </w:p>
-        </w:tc>
-      </w:tr>
-      <w:tr>
-        <w:trPr>
-          <w:cantSplit w:val="0"/>
-          <w:tblHeader w:val="0"/>
-        </w:trPr>
-        <w:tc>
-          <w:tcPr>
-            <w:tcW w:w="2044" w:type="dxa"/>
-          </w:tcPr>
-          <w:p>
-            <w:pPr>
-              <w:jc w:val="left"/>
-              <w:rPr>
-                <w:rFonts w:ascii="Arial" w:cs="Arial" w:eastAsia="Arial" w:hAnsi="Arial"/>
-                <w:sz w:val="18"/>
-                <w:szCs w:val="18"/>
-              </w:rPr>
-            </w:pPr>
-            <w:r>
-              <w:rPr>
-                <w:rFonts w:ascii="Arial" w:cs="Arial" w:eastAsia="Arial" w:hAnsi="Arial"/>
-                <w:sz w:val="18"/>
-                <w:szCs w:val="18"/>
-                <w:rtl w:val="0"/>
-              </w:rPr>
-              <w:t xml:space="preserve">Árvore de Decisão</w:t>
-            </w:r>
-          </w:p>
-        </w:tc>
-        <w:tc>
-          <w:tcPr>
-            <w:tcW w:w="1700" w:type="dxa"/>
-          </w:tcPr>
-          <w:p>
-            <w:pPr>
-              <w:jc w:val="center"/>
-              <w:rPr>
-                <w:rFonts w:ascii="Arial" w:cs="Arial" w:eastAsia="Arial" w:hAnsi="Arial"/>
-                <w:sz w:val="18"/>
-                <w:szCs w:val="18"/>
-              </w:rPr>
-            </w:pPr>
-            <w:r>
-              <w:rPr>
-                <w:rFonts w:ascii="Arial" w:cs="Arial" w:eastAsia="Arial" w:hAnsi="Arial"/>
-                <w:sz w:val="18"/>
-                <w:szCs w:val="18"/>
-                <w:rtl w:val="0"/>
-              </w:rPr>
-              <w:t xml:space="preserve">0,729 ± 0,056</w:t>
-            </w:r>
-          </w:p>
-        </w:tc>
-        <w:tc>
-          <w:tcPr>
-            <w:tcW w:w="1000" w:type="dxa"/>
-          </w:tcPr>
-          <w:p>
-            <w:pPr>
-              <w:jc w:val="center"/>
-              <w:rPr>
-                <w:rFonts w:ascii="Arial" w:cs="Arial" w:eastAsia="Arial" w:hAnsi="Arial"/>
-                <w:sz w:val="18"/>
-                <w:szCs w:val="18"/>
-              </w:rPr>
-            </w:pPr>
-            <w:r>
-              <w:rPr>
-                <w:rFonts w:ascii="Arial" w:cs="Arial" w:eastAsia="Arial" w:hAnsi="Arial"/>
-                <w:sz w:val="18"/>
-                <w:szCs w:val="18"/>
-                <w:rtl w:val="0"/>
-              </w:rPr>
-              <w:t xml:space="preserve">0,740</w:t>
-            </w:r>
-          </w:p>
-        </w:tc>
-        <w:tc>
-          <w:tcPr>
-            <w:tcW w:w="1000" w:type="dxa"/>
-          </w:tcPr>
-          <w:p>
-            <w:pPr>
-              <w:jc w:val="center"/>
-              <w:rPr>
-                <w:rFonts w:ascii="Arial" w:cs="Arial" w:eastAsia="Arial" w:hAnsi="Arial"/>
-                <w:sz w:val="18"/>
-                <w:szCs w:val="18"/>
-              </w:rPr>
-            </w:pPr>
-            <w:r>
-              <w:rPr>
-                <w:rFonts w:ascii="Arial" w:cs="Arial" w:eastAsia="Arial" w:hAnsi="Arial"/>
-                <w:sz w:val="18"/>
-                <w:szCs w:val="18"/>
-                <w:rtl w:val="0"/>
-              </w:rPr>
-              <w:t xml:space="preserve">0,725</w:t>
-            </w:r>
-          </w:p>
-        </w:tc>
-        <w:tc>
-          <w:tcPr>
-            <w:tcW w:w="1000" w:type="dxa"/>
-          </w:tcPr>
-          <w:p>
-            <w:pPr>
-              <w:jc w:val="center"/>
-              <w:rPr>
-                <w:rFonts w:ascii="Arial" w:cs="Arial" w:eastAsia="Arial" w:hAnsi="Arial"/>
-                <w:sz w:val="18"/>
-                <w:szCs w:val="18"/>
-              </w:rPr>
-            </w:pPr>
-            <w:r>
-              <w:rPr>
-                <w:rFonts w:ascii="Arial" w:cs="Arial" w:eastAsia="Arial" w:hAnsi="Arial"/>
-                <w:sz w:val="18"/>
-                <w:szCs w:val="18"/>
-                <w:rtl w:val="0"/>
-              </w:rPr>
-              <w:t xml:space="preserve">0,749</w:t>
-            </w:r>
-          </w:p>
-        </w:tc>
-        <w:tc>
-          <w:tcPr>
-            <w:tcW w:w="1500" w:type="dxa"/>
-          </w:tcPr>
-          <w:p>
-            <w:pPr>
-              <w:jc w:val="center"/>
-              <w:rPr>
-                <w:rFonts w:ascii="Arial" w:cs="Arial" w:eastAsia="Arial" w:hAnsi="Arial"/>
-                <w:sz w:val="18"/>
-                <w:szCs w:val="18"/>
-              </w:rPr>
-            </w:pPr>
-            <w:r>
-              <w:rPr>
-                <w:rFonts w:ascii="Arial" w:cs="Arial" w:eastAsia="Arial" w:hAnsi="Arial"/>
-                <w:sz w:val="18"/>
-                <w:szCs w:val="18"/>
-                <w:rtl w:val="0"/>
-              </w:rPr>
-              <w:t xml:space="preserve">0,097</w:t>
-            </w:r>
-          </w:p>
-        </w:tc>
-        <w:tc>
-          <w:tcPr>
-            <w:tcW w:w="1500" w:type="dxa"/>
-          </w:tcPr>
-          <w:p>
-            <w:pPr>
-              <w:jc w:val="center"/>
-              <w:rPr>
-                <w:rFonts w:ascii="Arial" w:cs="Arial" w:eastAsia="Arial" w:hAnsi="Arial"/>
-                <w:sz w:val="18"/>
-                <w:szCs w:val="18"/>
-              </w:rPr>
-            </w:pPr>
-            <w:r>
-              <w:rPr>
-                <w:rFonts w:ascii="Arial" w:cs="Arial" w:eastAsia="Arial" w:hAnsi="Arial"/>
-                <w:sz w:val="18"/>
-                <w:szCs w:val="18"/>
-                <w:rtl w:val="0"/>
-              </w:rPr>
-              <w:t xml:space="preserve">não</w:t>
-            </w:r>
-          </w:p>
-        </w:tc>
-      </w:tr>
-    </w:tbl>
-    <w:p>
-      <w:pPr>
-        <w:jc w:val="both"/>
-        <w:rPr>
-          <w:rFonts w:ascii="Arial" w:cs="Arial" w:eastAsia="Arial" w:hAnsi="Arial"/>
-          <w:sz w:val="18"/>
-          <w:szCs w:val="18"/>
-        </w:rPr>
-      </w:pPr>
-      <w:r>
-        <w:rPr>
-          <w:rFonts w:ascii="Arial" w:cs="Arial" w:eastAsia="Arial" w:hAnsi="Arial"/>
-          <w:sz w:val="18"/>
-          <w:szCs w:val="18"/>
-          <w:rtl w:val="0"/>
-        </w:rPr>
-        <w:t xml:space="preserve">Médias nas 50 avaliações (5 folds × 10 repetições); F1 com desvio padrão. Classe positiva: com doença.</w:t>
-      </w:r>
-    </w:p>
-    <w:p>
-      <w:pPr>
-        <w:jc w:val="center"/>
-      </w:pPr>
-      <w:r>
-        <w:drawing>
-          <wp:inline distT="0" distB="0" distL="0" distR="0">
-            <wp:extent cx="5486400" cy="2698595"/>
-            <wp:docPr id="902" name="Gráfico seleção"/>
-            <wp:cNvGraphicFramePr>
-              <a:graphicFrameLocks noChangeAspect="1"/>
-            </wp:cNvGraphicFramePr>
-            <a:graphic>
-              <a:graphicData uri="http://schemas.openxmlformats.org/drawingml/2006/picture">
-                <pic:pic>
-                  <pic:nvPicPr>
-                    <pic:cNvPr id="902" name="grafico_selecao.png"/>
-                    <pic:cNvPicPr/>
-                  </pic:nvPicPr>
-                  <pic:blipFill>
-                    <a:blip r:embed="rIdGraficoSelecao"/>
-                    <a:stretch>
-                      <a:fillRect/>
-                    </a:stretch>
-                  </pic:blipFill>
-                  <pic:spPr>
-                    <a:xfrm>
-                      <a:off x="0" y="0"/>
-                      <a:ext cx="5486400" cy="2698595"/>
-                    </a:xfrm>
-                    <a:prstGeom prst="rect">
-                      <a:avLst/>
-                    </a:prstGeom>
-                  </pic:spPr>
-                </pic:pic>
-              </a:graphicData>
-            </a:graphic>
-          </wp:inline>
-        </w:drawing>
-      </w:r>
-    </w:p>
-    <w:p>
-      <w:pPr>
-        <w:jc w:val="center"/>
-        <w:rPr>
-          <w:rFonts w:ascii="Arial" w:cs="Arial" w:eastAsia="Arial" w:hAnsi="Arial"/>
-          <w:sz w:val="18"/>
-          <w:szCs w:val="18"/>
-        </w:rPr>
-      </w:pPr>
-      <w:r>
-        <w:rPr>
-          <w:rFonts w:ascii="Arial" w:cs="Arial" w:eastAsia="Arial" w:hAnsi="Arial"/>
-          <w:sz w:val="18"/>
-          <w:szCs w:val="18"/>
-          <w:rtl w:val="0"/>
-        </w:rPr>
-        <w:t xml:space="preserve">F1 nas 50 avaliações de cada algoritmo, com os modelos selecionados para o T2 destacados; o losango indica a média.</w:t>
+        <w:t xml:space="preserve"> para o T2, especialmente pelo fato de possuírem as três maiores médias de F1 no spot-checking, mas também porque representam modelos inerentemente interpretáveis (Regressão e KNN, apesar do KNN sofrer um pouco pelos dados possuírem alta dimensionalidade) ou derivado do ensemble de modelos inerentemente interpretáveis (Random Forest, apesar de não ser propriamente interpretável) - assim, entendemos que será mais fácil e intuitivo realizar o julgamento e tomada de decisões quando eventualmente precisarmos no segundo trabalho. Além disso, será especialmente interessante realizar a comparação entre um modelo "preguiçoso"/que não constrói um modelo no treinamento e possui 1 hiperparâmetro principal, um modelo linear único com poucos hiperparâmetros e um modelo que é um ensemble de vários outros modelos treinados (árvores) com muitos hiperparâmetros.</w:t>
       </w:r>
     </w:p>
     <w:p>
@@ -6002,7 +4240,258 @@
           <w:szCs w:val="22"/>
           <w:rtl w:val="0"/>
         </w:rPr>
-        <w:t xml:space="preserve">Utilizamos o Claude (Anthropic, 2026), por meio do Claude Code, como apoio: na análise exploratória e na geração de gráficos; na verificação da codificação do dataset do Kaggle em relação à base original da UCI; em sugestões de pré-processamento, métricas e protocolo de validação; na geração do código do notebook; e na estruturação e redação de rascunhos das seções descritivas deste relatório, revisados pelo grupo. As decisões metodológicas (algoritmos, métrica principal, estratégia de validação e seleção dos modelos para o T2) foram tomadas pelo grupo, e a interpretação dos resultados é de nossa autoria.</w:t>
+        <w:t xml:space="preserve">Utilizamos o Claude Opus 5.5 (Anthropic, 2026), por meio do Claude Code, como apoio: na análise exploratória e na geração de gráficos; na verificação da codificação do dataset do Kaggle em relação à base original da UCI; em sugestões de pré-processamento, métricas e protocolo de validação; na geração do código do notebook; e na estruturação e redação de rascunhos das seções descritivas (como tabelas) deste relatório, revisados pelo grupo. As decisões metodológicas (algoritmos, métrica principal, estratégia de validação e seleção dos modelos para o T2) foram tomadas pelo grupo, e a interpretação dos resultados é de nossa autoria.</w:t>
+      </w:r>
+    </w:p>
+    <w:p>
+      <w:pPr>
+        <w:pStyle w:val="Heading2"/>
+        <w:jc w:val="both"/>
+        <w:rPr>
+          <w:rFonts w:ascii="Arial" w:cs="Arial" w:eastAsia="Arial" w:hAnsi="Arial"/>
+          <w:sz w:val="22"/>
+          <w:szCs w:val="22"/>
+        </w:rPr>
+      </w:pPr>
+      <w:r>
+        <w:rPr>
+          <w:rFonts w:ascii="Arial" w:cs="Arial" w:eastAsia="Arial" w:hAnsi="Arial"/>
+          <w:sz w:val="22"/>
+          <w:szCs w:val="22"/>
+          <w:rtl w:val="0"/>
+        </w:rPr>
+        <w:t xml:space="preserve">Resumo dos prompts utilizados</w:t>
+      </w:r>
+    </w:p>
+    <w:p>
+      <w:pPr>
+        <w:spacing w:after="80" w:before="0"/>
+        <w:ind w:left="360" w:right="0" w:hanging="360"/>
+        <w:jc w:val="both"/>
+        <w:rPr>
+          <w:rFonts w:ascii="Arial" w:cs="Arial" w:eastAsia="Arial" w:hAnsi="Arial"/>
+          <w:sz w:val="22"/>
+          <w:szCs w:val="22"/>
+        </w:rPr>
+      </w:pPr>
+      <w:r>
+        <w:rPr>
+          <w:rFonts w:ascii="Arial" w:cs="Arial" w:eastAsia="Arial" w:hAnsi="Arial"/>
+          <w:sz w:val="22"/>
+          <w:szCs w:val="22"/>
+          <w:rtl w:val="0"/>
+        </w:rPr>
+        <w:t xml:space="preserve">1. Realizar a análise exploratória dos dados (passo 1 do enunciado) no notebook, tomando como base o enunciado e os notebooks da disciplina e considerando que o projeto seria levado ao Google Colab.</w:t>
+      </w:r>
+    </w:p>
+    <w:p>
+      <w:pPr>
+        <w:spacing w:after="80" w:before="0"/>
+        <w:ind w:left="360" w:right="0" w:hanging="360"/>
+        <w:jc w:val="both"/>
+        <w:rPr>
+          <w:rFonts w:ascii="Arial" w:cs="Arial" w:eastAsia="Arial" w:hAnsi="Arial"/>
+          <w:sz w:val="22"/>
+          <w:szCs w:val="22"/>
+        </w:rPr>
+      </w:pPr>
+      <w:r>
+        <w:rPr>
+          <w:rFonts w:ascii="Arial" w:cs="Arial" w:eastAsia="Arial" w:hAnsi="Arial"/>
+          <w:sz w:val="22"/>
+          <w:szCs w:val="22"/>
+          <w:rtl w:val="0"/>
+        </w:rPr>
+        <w:t xml:space="preserve">2. Incluir na EDA gráficos que ajudassem a visualizar o que precisaria de pré-processamento.</w:t>
+      </w:r>
+    </w:p>
+    <w:p>
+      <w:pPr>
+        <w:spacing w:after="80" w:before="0"/>
+        <w:ind w:left="360" w:right="0" w:hanging="360"/>
+        <w:jc w:val="both"/>
+        <w:rPr>
+          <w:rFonts w:ascii="Arial" w:cs="Arial" w:eastAsia="Arial" w:hAnsi="Arial"/>
+          <w:sz w:val="22"/>
+          <w:szCs w:val="22"/>
+        </w:rPr>
+      </w:pPr>
+      <w:r>
+        <w:rPr>
+          <w:rFonts w:ascii="Arial" w:cs="Arial" w:eastAsia="Arial" w:hAnsi="Arial"/>
+          <w:sz w:val="22"/>
+          <w:szCs w:val="22"/>
+          <w:rtl w:val="0"/>
+        </w:rPr>
+        <w:t xml:space="preserve">3. Dividir os dados em treino e teste antes do pré-processamento, para evitar data leakage.</w:t>
+      </w:r>
+    </w:p>
+    <w:p>
+      <w:pPr>
+        <w:spacing w:after="80" w:before="0"/>
+        <w:ind w:left="360" w:right="0" w:hanging="360"/>
+        <w:jc w:val="both"/>
+        <w:rPr>
+          <w:rFonts w:ascii="Arial" w:cs="Arial" w:eastAsia="Arial" w:hAnsi="Arial"/>
+          <w:sz w:val="22"/>
+          <w:szCs w:val="22"/>
+        </w:rPr>
+      </w:pPr>
+      <w:r>
+        <w:rPr>
+          <w:rFonts w:ascii="Arial" w:cs="Arial" w:eastAsia="Arial" w:hAnsi="Arial"/>
+          <w:sz w:val="22"/>
+          <w:szCs w:val="22"/>
+          <w:rtl w:val="0"/>
+        </w:rPr>
+        <w:t xml:space="preserve">4. Preencher o relatório conforme o andamento, seguindo o template; verificar se os valores de ca e thal eram realmente inválidos, considerando a descrição do Kaggle; remover da EDA as seções consideradas desnecessárias e reorganizar a numeração.</w:t>
+      </w:r>
+    </w:p>
+    <w:p>
+      <w:pPr>
+        <w:spacing w:after="80" w:before="0"/>
+        <w:ind w:left="360" w:right="0" w:hanging="360"/>
+        <w:jc w:val="both"/>
+        <w:rPr>
+          <w:rFonts w:ascii="Arial" w:cs="Arial" w:eastAsia="Arial" w:hAnsi="Arial"/>
+          <w:sz w:val="22"/>
+          <w:szCs w:val="22"/>
+        </w:rPr>
+      </w:pPr>
+      <w:r>
+        <w:rPr>
+          <w:rFonts w:ascii="Arial" w:cs="Arial" w:eastAsia="Arial" w:hAnsi="Arial"/>
+          <w:sz w:val="22"/>
+          <w:szCs w:val="22"/>
+          <w:rtl w:val="0"/>
+        </w:rPr>
+        <w:t xml:space="preserve">5. Explicar com que evidência foi concluído que o target estava invertido; juntar e remover seções da EDA; iniciar o pré-processamento (normalização, remoção da duplicata e imputação pela mediana), justificando cada decisão; implementar a definição do problema com a abordagem e os algoritmos escolhidos pelo grupo; opinar sobre F1 vs acurácia e sobre o uso de nested cross-validation; executar as repetições do treinamento; consultar o grupo antes de qualquer decisão. Nas perguntas feitas pela IA, o grupo decidiu: divisão treino/teste no pré-processamento, alvo recodificado (1 = com doença), validação 5 folds × 10 repetições, Árvore de Decisão e MLP com max_iter = 1000, e one-hot encoding dos atributos nominais.</w:t>
+      </w:r>
+    </w:p>
+    <w:p>
+      <w:pPr>
+        <w:spacing w:after="80" w:before="0"/>
+        <w:ind w:left="360" w:right="0" w:hanging="360"/>
+        <w:jc w:val="both"/>
+        <w:rPr>
+          <w:rFonts w:ascii="Arial" w:cs="Arial" w:eastAsia="Arial" w:hAnsi="Arial"/>
+          <w:sz w:val="22"/>
+          <w:szCs w:val="22"/>
+        </w:rPr>
+      </w:pPr>
+      <w:r>
+        <w:rPr>
+          <w:rFonts w:ascii="Arial" w:cs="Arial" w:eastAsia="Arial" w:hAnsi="Arial"/>
+          <w:sz w:val="22"/>
+          <w:szCs w:val="22"/>
+          <w:rtl w:val="0"/>
+        </w:rPr>
+        <w:t xml:space="preserve">6. Completar as referências com as fontes usadas para identificar as inconsistências do dataset do Kaggle.</w:t>
+      </w:r>
+    </w:p>
+    <w:p>
+      <w:pPr>
+        <w:spacing w:after="80" w:before="0"/>
+        <w:ind w:left="360" w:right="0" w:hanging="360"/>
+        <w:jc w:val="both"/>
+        <w:rPr>
+          <w:rFonts w:ascii="Arial" w:cs="Arial" w:eastAsia="Arial" w:hAnsi="Arial"/>
+          <w:sz w:val="22"/>
+          <w:szCs w:val="22"/>
+        </w:rPr>
+      </w:pPr>
+      <w:r>
+        <w:rPr>
+          <w:rFonts w:ascii="Arial" w:cs="Arial" w:eastAsia="Arial" w:hAnsi="Arial"/>
+          <w:sz w:val="22"/>
+          <w:szCs w:val="22"/>
+          <w:rtl w:val="0"/>
+        </w:rPr>
+        <w:t xml:space="preserve">7. Separar o spot-checking em subseções por modelo, com estatísticas e um breve resumo de cada algoritmo; reorganizar seções do pré-processamento; declarar o uso de IA conforme os documentos da disciplina e apontar usos que não fossem permitidos; incluir a conclusão com os três modelos selecionados pelo grupo e os dados de suporte.</w:t>
+      </w:r>
+    </w:p>
+    <w:p>
+      <w:pPr>
+        <w:spacing w:after="80" w:before="0"/>
+        <w:ind w:left="360" w:right="0" w:hanging="360"/>
+        <w:jc w:val="both"/>
+        <w:rPr>
+          <w:rFonts w:ascii="Arial" w:cs="Arial" w:eastAsia="Arial" w:hAnsi="Arial"/>
+          <w:sz w:val="22"/>
+          <w:szCs w:val="22"/>
+        </w:rPr>
+      </w:pPr>
+      <w:r>
+        <w:rPr>
+          <w:rFonts w:ascii="Arial" w:cs="Arial" w:eastAsia="Arial" w:hAnsi="Arial"/>
+          <w:sz w:val="22"/>
+          <w:szCs w:val="22"/>
+          <w:rtl w:val="0"/>
+        </w:rPr>
+        <w:t xml:space="preserve">8. Remover travessões; inserir o gráfico comparativo; reordenar as referências; tirar dúvidas conceituais (uso do conjunto de teste na seleção de modelos, marcação vs imputação, ROC-AUC, contagem das classes após a correção do alvo e necessidade de normalização); revisar a integridade dos textos editados pelo grupo e as respostas das seções 6 e 7; discutir o uso de IA no trabalho.</w:t>
+      </w:r>
+    </w:p>
+    <w:p>
+      <w:pPr>
+        <w:spacing w:after="80" w:before="0"/>
+        <w:ind w:left="360" w:right="0" w:hanging="360"/>
+        <w:jc w:val="both"/>
+        <w:rPr>
+          <w:rFonts w:ascii="Arial" w:cs="Arial" w:eastAsia="Arial" w:hAnsi="Arial"/>
+          <w:sz w:val="22"/>
+          <w:szCs w:val="22"/>
+        </w:rPr>
+      </w:pPr>
+      <w:r>
+        <w:rPr>
+          <w:rFonts w:ascii="Arial" w:cs="Arial" w:eastAsia="Arial" w:hAnsi="Arial"/>
+          <w:sz w:val="22"/>
+          <w:szCs w:val="22"/>
+          <w:rtl w:val="0"/>
+        </w:rPr>
+        <w:t xml:space="preserve">9. Levar as atualizações do relatório em Markdown para o .docx; tirar dúvidas sobre a ordem da marcação dos ausentes, o número de hiperparâmetros dos modelos, a pré-poda nas árvores, outros padrões observados entre os modelos e a terceira pergunta da seção 6; resumir os prompts nesta subseção.</w:t>
+      </w:r>
+    </w:p>
+    <w:p>
+      <w:pPr>
+        <w:spacing w:after="80" w:before="0"/>
+        <w:ind w:left="360" w:right="0" w:hanging="360"/>
+        <w:jc w:val="both"/>
+        <w:rPr>
+          <w:rFonts w:ascii="Arial" w:cs="Arial" w:eastAsia="Arial" w:hAnsi="Arial"/>
+          <w:sz w:val="22"/>
+          <w:szCs w:val="22"/>
+        </w:rPr>
+      </w:pPr>
+      <w:r>
+        <w:rPr>
+          <w:rFonts w:ascii="Arial" w:cs="Arial" w:eastAsia="Arial" w:hAnsi="Arial"/>
+          <w:sz w:val="22"/>
+          <w:szCs w:val="22"/>
+          <w:rtl w:val="0"/>
+        </w:rPr>
+        <w:t xml:space="preserve">10. Verificar a consistência entre o notebook e o relatório e apontar trechos que ainda precisavam ser preenchidos ou removidos.</w:t>
+      </w:r>
+    </w:p>
+    <w:p>
+      <w:pPr>
+        <w:spacing w:after="80" w:before="0"/>
+        <w:ind w:left="360" w:right="0" w:hanging="360"/>
+        <w:jc w:val="both"/>
+        <w:rPr>
+          <w:rFonts w:ascii="Arial" w:cs="Arial" w:eastAsia="Arial" w:hAnsi="Arial"/>
+          <w:sz w:val="22"/>
+          <w:szCs w:val="22"/>
+        </w:rPr>
+      </w:pPr>
+      <w:r>
+        <w:rPr>
+          <w:rFonts w:ascii="Arial" w:cs="Arial" w:eastAsia="Arial" w:hAnsi="Arial"/>
+          <w:sz w:val="22"/>
+          <w:szCs w:val="22"/>
+          <w:rtl w:val="0"/>
+        </w:rPr>
+        <w:t xml:space="preserve">11. Verificar novamente a consistência dos arquivos; remover a página de orientações do template; padronizar o nome "Vitor" sem acento; registrar as alterações em commits.</w:t>
       </w:r>
     </w:p>
     <w:p>
@@ -6054,25 +4543,6 @@
           <w:szCs w:val="22"/>
           <w:rtl w:val="0"/>
         </w:rPr>
-        <w:t xml:space="preserve">Anthropic. (2026). Claude (Opus 5.5) [Large language model]. Claude Code. https://www.anthropic.com/claude-code</w:t>
-      </w:r>
-    </w:p>
-    <w:p>
-      <w:pPr>
-        <w:jc w:val="left"/>
-        <w:rPr>
-          <w:rFonts w:ascii="Arial" w:cs="Arial" w:eastAsia="Arial" w:hAnsi="Arial"/>
-          <w:sz w:val="22"/>
-          <w:szCs w:val="22"/>
-        </w:rPr>
-      </w:pPr>
-      <w:r>
-        <w:rPr>
-          <w:rFonts w:ascii="Arial" w:cs="Arial" w:eastAsia="Arial" w:hAnsi="Arial"/>
-          <w:sz w:val="22"/>
-          <w:szCs w:val="22"/>
-          <w:rtl w:val="0"/>
-        </w:rPr>
         <w:t xml:space="preserve">BHAT, N. Health care: Data set on Heart attack possibility. Kaggle. Disponível em: https://www.kaggle.com/datasets/nareshbhat/health-care-data-set-on-heart-attack-possibility. Acesso em: 20 out. 2026.</w:t>
       </w:r>
     </w:p>
@@ -6130,7 +4600,7 @@
           <w:szCs w:val="22"/>
           <w:rtl w:val="0"/>
         </w:rPr>
-        <w:t xml:space="preserve">DETRANO, R. et al. International application of a new probability algorithm for the diagnosis of coronary artery disease. American Journal of Cardiology, v. 64, n. 5, p. 304–310, 1989.</w:t>
+        <w:t xml:space="preserve">DETRANO, R. et al. International application of a new probability algorithm for the diagnosis of coronary artery disease. American Journal of Cardiology, v. 64, n. 5, p. 304-310, 1989.</w:t>
       </w:r>
     </w:p>
     <w:p>
@@ -6149,7 +4619,26 @@
           <w:szCs w:val="22"/>
           <w:rtl w:val="0"/>
         </w:rPr>
-        <w:t xml:space="preserve">PEDREGOSA, F. et al. Scikit-learn: Machine Learning in Python. Journal of Machine Learning Research, v. 12, p. 2825–2830, 2011.</w:t>
+        <w:t xml:space="preserve">PEDREGOSA, F. et al. Scikit-learn: Machine Learning in Python. Journal of Machine Learning Research, v. 12, p. 2825-2830, 2011.</w:t>
+      </w:r>
+    </w:p>
+    <w:p>
+      <w:pPr>
+        <w:jc w:val="left"/>
+        <w:rPr>
+          <w:rFonts w:ascii="Arial" w:cs="Arial" w:eastAsia="Arial" w:hAnsi="Arial"/>
+          <w:sz w:val="22"/>
+          <w:szCs w:val="22"/>
+        </w:rPr>
+      </w:pPr>
+      <w:r>
+        <w:rPr>
+          <w:rFonts w:ascii="Arial" w:cs="Arial" w:eastAsia="Arial" w:hAnsi="Arial"/>
+          <w:sz w:val="22"/>
+          <w:szCs w:val="22"/>
+          <w:rtl w:val="0"/>
+        </w:rPr>
+        <w:t xml:space="preserve">Anthropic. (2026). Claude (Opus 5.5) [Large language model]. Claude Code. https://www.anthropic.com/claude-code</w:t>
       </w:r>
     </w:p>
     <w:p>

</xml_diff>